<commit_message>
docs: implement decision on section order
</commit_message>
<xml_diff>
--- a/regulamin/Regulamin-powolywania-reprezentacji-Polski-weteranów-w-szermierce_2026.docx
+++ b/regulamin/Regulamin-powolywania-reprezentacji-Polski-weteranów-w-szermierce_2026.docx
@@ -1664,7 +1664,6 @@
     <w:p>
       <w:pPr>
         <w:pStyle w:val="Paragraf"/>
-        <w:keepNext/>
       </w:pPr>
       <w:r>
         <w:t>§ 1. Przedmiot regulaminu</w:t>
@@ -1672,7 +1671,6 @@
     </w:p>
     <w:p>
       <w:pPr>
-        <w:keepNext/>
         <w:ind w:left="85"/>
       </w:pPr>
       <w:r>
@@ -1682,75 +1680,11 @@
     <w:p>
       <w:pPr>
         <w:pStyle w:val="Paragraf"/>
-        <w:keepNext/>
-        <w:pageBreakBefore w:val="0"/>
-        <w:spacing w:before="480"/>
-        <w:ind w:left="85"/>
-      </w:pPr>
-      <w:r>
-        <w:t>§ 2. Cel regulaminu</w:t>
-      </w:r>
-    </w:p>
-    <w:p>
-      <w:pPr>
-        <w:keepNext/>
-      </w:pPr>
-      <w:r>
-        <w:t>1. Celem Regulaminu jest wyłonienie możliwie najsilniejszej reprezentacji Polski weteranów w szermierce. Równe traktowanie zawodników oraz przejrzystość zasad stanowią podstawę przyjętego procesu wyłaniania reprezentacji.</w:t>
-      </w:r>
-    </w:p>
-    <w:p>
-      <w:pPr>
-        <w:keepNext/>
-      </w:pPr>
-      <w:r>
-        <w:t>2. Proces wyłaniania reprezentacji opiera się na następujących zasadach:</w:t>
-      </w:r>
-    </w:p>
-    <w:p>
-      <w:pPr>
-        <w:keepNext/>
-        <w:ind w:left="369" w:hanging="227"/>
-      </w:pPr>
-      <w:r>
-        <w:t xml:space="preserve">1) </w:t>
-      </w:r>
-      <w:r>
-        <w:rPr>
-          <w:b/>
-        </w:rPr>
-        <w:t>szerokiego wyboru zawodów</w:t>
-      </w:r>
-      <w:r>
-        <w:t xml:space="preserve"> – w rankingu indywidualnym uwzględnia się wyniki uzyskane w zawodach ujętych w kalendarzach SPWS, PZSz, EVF i FIE, na zasadach określonych w § 5;</w:t>
-      </w:r>
-    </w:p>
-    <w:p>
-      <w:pPr>
-        <w:keepNext w:val="0"/>
-        <w:ind w:left="369" w:hanging="227"/>
-      </w:pPr>
-      <w:r>
-        <w:t xml:space="preserve">2) </w:t>
-      </w:r>
-      <w:r>
-        <w:rPr>
-          <w:b/>
-        </w:rPr>
-        <w:t>powołania do startów indywidualnych wyłącznie na podstawie rankingu</w:t>
-      </w:r>
-      <w:r>
-        <w:t xml:space="preserve"> – do startu indywidualnego powołuje się czterech najwyżej sklasyfikowanych zawodników w rankingu właściwym dla danej broni, płci i kategorii wiekowej. Zawodnik z zerowym dorobkiem punktowym nie może zostać powołany do reprezentacji. Wyjątek stanowi powołanie uzupełniające, o którym mowa w § 4 ust. 5.</w:t>
-      </w:r>
-    </w:p>
-    <w:p>
-      <w:pPr>
-        <w:pStyle w:val="Paragraf"/>
         <w:pageBreakBefore/>
         <w:ind w:left="85"/>
       </w:pPr>
       <w:r>
-        <w:t>§ 3. Definicje</w:t>
+        <w:t>§ 2. Definicje</w:t>
       </w:r>
     </w:p>
     <w:p>
@@ -1892,6 +1826,62 @@
       </w:r>
       <w:r>
         <w:t xml:space="preserve"> – należy przez to rozumieć wyjątkowe powołanie do startu drużynowego zawodnika nieposiadającego dodatniego dorobku punktowego, dokonywane wyłącznie w celu uzupełnienia braków uniemożliwiających wystawienie kompletnej i zgodnej z przepisami drużyny.</w:t>
+      </w:r>
+    </w:p>
+    <w:p>
+      <w:pPr>
+        <w:pStyle w:val="Paragraf"/>
+        <w:pageBreakBefore/>
+        <w:ind w:left="85"/>
+      </w:pPr>
+      <w:r>
+        <w:t>§ 3. Cel i zasady wyłaniania reprezentacji</w:t>
+      </w:r>
+    </w:p>
+    <w:p>
+      <w:pPr/>
+      <w:r>
+        <w:t>1. Celem Regulaminu jest wyłonienie możliwie najsilniejszej reprezentacji Polski weteranów w szermierce. Równe traktowanie zawodników oraz przejrzystość zasad stanowią podstawę przyjętego procesu wyłaniania reprezentacji.</w:t>
+      </w:r>
+    </w:p>
+    <w:p>
+      <w:pPr/>
+      <w:r>
+        <w:t>2. Proces wyłaniania reprezentacji opiera się na następujących zasadach:</w:t>
+      </w:r>
+    </w:p>
+    <w:p>
+      <w:pPr>
+        <w:ind w:left="369" w:hanging="227"/>
+      </w:pPr>
+      <w:r>
+        <w:t xml:space="preserve">1) </w:t>
+      </w:r>
+      <w:r>
+        <w:rPr>
+          <w:b/>
+        </w:rPr>
+        <w:t>szerokiego wyboru zawodów</w:t>
+      </w:r>
+      <w:r>
+        <w:t xml:space="preserve"> – w rankingu indywidualnym uwzględnia się wyniki uzyskane w zawodach ujętych w kalendarzach SPWS, PZSz, EVF i FIE, na zasadach określonych w § 5;</w:t>
+      </w:r>
+    </w:p>
+    <w:p>
+      <w:pPr>
+        <w:ind w:left="369" w:hanging="227"/>
+      </w:pPr>
+      <w:r>
+        <w:t xml:space="preserve">2) </w:t>
+      </w:r>
+      <w:r>
+        <w:rPr>
+          <w:b/>
+        </w:rPr>
+        <w:t>powołania do startów indywidualnych wyłącznie na podstawie rankingu</w:t>
+      </w:r>
+      <w:r>
+        <w:t xml:space="preserve"> – do startu indywidualnego powołuje się czterech najwyżej sklasyfikowanych zawodników w rankingu właściwym dla danej broni, płci i kategorii wiekowej. Zawodnik z zerowym dorobkiem punktowym nie może zostać powołany do reprezentacji. Wyjątek stanowi powołanie uzupełniające, o którym mowa w § 4 ust. 5.</w:t>
       </w:r>
     </w:p>
     <w:p>

</xml_diff>

<commit_message>
feat: migrate regulation to ZTP source model
</commit_message>
<xml_diff>
--- a/regulamin/Regulamin-powolywania-reprezentacji-Polski-weteranów-w-szermierce_2026.docx
+++ b/regulamin/Regulamin-powolywania-reprezentacji-Polski-weteranów-w-szermierce_2026.docx
@@ -980,7 +980,7 @@
     </w:p>
     <w:p>
       <w:r>
-        <w:t>Poniższy układ odzwierciedla strukturę dokumentu. Treść normatywna zostanie dodana po zatwierdzeniu kolejnych decyzji.</w:t>
+        <w:t>Układ odzwierciedla strukturę ZTP. Treść ciemnoszara i jawnie oznaczona jest brudnopisem wymagającym decyzji.</w:t>
       </w:r>
     </w:p>
     <w:tbl>
@@ -1114,7 +1114,7 @@
                 <w:color w:val="174A84"/>
                 <w:sz w:val="18"/>
               </w:rPr>
-              <w:t>I</w:t>
+              <w:t>1</w:t>
             </w:r>
           </w:p>
         </w:tc>
@@ -1162,7 +1162,7 @@
                 <w:color w:val="667386"/>
                 <w:sz w:val="18"/>
               </w:rPr>
-              <w:t>cel, zakres, organy i podstawowe definicje</w:t>
+              <w:t>przedmiot, definicje i zasady wyłaniania reprezentacji</w:t>
             </w:r>
           </w:p>
         </w:tc>
@@ -1192,7 +1192,7 @@
                 <w:color w:val="174A84"/>
                 <w:sz w:val="18"/>
               </w:rPr>
-              <w:t>II</w:t>
+              <w:t>2</w:t>
             </w:r>
           </w:p>
         </w:tc>
@@ -1240,7 +1240,7 @@
                 <w:color w:val="667386"/>
                 <w:sz w:val="18"/>
               </w:rPr>
-              <w:t>wyniki, punktacja, klasyfikacja i publikacja</w:t>
+              <w:t>rola rankingu, zawody, punktacja i warunki ujęcia wyników</w:t>
             </w:r>
           </w:p>
         </w:tc>
@@ -1270,7 +1270,7 @@
                 <w:color w:val="174A84"/>
                 <w:sz w:val="18"/>
               </w:rPr>
-              <w:t>III</w:t>
+              <w:t>3</w:t>
             </w:r>
           </w:p>
         </w:tc>
@@ -1318,7 +1318,7 @@
                 <w:color w:val="667386"/>
                 <w:sz w:val="18"/>
               </w:rPr>
-              <w:t>uprawnienia, kolejność i rezygnacje</w:t>
+              <w:t>kolejność kandydatów, rezygnacje i zastępstwa</w:t>
             </w:r>
           </w:p>
         </w:tc>
@@ -1348,7 +1348,7 @@
                 <w:color w:val="174A84"/>
                 <w:sz w:val="18"/>
               </w:rPr>
-              <w:t>IV</w:t>
+              <w:t>4</w:t>
             </w:r>
           </w:p>
         </w:tc>
@@ -1396,7 +1396,7 @@
                 <w:color w:val="667386"/>
                 <w:sz w:val="18"/>
               </w:rPr>
-              <w:t>pula kandydatów, kryteria, role i odpowiedzialność</w:t>
+              <w:t>pula kandydatów, wymogi kategorii i procedury wyboru</w:t>
             </w:r>
           </w:p>
         </w:tc>
@@ -1426,7 +1426,7 @@
                 <w:color w:val="174A84"/>
                 <w:sz w:val="18"/>
               </w:rPr>
-              <w:t>V</w:t>
+              <w:t>5</w:t>
             </w:r>
           </w:p>
         </w:tc>
@@ -1474,7 +1474,7 @@
                 <w:color w:val="667386"/>
                 <w:sz w:val="18"/>
               </w:rPr>
-              <w:t>zamknięcie danych, konsultacje i ogłoszenie nominacji</w:t>
+              <w:t>zamknięcie danych, deklaracje i ogłoszenie nominacji</w:t>
             </w:r>
           </w:p>
         </w:tc>
@@ -1504,7 +1504,7 @@
                 <w:color w:val="174A84"/>
                 <w:sz w:val="18"/>
               </w:rPr>
-              <w:t>VI</w:t>
+              <w:t>6</w:t>
             </w:r>
           </w:p>
         </w:tc>
@@ -1552,7 +1552,7 @@
                 <w:color w:val="667386"/>
                 <w:sz w:val="18"/>
               </w:rPr>
-              <w:t>ewaluacja sezonowa i zasady zmian</w:t>
+              <w:t>ewaluacja sezonowa i przygotowanie zmian</w:t>
             </w:r>
           </w:p>
         </w:tc>
@@ -1582,7 +1582,7 @@
                 <w:color w:val="174A84"/>
                 <w:sz w:val="18"/>
               </w:rPr>
-              <w:t>VII</w:t>
+              <w:t>7</w:t>
             </w:r>
           </w:p>
         </w:tc>
@@ -1630,7 +1630,7 @@
                 <w:color w:val="667386"/>
                 <w:sz w:val="18"/>
               </w:rPr>
-              <w:t>wejście w życie, przepisy przejściowe i załączniki</w:t>
+              <w:t>wejście w życie i przepis przejściowy</w:t>
             </w:r>
           </w:p>
         </w:tc>
@@ -1647,7 +1647,7 @@
         <w:pageBreakBefore/>
       </w:pPr>
       <w:r>
-        <w:t>ROZDZIAŁ I</w:t>
+        <w:t>Rozdział 1</w:t>
       </w:r>
     </w:p>
     <w:p>
@@ -1666,7 +1666,16 @@
         <w:pStyle w:val="Paragraf"/>
       </w:pPr>
       <w:r>
-        <w:t>§ 1. Przedmiot regulaminu</w:t>
+        <w:t>§ 1</w:t>
+      </w:r>
+    </w:p>
+    <w:p>
+      <w:pPr>
+        <w:pStyle w:val="Tytułparagrafu"/>
+        <w:keepNext/>
+      </w:pPr>
+      <w:r>
+        <w:t>Przedmiot regulaminu</w:t>
       </w:r>
     </w:p>
     <w:p>
@@ -1674,7 +1683,7 @@
         <w:ind w:left="85"/>
       </w:pPr>
       <w:r>
-        <w:t>1. Regulamin określa zasady kwalifikowania i powoływania zawodników do reprezentacji Polski weteranów w szermierce na indywidualne i drużynowe zawody międzynarodowe rangi mistrzowskiej, w których liczba zawodników reprezentujących państwo podlega ograniczeniom określonym przez organizatora zawodów.</w:t>
+        <w:t>Regulamin określa zasady kwalifikowania i powoływania zawodników do reprezentacji Polski weteranów w szermierce na indywidualne i drużynowe zawody międzynarodowe rangi mistrzowskiej, w których liczba zawodników reprezentujących państwo podlega ograniczeniom określonym przez organizatora zawodów.</w:t>
       </w:r>
     </w:p>
     <w:p>
@@ -1684,19 +1693,32 @@
         <w:ind w:left="85"/>
       </w:pPr>
       <w:r>
-        <w:t>§ 2. Definicje</w:t>
+        <w:t>§ 2</w:t>
       </w:r>
     </w:p>
     <w:p>
-      <w:pPr/>
+      <w:pPr>
+        <w:pStyle w:val="Tytułparagrafu"/>
+        <w:keepNext/>
+      </w:pPr>
+      <w:r>
+        <w:t>Definicje</w:t>
+      </w:r>
+    </w:p>
+    <w:p>
+      <w:pPr>
+        <w:ind w:left="85"/>
+      </w:pPr>
       <w:r>
         <w:t>Ilekroć w Regulaminie jest mowa o:</w:t>
       </w:r>
     </w:p>
     <w:p>
-      <w:pPr/>
+      <w:pPr>
+        <w:ind w:left="595" w:hanging="255"/>
+      </w:pPr>
       <w:r>
-        <w:t xml:space="preserve">1. </w:t>
+        <w:t xml:space="preserve">1) </w:t>
       </w:r>
       <w:r>
         <w:rPr>
@@ -1709,9 +1731,11 @@
       </w:r>
     </w:p>
     <w:p>
-      <w:pPr/>
+      <w:pPr>
+        <w:ind w:left="595" w:hanging="255"/>
+      </w:pPr>
       <w:r>
-        <w:t xml:space="preserve">2. </w:t>
+        <w:t xml:space="preserve">2) </w:t>
       </w:r>
       <w:r>
         <w:rPr>
@@ -1724,9 +1748,11 @@
       </w:r>
     </w:p>
     <w:p>
-      <w:pPr/>
+      <w:pPr>
+        <w:ind w:left="595" w:hanging="255"/>
+      </w:pPr>
       <w:r>
-        <w:t xml:space="preserve">3. </w:t>
+        <w:t xml:space="preserve">3) </w:t>
       </w:r>
       <w:r>
         <w:rPr>
@@ -1739,9 +1765,11 @@
       </w:r>
     </w:p>
     <w:p>
-      <w:pPr/>
+      <w:pPr>
+        <w:ind w:left="595" w:hanging="255"/>
+      </w:pPr>
       <w:r>
-        <w:t xml:space="preserve">4. </w:t>
+        <w:t xml:space="preserve">4) </w:t>
       </w:r>
       <w:r>
         <w:rPr>
@@ -1754,9 +1782,11 @@
       </w:r>
     </w:p>
     <w:p>
-      <w:pPr/>
+      <w:pPr>
+        <w:ind w:left="595" w:hanging="255"/>
+      </w:pPr>
       <w:r>
-        <w:t xml:space="preserve">5. </w:t>
+        <w:t xml:space="preserve">5) </w:t>
       </w:r>
       <w:r>
         <w:rPr>
@@ -1769,9 +1799,11 @@
       </w:r>
     </w:p>
     <w:p>
-      <w:pPr/>
+      <w:pPr>
+        <w:ind w:left="595" w:hanging="255"/>
+      </w:pPr>
       <w:r>
-        <w:t xml:space="preserve">6. </w:t>
+        <w:t xml:space="preserve">6) </w:t>
       </w:r>
       <w:r>
         <w:rPr>
@@ -1784,9 +1816,11 @@
       </w:r>
     </w:p>
     <w:p>
-      <w:pPr/>
+      <w:pPr>
+        <w:ind w:left="595" w:hanging="255"/>
+      </w:pPr>
       <w:r>
-        <w:t xml:space="preserve">7. </w:t>
+        <w:t xml:space="preserve">7) </w:t>
       </w:r>
       <w:r>
         <w:rPr>
@@ -1799,9 +1833,11 @@
       </w:r>
     </w:p>
     <w:p>
-      <w:pPr/>
+      <w:pPr>
+        <w:ind w:left="595" w:hanging="255"/>
+      </w:pPr>
       <w:r>
-        <w:t xml:space="preserve">8. </w:t>
+        <w:t xml:space="preserve">8) </w:t>
       </w:r>
       <w:r>
         <w:rPr>
@@ -1814,9 +1850,11 @@
       </w:r>
     </w:p>
     <w:p>
-      <w:pPr/>
+      <w:pPr>
+        <w:ind w:left="595" w:hanging="255"/>
+      </w:pPr>
       <w:r>
-        <w:t xml:space="preserve">9. </w:t>
+        <w:t xml:space="preserve">9) </w:t>
       </w:r>
       <w:r>
         <w:rPr>
@@ -1835,24 +1873,43 @@
         <w:ind w:left="85"/>
       </w:pPr>
       <w:r>
-        <w:t>§ 3. Cel i zasady wyłaniania reprezentacji</w:t>
-      </w:r>
-    </w:p>
-    <w:p>
-      <w:pPr/>
-      <w:r>
-        <w:t>1. Celem Regulaminu jest wyłonienie możliwie najsilniejszej reprezentacji Polski weteranów w szermierce. Równe traktowanie zawodników oraz przejrzystość zasad stanowią podstawę przyjętego procesu wyłaniania reprezentacji.</w:t>
-      </w:r>
-    </w:p>
-    <w:p>
-      <w:pPr/>
-      <w:r>
-        <w:t>2. Proces wyłaniania reprezentacji opiera się na następujących zasadach:</w:t>
+        <w:t>§ 3</w:t>
       </w:r>
     </w:p>
     <w:p>
       <w:pPr>
-        <w:ind w:left="369" w:hanging="227"/>
+        <w:pStyle w:val="Tytułparagrafu"/>
+        <w:keepNext/>
+      </w:pPr>
+      <w:r>
+        <w:t>Cel i zasady wyłaniania reprezentacji</w:t>
+      </w:r>
+    </w:p>
+    <w:p>
+      <w:pPr>
+        <w:ind w:left="312" w:hanging="227"/>
+      </w:pPr>
+      <w:r>
+        <w:t xml:space="preserve">1. </w:t>
+      </w:r>
+      <w:r>
+        <w:t>Celem Regulaminu jest wyłonienie możliwie najsilniejszej reprezentacji Polski weteranów w szermierce. Równe traktowanie zawodników oraz przejrzystość zasad stanowią podstawę przyjętego procesu wyłaniania reprezentacji.</w:t>
+      </w:r>
+    </w:p>
+    <w:p>
+      <w:pPr>
+        <w:ind w:left="312" w:hanging="227"/>
+      </w:pPr>
+      <w:r>
+        <w:t xml:space="preserve">2. </w:t>
+      </w:r>
+      <w:r>
+        <w:t>Proces wyłaniania reprezentacji opiera się na następujących zasadach:</w:t>
+      </w:r>
+    </w:p>
+    <w:p>
+      <w:pPr>
+        <w:ind w:left="595" w:hanging="255"/>
       </w:pPr>
       <w:r>
         <w:t xml:space="preserve">1) </w:t>
@@ -1864,12 +1921,12 @@
         <w:t>szerokiego wyboru zawodów</w:t>
       </w:r>
       <w:r>
-        <w:t xml:space="preserve"> – w rankingu indywidualnym uwzględnia się wyniki uzyskane w zawodach ujętych w kalendarzach SPWS, PZSz, EVF i FIE, na zasadach określonych w § 5;</w:t>
+        <w:t xml:space="preserve"> – w rankingu indywidualnym uwzględnia się wyniki uzyskane w zawodach ujętych w kalendarzach SPWS, PZSz, EVF i FIE, na zasadach określonych w § 5 ust. 1;</w:t>
       </w:r>
     </w:p>
     <w:p>
       <w:pPr>
-        <w:ind w:left="369" w:hanging="227"/>
+        <w:ind w:left="595" w:hanging="255"/>
       </w:pPr>
       <w:r>
         <w:t xml:space="preserve">2) </w:t>
@@ -1890,7 +1947,7 @@
         <w:pageBreakBefore/>
       </w:pPr>
       <w:r>
-        <w:t>ROZDZIAŁ II</w:t>
+        <w:t>Rozdział 2</w:t>
       </w:r>
     </w:p>
     <w:p>
@@ -1909,87 +1966,137 @@
         <w:pStyle w:val="Paragraf"/>
       </w:pPr>
       <w:r>
-        <w:t>§ 4. Rola rankingu indywidualnego</w:t>
+        <w:t>§ 4</w:t>
       </w:r>
     </w:p>
     <w:p>
       <w:pPr>
-        <w:ind w:left="85"/>
+        <w:pStyle w:val="Tytułparagrafu"/>
+        <w:keepNext/>
       </w:pPr>
       <w:r>
-        <w:t>1. Ranking indywidualny stanowi podstawę kwalifikowania zawodników do startów indywidualnych oraz wyłonienia puli kandydatów do składu drużyny.</w:t>
-      </w:r>
-    </w:p>
-    <w:p>
-      <w:pPr/>
-      <w:r>
-        <w:t>2. Miejsce w rankingu indywidualnym nie stanowi samoistnej podstawy powołania do składu drużyny. Skład drużyny ustala się zgodnie z zasadami określonymi w rozdziale IV.</w:t>
-      </w:r>
-    </w:p>
-    <w:p>
-      <w:pPr/>
-      <w:r>
-        <w:t>3. Zawodnik samodzielnie decyduje, w których zawodach wymienionych w § 5 bierze udział. Udział w określonych zawodach lub cyklu zawodów nie stanowi warunku powołania do reprezentacji.</w:t>
-      </w:r>
-    </w:p>
-    <w:p>
-      <w:pPr/>
-      <w:r>
-        <w:t>4. Z zastrzeżeniem ust. 5, do reprezentacji Polski na limitowane zawody międzynarodowe może zostać powołany wyłącznie zawodnik, który wystartował w co najmniej jednych zawodach uwzględnianych w rankingu indywidualnym i uzyskał w nim dorobek większy niż zero punktów.</w:t>
-      </w:r>
-    </w:p>
-    <w:p>
-      <w:pPr/>
-      <w:r>
-        <w:t>5. W przypadku gdy nie jest możliwe skompletowanie drużyny z zawodników posiadających dodatni dorobek punktowy, dopuszcza się powołanie uzupełniające zawodnika bez punktów rankingowych, jeżeli łącznie:</w:t>
+        <w:t>Rola rankingu indywidualnego</w:t>
       </w:r>
     </w:p>
     <w:p>
       <w:pPr>
-        <w:ind w:left="369" w:hanging="227"/>
+        <w:ind w:left="312" w:hanging="227"/>
       </w:pPr>
       <w:r>
-        <w:t>1) powołanie jest niezbędne do wystawienia kompletnej drużyny zgodnej z przepisami zawodów;</w:t>
+        <w:t xml:space="preserve">1. </w:t>
+      </w:r>
+      <w:r>
+        <w:t>Ranking indywidualny stanowi podstawę kwalifikowania zawodników do startów indywidualnych oraz wyłonienia puli kandydatów do składu drużyny.</w:t>
       </w:r>
     </w:p>
     <w:p>
       <w:pPr>
-        <w:ind w:left="369" w:hanging="227"/>
+        <w:ind w:left="312" w:hanging="227"/>
       </w:pPr>
       <w:r>
-        <w:t>2) możliwość startu zaoferowano wszystkim dostępnym zawodnikom posiadającym dodatni dorobek punktowy, spełniającym wymagania dotyczące broni, płci i kategorii wiekowej;</w:t>
+        <w:t xml:space="preserve">2. </w:t>
+      </w:r>
+      <w:r>
+        <w:t>Miejsce w rankingu indywidualnym nie stanowi samoistnej podstawy powołania do składu drużyny. Skład drużyny ustala się zgodnie z zasadami określonymi w rozdziale 4.</w:t>
       </w:r>
     </w:p>
     <w:p>
       <w:pPr>
-        <w:ind w:left="369" w:hanging="227"/>
+        <w:ind w:left="312" w:hanging="227"/>
       </w:pPr>
       <w:r>
-        <w:t>3) żaden z zawodników, o których mowa w pkt 2, nie potwierdził gotowości do udziału;</w:t>
+        <w:t xml:space="preserve">3. </w:t>
+      </w:r>
+      <w:r>
+        <w:t>Zawodnik samodzielnie decyduje, w których zawodach wymienionych w § 5 ust. 1 bierze udział. Udział w określonych zawodach lub cyklu zawodów nie stanowi warunku powołania do reprezentacji.</w:t>
       </w:r>
     </w:p>
     <w:p>
       <w:pPr>
-        <w:ind w:left="369" w:hanging="227"/>
+        <w:ind w:left="312" w:hanging="227"/>
       </w:pPr>
       <w:r>
-        <w:t>4) powoływana osoba spełnia wszystkie formalne warunki udziału określone przez organizatora zawodów;</w:t>
+        <w:t xml:space="preserve">4. </w:t>
+      </w:r>
+      <w:r>
+        <w:t>Z zastrzeżeniem § 4 ust. 5, do reprezentacji Polski na limitowane zawody międzynarodowe może zostać powołany wyłącznie zawodnik, który wystartował w co najmniej jednych zawodach uwzględnianych w rankingu indywidualnym i uzyskał w nim dorobek większy niż zero punktów.</w:t>
       </w:r>
     </w:p>
     <w:p>
       <w:pPr>
-        <w:ind w:left="369" w:hanging="227"/>
+        <w:ind w:left="312" w:hanging="227"/>
       </w:pPr>
       <w:r>
-        <w:t>5) powołanie nie pozbawia miejsca zawodnika posiadającego dodatni dorobek punktowy i gotowego do udziału;</w:t>
+        <w:t xml:space="preserve">5. </w:t>
+      </w:r>
+      <w:r>
+        <w:t>W przypadku gdy nie jest możliwe skompletowanie drużyny z zawodników posiadających dodatni dorobek punktowy, dopuszcza się powołanie uzupełniające zawodnika bez punktów rankingowych, jeżeli łącznie:</w:t>
       </w:r>
     </w:p>
     <w:p>
       <w:pPr>
-        <w:ind w:left="369" w:hanging="227"/>
+        <w:ind w:left="595" w:hanging="255"/>
       </w:pPr>
       <w:r>
-        <w:t>6) przyczyny powołania zostaną wskazane w pisemnym uzasadnieniu nominacji.</w:t>
+        <w:t xml:space="preserve">1) </w:t>
+      </w:r>
+      <w:r>
+        <w:t>powołanie jest niezbędne do wystawienia kompletnej drużyny zgodnej z przepisami zawodów;</w:t>
+      </w:r>
+    </w:p>
+    <w:p>
+      <w:pPr>
+        <w:ind w:left="595" w:hanging="255"/>
+      </w:pPr>
+      <w:r>
+        <w:t xml:space="preserve">2) </w:t>
+      </w:r>
+      <w:r>
+        <w:t>możliwość startu zaoferowano wszystkim dostępnym zawodnikom posiadającym dodatni dorobek punktowy, spełniającym wymagania dotyczące broni, płci i kategorii wiekowej;</w:t>
+      </w:r>
+    </w:p>
+    <w:p>
+      <w:pPr>
+        <w:ind w:left="595" w:hanging="255"/>
+      </w:pPr>
+      <w:r>
+        <w:t xml:space="preserve">3) </w:t>
+      </w:r>
+      <w:r>
+        <w:t>żaden z zawodników, o których mowa w § 4 ust. 5 pkt 2, nie potwierdził gotowości do udziału;</w:t>
+      </w:r>
+    </w:p>
+    <w:p>
+      <w:pPr>
+        <w:ind w:left="595" w:hanging="255"/>
+      </w:pPr>
+      <w:r>
+        <w:t xml:space="preserve">4) </w:t>
+      </w:r>
+      <w:r>
+        <w:t>powoływana osoba spełnia wszystkie formalne warunki udziału określone przez organizatora zawodów;</w:t>
+      </w:r>
+    </w:p>
+    <w:p>
+      <w:pPr>
+        <w:ind w:left="595" w:hanging="255"/>
+      </w:pPr>
+      <w:r>
+        <w:t xml:space="preserve">5) </w:t>
+      </w:r>
+      <w:r>
+        <w:t>powołanie nie pozbawia miejsca zawodnika posiadającego dodatni dorobek punktowy i gotowego do udziału;</w:t>
+      </w:r>
+    </w:p>
+    <w:p>
+      <w:pPr>
+        <w:ind w:left="595" w:hanging="255"/>
+      </w:pPr>
+      <w:r>
+        <w:t xml:space="preserve">6) </w:t>
+      </w:r>
+      <w:r>
+        <w:t>przyczyny powołania zostaną wskazane w pisemnym uzasadnieniu nominacji.</w:t>
       </w:r>
     </w:p>
     <w:p>
@@ -1998,123 +2105,181 @@
         <w:pageBreakBefore/>
       </w:pPr>
       <w:r>
-        <w:t>§ 5. Zawody uwzględniane w rankingu</w:t>
+        <w:t>§ 5</w:t>
       </w:r>
     </w:p>
     <w:p>
       <w:pPr>
-        <w:ind w:left="85"/>
+        <w:pStyle w:val="Tytułparagrafu"/>
+        <w:keepNext/>
       </w:pPr>
       <w:r>
-        <w:t>1. W sezonie 2026/2027 w rankingu indywidualnym uwzględnia się wyniki uzyskane w następujących cyklach i zawodach:</w:t>
+        <w:t>Zawody uwzględniane w rankingu</w:t>
       </w:r>
     </w:p>
     <w:p>
       <w:pPr>
-        <w:ind w:left="369" w:hanging="227"/>
+        <w:ind w:left="312" w:hanging="227"/>
       </w:pPr>
       <w:r>
-        <w:t>1) Pucharze Polski Weteranów w Szermierce oraz Mistrzostwach Polski Weteranów w Szermierce, organizowanych przez SPWS albo przez inny podmiot na zasadach określonych w ust. 2;</w:t>
+        <w:t xml:space="preserve">1. </w:t>
+      </w:r>
+      <w:r>
+        <w:t>W sezonie 2026/2027 w rankingu indywidualnym uwzględnia się wyniki uzyskane w następujących cyklach i zawodach:</w:t>
       </w:r>
     </w:p>
     <w:p>
       <w:pPr>
-        <w:ind w:left="369" w:hanging="227"/>
+        <w:ind w:left="595" w:hanging="255"/>
       </w:pPr>
       <w:r>
-        <w:t>2) Pucharze Polski Seniorów w Szermierce oraz Mistrzostwach Polski Seniorów w Szermierce, ujętych w oficjalnym kalendarzu Polskiego Związku Szermierczego;</w:t>
+        <w:t xml:space="preserve">1) </w:t>
+      </w:r>
+      <w:r>
+        <w:t>Pucharze Polski Weteranów w Szermierce oraz Mistrzostwach Polski Weteranów w Szermierce, organizowanych przez SPWS albo przez inny podmiot na zasadach określonych w § 5 ust. 2;</w:t>
       </w:r>
     </w:p>
     <w:p>
       <w:pPr>
-        <w:ind w:left="369" w:hanging="227"/>
+        <w:ind w:left="595" w:hanging="255"/>
       </w:pPr>
       <w:r>
-        <w:t>3) Pucharze Europy Weteranów w Szermierce oraz Mistrzostwach Europy Weteranów w Szermierce, ujętych w oficjalnym kalendarzu European Veterans Fencing;</w:t>
+        <w:t xml:space="preserve">2) </w:t>
+      </w:r>
+      <w:r>
+        <w:t>Pucharze Polski Seniorów w Szermierce oraz Mistrzostwach Polski Seniorów w Szermierce, ujętych w oficjalnym kalendarzu PZSz;</w:t>
       </w:r>
     </w:p>
     <w:p>
       <w:pPr>
-        <w:ind w:left="369" w:hanging="227"/>
+        <w:ind w:left="595" w:hanging="255"/>
       </w:pPr>
       <w:r>
-        <w:t>4) Pucharze Świata Weteranów w Szermierce – o ile zawody tego cyklu zostaną rozegrane – oraz Mistrzostwach Świata Weteranów w Szermierce, ujętych w oficjalnym kalendarzu Międzynarodowej Federacji Szermierczej.</w:t>
+        <w:t xml:space="preserve">3) </w:t>
       </w:r>
-    </w:p>
-    <w:p>
-      <w:pPr/>
       <w:r>
-        <w:t>2. Zawody organizowane przez podmiot inny niż SPWS mogą zostać zaliczone do cyklu Pucharu Polski Weteranów w Szermierce, jeżeli łącznie spełniają następujące warunki:</w:t>
+        <w:t>Pucharze Europy Weteranów w Szermierce oraz Mistrzostwach Europy Weteranów w Szermierce, ujętych w oficjalnym kalendarzu EVF;</w:t>
       </w:r>
     </w:p>
     <w:p>
       <w:pPr>
-        <w:ind w:left="369" w:hanging="227"/>
+        <w:ind w:left="595" w:hanging="255"/>
       </w:pPr>
       <w:r>
-        <w:t>1) przed ich rozegraniem zostały zatwierdzone przez SPWS i ujęte w opublikowanym kalendarzu cyklu;</w:t>
+        <w:t xml:space="preserve">4) </w:t>
+      </w:r>
+      <w:r>
+        <w:t>Pucharze Świata Weteranów w Szermierce – o ile zawody tego cyklu zostaną rozegrane – oraz Mistrzostwach Świata Weteranów w Szermierce, ujętych w oficjalnym kalendarzu FIE.</w:t>
       </w:r>
     </w:p>
     <w:p>
       <w:pPr>
-        <w:ind w:left="369" w:hanging="227"/>
+        <w:ind w:left="312" w:hanging="227"/>
       </w:pPr>
       <w:r>
-        <w:t>2) komunikat organizacyjny zawodów został opublikowany w ogólnodostępnym serwisie internetowym, bez konieczności logowania, najpóźniej 30 dni przed pierwszym dniem zawodów;</w:t>
+        <w:t xml:space="preserve">2. </w:t>
+      </w:r>
+      <w:r>
+        <w:t>Zawody organizowane przez podmiot inny niż SPWS mogą zostać zaliczone do cyklu Pucharu Polski Weteranów w Szermierce, jeżeli łącznie spełniają następujące warunki:</w:t>
       </w:r>
     </w:p>
     <w:p>
       <w:pPr>
-        <w:ind w:left="369" w:hanging="227"/>
+        <w:ind w:left="595" w:hanging="255"/>
       </w:pPr>
       <w:r>
-        <w:t>3) prawo zgłoszenia do udziału przysługuje wszystkim zawodnikom spełniającym kryterium wieku właściwe dla weteranów szermierki, niezależnie od obywatelstwa, miejsca zamieszkania, przynależności klubowej oraz państwa, w którym uprawiają szermierkę, pod warunkiem spełnienia jednakowych dla wszystkich uczestników wymagań określonych w komunikacie organizacyjnym;</w:t>
+        <w:t xml:space="preserve">1) </w:t>
+      </w:r>
+      <w:r>
+        <w:t>przed ich rozegraniem zostały zatwierdzone przez SPWS i ujęte w opublikowanym kalendarzu cyklu;</w:t>
       </w:r>
     </w:p>
     <w:p>
       <w:pPr>
-        <w:ind w:left="369" w:hanging="227"/>
+        <w:ind w:left="595" w:hanging="255"/>
       </w:pPr>
       <w:r>
-        <w:t>4) zawody są rozgrywane według formuły sportowej zgodnej z regulaminami lub przepisami zawodów stosowanymi przez SPWS, PZSz, EVF albo FIE, przy czym właściwa formuła musi zostać wskazana w komunikacie organizacyjnym;</w:t>
+        <w:t xml:space="preserve">2) </w:t>
+      </w:r>
+      <w:r>
+        <w:t>komunikat organizacyjny zawodów został opublikowany w ogólnodostępnym serwisie internetowym, bez konieczności logowania, najpóźniej 30 dni przed pierwszym dniem zawodów;</w:t>
       </w:r>
     </w:p>
     <w:p>
       <w:pPr>
-        <w:ind w:left="369" w:hanging="227"/>
+        <w:ind w:left="595" w:hanging="255"/>
       </w:pPr>
       <w:r>
-        <w:t>5) zawody są rozgrywane w kategoriach wieku, broni i płci określonych w komunikacie organizacyjnym i zgodnych z wybraną formułą sportową;</w:t>
+        <w:t xml:space="preserve">3) </w:t>
+      </w:r>
+      <w:r>
+        <w:t>prawo zgłoszenia do udziału przysługuje wszystkim zawodnikom spełniającym kryterium wieku właściwe dla weteranów szermierki, niezależnie od obywatelstwa, miejsca zamieszkania, przynależności klubowej oraz państwa, w którym uprawiają szermierkę, pod warunkiem spełnienia jednakowych dla wszystkich uczestników wymagań określonych w komunikacie organizacyjnym;</w:t>
       </w:r>
     </w:p>
     <w:p>
       <w:pPr>
-        <w:ind w:left="369" w:hanging="227"/>
+        <w:ind w:left="595" w:hanging="255"/>
       </w:pPr>
       <w:r>
-        <w:t>6) po zakończeniu zawodów organizator publikuje w serwisie internetowym kompletne protokoły wszystkich rozegranych walk, obejmujące fazę grupową oraz eliminację bezpośrednią, wraz z klasyfikacją końcową i liczbą uczestników, zapewniając publiczny i nieodpłatny dostęp do tych materiałów;</w:t>
+        <w:t xml:space="preserve">4) </w:t>
+      </w:r>
+      <w:r>
+        <w:t>zawody są rozgrywane według formuły sportowej zgodnej z regulaminami lub przepisami zawodów stosowanymi przez SPWS, PZSz, EVF albo FIE, przy czym właściwa formuła musi zostać wskazana w komunikacie organizacyjnym;</w:t>
       </w:r>
     </w:p>
     <w:p>
       <w:pPr>
-        <w:ind w:left="369" w:hanging="227"/>
+        <w:ind w:left="595" w:hanging="255"/>
       </w:pPr>
       <w:r>
-        <w:t>7) protokoły i wyniki, o których mowa w pkt 6, pozostają dostępne online przez co najmniej 36 miesięcy od dnia zakończenia zawodów;</w:t>
+        <w:t xml:space="preserve">5) </w:t>
+      </w:r>
+      <w:r>
+        <w:t>zawody są rozgrywane w kategoriach wieku, broni i płci określonych w komunikacie organizacyjnym i zgodnych z wybraną formułą sportową;</w:t>
       </w:r>
     </w:p>
     <w:p>
       <w:pPr>
-        <w:ind w:left="369" w:hanging="227"/>
+        <w:ind w:left="595" w:hanging="255"/>
       </w:pPr>
       <w:r>
-        <w:t>8) opublikowane wyniki zawierają dane niezbędne do ich zweryfikowania oraz obliczenia punktów rankingowych.</w:t>
+        <w:t xml:space="preserve">6) </w:t>
+      </w:r>
+      <w:r>
+        <w:t>po zakończeniu zawodów organizator publikuje w serwisie internetowym kompletne protokoły wszystkich rozegranych walk, obejmujące fazę grupową oraz eliminację bezpośrednią, wraz z klasyfikacją końcową i liczbą uczestników, zapewniając publiczny i nieodpłatny dostęp do tych materiałów;</w:t>
       </w:r>
     </w:p>
     <w:p>
-      <w:pPr/>
+      <w:pPr>
+        <w:ind w:left="595" w:hanging="255"/>
+      </w:pPr>
       <w:r>
-        <w:t>3. Spośród wyników uzyskanych w zawodach, o których mowa w ust. 1 pkt 1, w rankingu uwzględnia się trzy wyniki, za które zawodnik uzyskał najwyższą liczbę punktów rankingowych.</w:t>
+        <w:t xml:space="preserve">7) </w:t>
+      </w:r>
+      <w:r>
+        <w:t>protokoły i wyniki, o których mowa w § 5 ust. 2 pkt 6, pozostają dostępne online przez co najmniej 36 miesięcy od dnia zakończenia zawodów;</w:t>
+      </w:r>
+    </w:p>
+    <w:p>
+      <w:pPr>
+        <w:ind w:left="595" w:hanging="255"/>
+      </w:pPr>
+      <w:r>
+        <w:t xml:space="preserve">8) </w:t>
+      </w:r>
+      <w:r>
+        <w:t>opublikowane wyniki zawierają dane niezbędne do ich zweryfikowania oraz obliczenia punktów rankingowych.</w:t>
+      </w:r>
+    </w:p>
+    <w:p>
+      <w:pPr>
+        <w:ind w:left="312" w:hanging="227"/>
+      </w:pPr>
+      <w:r>
+        <w:t xml:space="preserve">3. </w:t>
+      </w:r>
+      <w:r>
+        <w:t>Spośród wyników uzyskanych w zawodach, o których mowa w § 5 ust. 1 pkt 1, w rankingu uwzględnia się trzy wyniki, za które zawodnik uzyskał najwyższą liczbę punktów rankingowych.</w:t>
       </w:r>
     </w:p>
     <w:p>
@@ -2123,21 +2288,39 @@
         <w:pageBreakBefore/>
       </w:pPr>
       <w:r>
-        <w:t>§ 6. Zasady obliczania punktów</w:t>
+        <w:t>§ 6</w:t>
       </w:r>
     </w:p>
     <w:p>
-      <w:pPr/>
+      <w:pPr>
+        <w:pStyle w:val="Tytułparagrafu"/>
+        <w:keepNext/>
+      </w:pPr>
       <w:r>
-        <w:t>1. Liczba punktów przyznawanych za wynik uzyskany w zawodach zależy od zajętego miejsca, liczby zawodników w stawce oraz współczynnika rangi określonego dla danego rodzaju zawodów.</w:t>
+        <w:t>Zasady obliczania punktów</w:t>
+      </w:r>
+    </w:p>
+    <w:p>
+      <w:pPr>
+        <w:ind w:left="312" w:hanging="227"/>
+      </w:pPr>
+      <w:r>
+        <w:t xml:space="preserve">1. </w:t>
+      </w:r>
+      <w:r>
+        <w:t>Liczba punktów przyznawanych za wynik uzyskany w zawodach zależy od zajętego miejsca, liczby zawodników w stawce oraz współczynnika rangi określonego dla danego rodzaju zawodów.</w:t>
       </w:r>
     </w:p>
     <w:p>
       <w:pPr>
         <w:keepNext/>
+        <w:ind w:left="312" w:hanging="227"/>
       </w:pPr>
       <w:r>
-        <w:t>2. W sezonie 2026/2027 stosuje się następujące współczynniki rangi zawodów:</w:t>
+        <w:t xml:space="preserve">2. </w:t>
+      </w:r>
+      <w:r>
+        <w:t>W sezonie 2026/2027 stosuje się następujące współczynniki rangi zawodów.</w:t>
       </w:r>
     </w:p>
     <w:tbl>
@@ -2747,15 +2930,139 @@
       </w:tr>
     </w:tbl>
     <w:p>
-      <w:pPr/>
+      <w:pPr>
+        <w:ind w:left="312" w:hanging="227"/>
+      </w:pPr>
       <w:r>
-        <w:t>3. Tabela punktacji dla stawki liczącej od 4 do 40 zawodników stanowi załącznik nr 1 do Regulaminu. Pełną tabelę punktacji dla stawki liczącej od 4 do 300 zawodników SPWS publikuje na swojej stronie internetowej.</w:t>
+        <w:t xml:space="preserve">3. </w:t>
+      </w:r>
+      <w:r>
+        <w:t>Tabela punktacji dla stawki liczącej od 4 do 40 zawodników stanowi załącznik nr 1 do Regulaminu. Pełną tabelę punktacji dla stawki liczącej od 4 do 300 zawodników SPWS publikuje na swojej stronie internetowej.</w:t>
       </w:r>
     </w:p>
     <w:p>
-      <w:pPr/>
+      <w:pPr>
+        <w:ind w:left="312" w:hanging="227"/>
+      </w:pPr>
       <w:r>
-        <w:t>4. SPWS zapewnia publiczny i nieodpłatny dostęp do kalkulatora punktów, umożliwiającego sprawdzenie liczby punktów przyznawanych za konkretny wynik uzyskany w zawodach.</w:t>
+        <w:t xml:space="preserve">4. </w:t>
+      </w:r>
+      <w:r>
+        <w:t>SPWS zapewnia publiczny i nieodpłatny dostęp do kalkulatora punktów, umożliwiającego sprawdzenie liczby punktów przyznawanych za konkretny wynik uzyskany w zawodach.</w:t>
+      </w:r>
+    </w:p>
+    <w:p>
+      <w:pPr>
+        <w:pStyle w:val="Paragraf"/>
+        <w:pageBreakBefore/>
+      </w:pPr>
+      <w:r>
+        <w:t>§ 7</w:t>
+      </w:r>
+    </w:p>
+    <w:p>
+      <w:pPr>
+        <w:pStyle w:val="Tytułparagrafu"/>
+        <w:keepNext/>
+      </w:pPr>
+      <w:r>
+        <w:t>Publikacja rankingu</w:t>
+      </w:r>
+    </w:p>
+    <w:p>
+      <w:pPr>
+        <w:pStyle w:val="Etykietabrudnopisu"/>
+        <w:keepNext/>
+      </w:pPr>
+      <w:r>
+        <w:t>BRUDNOPIS ZE ŹRÓDŁA — DO OPRACOWANIA</w:t>
+      </w:r>
+    </w:p>
+    <w:p>
+      <w:pPr>
+        <w:ind w:left="85"/>
+      </w:pPr>
+      <w:r>
+        <w:rPr>
+          <w:color w:val="595959"/>
+        </w:rPr>
+        <w:t>Ranking indywidualny oraz kalkulator punktów są publikowane na stronie internetowej.</w:t>
+      </w:r>
+    </w:p>
+    <w:p>
+      <w:pPr>
+        <w:pStyle w:val="Paragraf"/>
+        <w:pageBreakBefore/>
+      </w:pPr>
+      <w:r>
+        <w:t>§ 8</w:t>
+      </w:r>
+    </w:p>
+    <w:p>
+      <w:pPr>
+        <w:pStyle w:val="Tytułparagrafu"/>
+        <w:keepNext/>
+      </w:pPr>
+      <w:r>
+        <w:t>Wyniki w połączonych kategoriach wiekowych</w:t>
+      </w:r>
+    </w:p>
+    <w:p>
+      <w:pPr>
+        <w:pStyle w:val="Etykietabrudnopisu"/>
+        <w:keepNext/>
+      </w:pPr>
+      <w:r>
+        <w:t>BRUDNOPIS ZE ŹRÓDŁA — DO OPRACOWANIA</w:t>
+      </w:r>
+    </w:p>
+    <w:p>
+      <w:pPr>
+        <w:ind w:left="85"/>
+      </w:pPr>
+      <w:r>
+        <w:rPr>
+          <w:color w:val="595959"/>
+        </w:rPr>
+        <w:t>W przypadku zawodów rozgrywanych w połączonych kategoriach wiekowych wyniki przypisuje się zgodnie z zajętym miejscem, bez dodatkowego rozdzielania kategorii w celu obliczenia punktów rankingowych.</w:t>
+      </w:r>
+    </w:p>
+    <w:p>
+      <w:pPr>
+        <w:pStyle w:val="Paragraf"/>
+        <w:pageBreakBefore/>
+      </w:pPr>
+      <w:r>
+        <w:t>§ 9</w:t>
+      </w:r>
+    </w:p>
+    <w:p>
+      <w:pPr>
+        <w:pStyle w:val="Tytułparagrafu"/>
+        <w:keepNext/>
+      </w:pPr>
+      <w:r>
+        <w:t>Zawodnicy uwzględniani w rankingu</w:t>
+      </w:r>
+    </w:p>
+    <w:p>
+      <w:pPr>
+        <w:pStyle w:val="Etykietabrudnopisu"/>
+        <w:keepNext/>
+      </w:pPr>
+      <w:r>
+        <w:t>BRUDNOPIS ZE ŹRÓDŁA — DO OPRACOWANIA</w:t>
+      </w:r>
+    </w:p>
+    <w:p>
+      <w:pPr>
+        <w:ind w:left="85"/>
+      </w:pPr>
+      <w:r>
+        <w:rPr>
+          <w:color w:val="595959"/>
+        </w:rPr>
+        <w:t>W rankingu uwzględnia się zawodników posiadających polskie obywatelstwo albo kartę pobytu. Warunkiem zaliczenia punktów z zawodów organizowanych przez EVF albo FIE jest start jako reprezentant Polski.</w:t>
       </w:r>
     </w:p>
     <w:p>
@@ -2769,7 +3076,7 @@
         <w:pageBreakBefore/>
       </w:pPr>
       <w:r>
-        <w:t>ROZDZIAŁ III</w:t>
+        <w:t>Rozdział 3</w:t>
       </w:r>
     </w:p>
     <w:p>
@@ -2788,37 +3095,62 @@
         <w:pStyle w:val="Paragraf"/>
       </w:pPr>
       <w:r>
-        <w:t>§ 7</w:t>
+        <w:t>§ 10</w:t>
       </w:r>
     </w:p>
     <w:p>
       <w:pPr>
-        <w:pStyle w:val="Tekstroboczy"/>
+        <w:pStyle w:val="Tytułparagrafu"/>
+        <w:keepNext/>
+      </w:pPr>
+      <w:r>
+        <w:t>Zasady powołań indywidualnych</w:t>
+      </w:r>
+    </w:p>
+    <w:p>
+      <w:pPr>
+        <w:ind w:left="85"/>
+      </w:pPr>
+      <w:r>
+        <w:t>Do startu indywidualnego w limitowanych zawodach międzynarodowych powołuje się czterech najwyżej sklasyfikowanych zawodników w rankingu właściwym dla danej broni, płci i kategorii wiekowej, z uwzględnieniem warunku dodatniego dorobku punktowego określonego w § 4 ust. 4.</w:t>
+      </w:r>
+    </w:p>
+    <w:p>
+      <w:pPr>
+        <w:pStyle w:val="Paragraf"/>
+        <w:pageBreakBefore/>
+      </w:pPr>
+      <w:r>
+        <w:t>§ 11</w:t>
+      </w:r>
+    </w:p>
+    <w:p>
+      <w:pPr>
+        <w:pStyle w:val="Tytułparagrafu"/>
+        <w:keepNext/>
+      </w:pPr>
+      <w:r>
+        <w:t>Rezygnacja i zastępstwo</w:t>
+      </w:r>
+    </w:p>
+    <w:p>
+      <w:pPr>
+        <w:pStyle w:val="Etykietabrudnopisu"/>
+        <w:keepNext/>
+      </w:pPr>
+      <w:r>
+        <w:t>BRUDNOPIS ZE ŹRÓDŁA — DO OPRACOWANIA</w:t>
+      </w:r>
+    </w:p>
+    <w:p>
+      <w:pPr>
         <w:ind w:left="85"/>
       </w:pPr>
       <w:r>
         <w:rPr>
-          <w:b/>
+          <w:color w:val="595959"/>
         </w:rPr>
-        <w:t xml:space="preserve">1. </w:t>
-      </w:r>
-      <w:r>
-        <w:t>[Zasady kwalifikacji i ustalania kolejności kandydatów.]</w:t>
-      </w:r>
-    </w:p>
-    <w:p>
-      <w:pPr>
-        <w:pStyle w:val="Tekstroboczy"/>
-        <w:ind w:left="85"/>
-      </w:pPr>
-      <w:r>
-        <w:rPr>
-          <w:b/>
-        </w:rPr>
-        <w:t xml:space="preserve">2. </w:t>
-      </w:r>
-      <w:r>
-        <w:t>[Rezygnacja, zastępstwo i sytuacje szczególne.]</w:t>
+        <w:t>W przypadku rezygnacji zawodnika z udziału w zawodach indywidualnych jego miejsce przechodzi na kolejnego zawodnika zgodnie z aktualnym rankingiem indywidualnym.</w:t>
       </w:r>
     </w:p>
     <w:p>
@@ -2832,7 +3164,7 @@
         <w:pageBreakBefore/>
       </w:pPr>
       <w:r>
-        <w:t>ROZDZIAŁ IV</w:t>
+        <w:t>Rozdział 4</w:t>
       </w:r>
     </w:p>
     <w:p>
@@ -2851,37 +3183,24 @@
         <w:pStyle w:val="Paragraf"/>
       </w:pPr>
       <w:r>
-        <w:t>§ 8</w:t>
+        <w:t>§ 12</w:t>
       </w:r>
     </w:p>
     <w:p>
       <w:pPr>
-        <w:pStyle w:val="Tekstroboczy"/>
-        <w:ind w:left="85"/>
+        <w:pStyle w:val="Tytułparagrafu"/>
+        <w:keepNext/>
       </w:pPr>
       <w:r>
-        <w:rPr>
-          <w:b/>
-        </w:rPr>
-        <w:t xml:space="preserve">1. </w:t>
-      </w:r>
-      <w:r>
-        <w:t>[Pula kandydatów do drużyny.]</w:t>
+        <w:t>Pula kandydatów do drużyny</w:t>
       </w:r>
     </w:p>
     <w:p>
       <w:pPr>
-        <w:pStyle w:val="Tekstroboczy"/>
         <w:ind w:left="85"/>
       </w:pPr>
       <w:r>
-        <w:rPr>
-          <w:b/>
-        </w:rPr>
-        <w:t xml:space="preserve">2. </w:t>
-      </w:r>
-      <w:r>
-        <w:t>[Wymogi kategorii wiekowych i dostępności.]</w:t>
+        <w:t>Ranking indywidualny wyznacza pulę kandydatów do składu drużyny, lecz miejsce w rankingu nie stanowi samoistnej podstawy powołania do składu drużyny.</w:t>
       </w:r>
     </w:p>
     <w:p>
@@ -2890,22 +3209,286 @@
         <w:pageBreakBefore/>
       </w:pPr>
       <w:r>
-        <w:t>§ 9</w:t>
+        <w:t>§ 13</w:t>
       </w:r>
     </w:p>
     <w:p>
       <w:pPr>
-        <w:pStyle w:val="Tekstroboczy"/>
+        <w:pStyle w:val="Tytułparagrafu"/>
+        <w:keepNext/>
+      </w:pPr>
+      <w:r>
+        <w:t>Kategorie wiekowe w drużynie</w:t>
+      </w:r>
+    </w:p>
+    <w:p>
+      <w:pPr>
+        <w:pStyle w:val="Etykietabrudnopisu"/>
+        <w:keepNext/>
+      </w:pPr>
+      <w:r>
+        <w:t>BRUDNOPIS ZE ŹRÓDŁA — DO OPRACOWANIA</w:t>
+      </w:r>
+    </w:p>
+    <w:p>
+      <w:pPr>
         <w:ind w:left="85"/>
       </w:pPr>
       <w:r>
         <w:rPr>
-          <w:b/>
+          <w:color w:val="595959"/>
+        </w:rPr>
+        <w:t>W rozgrywkach drużynowych zawody są rozgrywane w kategoriach Weteran, obejmującej kategorie 1 i 2, oraz Grand Weteran, obejmującej kategorie 3 i 4. Drużynę kompletuje się z udziałem zawodników obu właściwych kategorii wiekowych; co najmniej jeden zawodnik powinien należeć do kategorii wyższej, a preferowany jest udział dwóch takich zawodników.</w:t>
+      </w:r>
+    </w:p>
+    <w:p>
+      <w:pPr>
+        <w:pStyle w:val="Paragraf"/>
+        <w:pageBreakBefore/>
+      </w:pPr>
+      <w:r>
+        <w:t>§ 14</w:t>
+      </w:r>
+    </w:p>
+    <w:p>
+      <w:pPr>
+        <w:pStyle w:val="Tytułparagrafu"/>
+        <w:keepNext/>
+      </w:pPr>
+      <w:r>
+        <w:t>Drużynowe Mistrzostwa Europy</w:t>
+      </w:r>
+    </w:p>
+    <w:p>
+      <w:pPr>
+        <w:pStyle w:val="Etykietabrudnopisu"/>
+        <w:keepNext/>
+      </w:pPr>
+      <w:r>
+        <w:t>BRUDNOPIS ZE ŹRÓDŁA — DO OPRACOWANIA</w:t>
+      </w:r>
+    </w:p>
+    <w:p>
+      <w:pPr>
+        <w:ind w:left="312" w:hanging="227"/>
+      </w:pPr>
+      <w:r>
+        <w:rPr>
+          <w:color w:val="595959"/>
         </w:rPr>
         <w:t xml:space="preserve">1. </w:t>
       </w:r>
       <w:r>
-        <w:t>[Kryteria wyboru składu, role i odpowiedzialność za decyzję.]</w:t>
+        <w:rPr>
+          <w:color w:val="595959"/>
+        </w:rPr>
+        <w:t>Przy ustalaniu składu reprezentacji uwzględnia się czterech najwyżej sklasyfikowanych zawodników z młodszej kategorii wiekowej i czterech najwyżej sklasyfikowanych zawodników ze starszej kategorii wiekowej. W przypadku rezygnacji zawodnika jego miejsce zajmuje kolejny zawodnik w jego kategorii wiekowej.</w:t>
+      </w:r>
+    </w:p>
+    <w:p>
+      <w:pPr>
+        <w:ind w:left="312" w:hanging="227"/>
+      </w:pPr>
+      <w:r>
+        <w:rPr>
+          <w:color w:val="595959"/>
+        </w:rPr>
+        <w:t xml:space="preserve">2. </w:t>
+      </w:r>
+      <w:r>
+        <w:rPr>
+          <w:color w:val="595959"/>
+        </w:rPr>
+        <w:t>Ostateczny skład drużyny ustalają wspólnie najwyżej sklasyfikowany zawodnik młodszej kategorii wiekowej oraz najwyżej sklasyfikowany zawodnik starszej kategorii wiekowej. Dwóch zawodników wybiera się spośród pozostałych osób z puli na podstawie analizy osiągnięć w startach indywidualnych i drużynowych. Piąty zawodnik albo rezerwowy może zostać wybrany spoza tej puli.</w:t>
+      </w:r>
+    </w:p>
+    <w:p>
+      <w:pPr>
+        <w:ind w:left="312" w:hanging="227"/>
+      </w:pPr>
+      <w:r>
+        <w:rPr>
+          <w:color w:val="595959"/>
+        </w:rPr>
+        <w:t xml:space="preserve">3. </w:t>
+      </w:r>
+      <w:r>
+        <w:rPr>
+          <w:color w:val="595959"/>
+        </w:rPr>
+        <w:t>W przypadku braku porozumienia decyzję podejmuje Zarząd SPWS.</w:t>
+      </w:r>
+    </w:p>
+    <w:p>
+      <w:pPr>
+        <w:ind w:left="312" w:hanging="227"/>
+      </w:pPr>
+      <w:r>
+        <w:rPr>
+          <w:color w:val="595959"/>
+        </w:rPr>
+        <w:t xml:space="preserve">4. </w:t>
+      </w:r>
+      <w:r>
+        <w:rPr>
+          <w:color w:val="595959"/>
+        </w:rPr>
+        <w:t>Skompletowaną drużynę przedstawia się Zarządowi PZSz do akceptacji.</w:t>
+      </w:r>
+    </w:p>
+    <w:p>
+      <w:pPr>
+        <w:pStyle w:val="Paragraf"/>
+        <w:pageBreakBefore/>
+      </w:pPr>
+      <w:r>
+        <w:t>§ 15</w:t>
+      </w:r>
+    </w:p>
+    <w:p>
+      <w:pPr>
+        <w:pStyle w:val="Tytułparagrafu"/>
+        <w:keepNext/>
+      </w:pPr>
+      <w:r>
+        <w:t>Drużynowe Mistrzostwa Świata</w:t>
+      </w:r>
+    </w:p>
+    <w:p>
+      <w:pPr>
+        <w:pStyle w:val="Etykietabrudnopisu"/>
+        <w:keepNext/>
+      </w:pPr>
+      <w:r>
+        <w:t>BRUDNOPIS ZE ŹRÓDŁA — DO OPRACOWANIA</w:t>
+      </w:r>
+    </w:p>
+    <w:p>
+      <w:pPr>
+        <w:ind w:left="312" w:hanging="227"/>
+      </w:pPr>
+      <w:r>
+        <w:rPr>
+          <w:color w:val="595959"/>
+        </w:rPr>
+        <w:t xml:space="preserve">1. </w:t>
+      </w:r>
+      <w:r>
+        <w:rPr>
+          <w:color w:val="595959"/>
+        </w:rPr>
+        <w:t>Skład reprezentacji ustala się po zakończeniu rywalizacji indywidualnej podczas Mistrzostw Świata.</w:t>
+      </w:r>
+    </w:p>
+    <w:p>
+      <w:pPr>
+        <w:ind w:left="312" w:hanging="227"/>
+      </w:pPr>
+      <w:r>
+        <w:rPr>
+          <w:color w:val="595959"/>
+        </w:rPr>
+        <w:t xml:space="preserve">2. </w:t>
+      </w:r>
+      <w:r>
+        <w:rPr>
+          <w:color w:val="595959"/>
+        </w:rPr>
+        <w:t>Podstawą wyłonienia składu drużyny są wyniki uzyskane przez zawodników w turnieju indywidualnym Mistrzostw Świata.</w:t>
+      </w:r>
+    </w:p>
+    <w:p>
+      <w:pPr>
+        <w:ind w:left="312" w:hanging="227"/>
+      </w:pPr>
+      <w:r>
+        <w:rPr>
+          <w:color w:val="595959"/>
+        </w:rPr>
+        <w:t xml:space="preserve">3. </w:t>
+      </w:r>
+      <w:r>
+        <w:rPr>
+          <w:color w:val="595959"/>
+        </w:rPr>
+        <w:t>Do składu drużyny kwalifikuje się spośród uczestników Indywidualnych Mistrzostw Świata:</w:t>
+      </w:r>
+    </w:p>
+    <w:p>
+      <w:pPr>
+        <w:ind w:left="595" w:hanging="255"/>
+      </w:pPr>
+      <w:r>
+        <w:rPr>
+          <w:color w:val="595959"/>
+        </w:rPr>
+        <w:t xml:space="preserve">1) </w:t>
+      </w:r>
+      <w:r>
+        <w:rPr>
+          <w:color w:val="595959"/>
+        </w:rPr>
+        <w:t>dwóch najwyżej sklasyfikowanych zawodników z młodszej kategorii wiekowej;</w:t>
+      </w:r>
+    </w:p>
+    <w:p>
+      <w:pPr>
+        <w:ind w:left="595" w:hanging="255"/>
+      </w:pPr>
+      <w:r>
+        <w:rPr>
+          <w:color w:val="595959"/>
+        </w:rPr>
+        <w:t xml:space="preserve">2) </w:t>
+      </w:r>
+      <w:r>
+        <w:rPr>
+          <w:color w:val="595959"/>
+        </w:rPr>
+        <w:t>dwóch najwyżej sklasyfikowanych zawodników ze starszej kategorii wiekowej.</w:t>
+      </w:r>
+    </w:p>
+    <w:p>
+      <w:pPr>
+        <w:ind w:left="312" w:hanging="227"/>
+      </w:pPr>
+      <w:r>
+        <w:rPr>
+          <w:color w:val="595959"/>
+        </w:rPr>
+        <w:t xml:space="preserve">4. </w:t>
+      </w:r>
+      <w:r>
+        <w:rPr>
+          <w:color w:val="595959"/>
+        </w:rPr>
+        <w:t>Piątego zawodnika drużyny wskazują wspólnie czterej zawodnicy zakwalifikowani zgodnie z § 15 ust. 3 spośród pozostałych uczestników Indywidualnych Mistrzostw Świata.</w:t>
+      </w:r>
+    </w:p>
+    <w:p>
+      <w:pPr>
+        <w:pStyle w:val="Paragraf"/>
+        <w:pageBreakBefore/>
+      </w:pPr>
+      <w:r>
+        <w:t>§ 16</w:t>
+      </w:r>
+    </w:p>
+    <w:p>
+      <w:pPr>
+        <w:pStyle w:val="Tytułparagrafu"/>
+        <w:keepNext/>
+      </w:pPr>
+      <w:r>
+        <w:t>Powołanie uzupełniające</w:t>
+      </w:r>
+    </w:p>
+    <w:p>
+      <w:pPr>
+        <w:ind w:left="85"/>
+      </w:pPr>
+      <w:r>
+        <w:t>Powołanie uzupełniające zawodnika bez dodatniego dorobku punktowego jest dopuszczalne wyłącznie na warunkach określonych w § 4 ust. 5.</w:t>
       </w:r>
     </w:p>
     <w:p>
@@ -2919,7 +3502,7 @@
         <w:pageBreakBefore/>
       </w:pPr>
       <w:r>
-        <w:t>ROZDZIAŁ V</w:t>
+        <w:t>Rozdział 5</w:t>
       </w:r>
     </w:p>
     <w:p>
@@ -2938,37 +3521,36 @@
         <w:pStyle w:val="Paragraf"/>
       </w:pPr>
       <w:r>
-        <w:t>§ 10</w:t>
+        <w:t>§ 17</w:t>
       </w:r>
     </w:p>
     <w:p>
       <w:pPr>
-        <w:pStyle w:val="Tekstroboczy"/>
+        <w:pStyle w:val="Tytułparagrafu"/>
+        <w:keepNext/>
+      </w:pPr>
+      <w:r>
+        <w:t>Terminy procesu</w:t>
+      </w:r>
+    </w:p>
+    <w:p>
+      <w:pPr>
+        <w:pStyle w:val="Etykietabrudnopisu"/>
+        <w:keepNext/>
+      </w:pPr>
+      <w:r>
+        <w:t>MIEJSCE DO UZUPEŁNIENIA — WYMAGA DECYZJI</w:t>
+      </w:r>
+    </w:p>
+    <w:p>
+      <w:pPr>
         <w:ind w:left="85"/>
       </w:pPr>
       <w:r>
         <w:rPr>
-          <w:b/>
+          <w:color w:val="595959"/>
         </w:rPr>
-        <w:t xml:space="preserve">1. </w:t>
-      </w:r>
-      <w:r>
-        <w:t>[Daty graniczne procesu.]</w:t>
-      </w:r>
-    </w:p>
-    <w:p>
-      <w:pPr>
-        <w:pStyle w:val="Tekstroboczy"/>
-        <w:ind w:left="85"/>
-      </w:pPr>
-      <w:r>
-        <w:rPr>
-          <w:b/>
-        </w:rPr>
-        <w:t xml:space="preserve">2. </w:t>
-      </w:r>
-      <w:r>
-        <w:t>[Deklaracje, weryfikacja danych i ogłoszenie decyzji.]</w:t>
+        <w:t>Terminy zamknięcia danych rankingowych, składania deklaracji, weryfikacji warunków oraz ogłoszenia nominacji wymagają odrębnej decyzji.</w:t>
       </w:r>
     </w:p>
     <w:p>
@@ -2982,7 +3564,7 @@
         <w:pageBreakBefore/>
       </w:pPr>
       <w:r>
-        <w:t>ROZDZIAŁ VI</w:t>
+        <w:t>Rozdział 6</w:t>
       </w:r>
     </w:p>
     <w:p>
@@ -3001,37 +3583,49 @@
         <w:pStyle w:val="Paragraf"/>
       </w:pPr>
       <w:r>
-        <w:t>§ 11</w:t>
+        <w:t>§ 18</w:t>
       </w:r>
     </w:p>
     <w:p>
       <w:pPr>
-        <w:pStyle w:val="Tekstroboczy"/>
-        <w:ind w:left="85"/>
+        <w:pStyle w:val="Tytułparagrafu"/>
+        <w:keepNext/>
       </w:pPr>
       <w:r>
-        <w:rPr>
-          <w:b/>
-        </w:rPr>
-        <w:t xml:space="preserve">1. </w:t>
-      </w:r>
-      <w:r>
-        <w:t>[Zakres i termin oceny posezonowej.]</w:t>
+        <w:t>Ocena posezonowa</w:t>
       </w:r>
     </w:p>
     <w:p>
       <w:pPr>
-        <w:pStyle w:val="Tekstroboczy"/>
-        <w:ind w:left="85"/>
+        <w:ind w:left="312" w:hanging="227"/>
       </w:pPr>
       <w:r>
-        <w:rPr>
-          <w:b/>
-        </w:rPr>
+        <w:t xml:space="preserve">1. </w:t>
+      </w:r>
+      <w:r>
+        <w:t>Po zakończeniu każdego sezonu przeprowadza się ocenę działania Regulaminu.</w:t>
+      </w:r>
+    </w:p>
+    <w:p>
+      <w:pPr>
+        <w:ind w:left="312" w:hanging="227"/>
+      </w:pPr>
+      <w:r>
         <w:t xml:space="preserve">2. </w:t>
       </w:r>
       <w:r>
-        <w:t>[Zasady przygotowania zmian na kolejny sezon.]</w:t>
+        <w:t>Ocena obejmuje w szczególności terminowość procesu, spory interpretacyjne, zastosowane wyjątki, braki danych oraz zgodność nominacji z celem Regulaminu.</w:t>
+      </w:r>
+    </w:p>
+    <w:p>
+      <w:pPr>
+        <w:ind w:left="312" w:hanging="227"/>
+      </w:pPr>
+      <w:r>
+        <w:t xml:space="preserve">3. </w:t>
+      </w:r>
+      <w:r>
+        <w:t>Na podstawie oceny wskazuje się usprawnienia wymagające rozważenia przed kolejnym sezonem oraz zapisuje wnioski przy właściwych kartach decyzji.</w:t>
       </w:r>
     </w:p>
     <w:p>
@@ -3045,7 +3639,7 @@
         <w:pageBreakBefore/>
       </w:pPr>
       <w:r>
-        <w:t>ROZDZIAŁ VII</w:t>
+        <w:t>Rozdział 7</w:t>
       </w:r>
     </w:p>
     <w:p>
@@ -3064,37 +3658,59 @@
         <w:pStyle w:val="Paragraf"/>
       </w:pPr>
       <w:r>
-        <w:t>§ 12</w:t>
+        <w:t>§ 19</w:t>
       </w:r>
     </w:p>
     <w:p>
       <w:pPr>
-        <w:pStyle w:val="Tekstroboczy"/>
-        <w:ind w:left="85"/>
+        <w:pStyle w:val="Tytułparagrafu"/>
+        <w:keepNext/>
+      </w:pPr>
+      <w:r>
+        <w:t>Wejście w życie</w:t>
+      </w:r>
+    </w:p>
+    <w:p>
+      <w:pPr>
+        <w:pStyle w:val="Etykietabrudnopisu"/>
+        <w:keepNext/>
+      </w:pPr>
+      <w:r>
+        <w:t>BRUDNOPIS ZE ŹRÓDŁA — DO OPRACOWANIA</w:t>
+      </w:r>
+    </w:p>
+    <w:p>
+      <w:pPr>
+        <w:ind w:left="312" w:hanging="227"/>
       </w:pPr>
       <w:r>
         <w:rPr>
-          <w:b/>
+          <w:color w:val="595959"/>
         </w:rPr>
         <w:t xml:space="preserve">1. </w:t>
       </w:r>
       <w:r>
-        <w:t>[Przepisy przejściowe.]</w:t>
+        <w:rPr>
+          <w:color w:val="595959"/>
+        </w:rPr>
+        <w:t>Regulamin wchodzi w życie z dniem uchwalenia.</w:t>
       </w:r>
     </w:p>
     <w:p>
       <w:pPr>
-        <w:pStyle w:val="Tekstroboczy"/>
-        <w:ind w:left="85"/>
+        <w:ind w:left="312" w:hanging="227"/>
       </w:pPr>
       <w:r>
         <w:rPr>
-          <w:b/>
+          <w:color w:val="595959"/>
         </w:rPr>
         <w:t xml:space="preserve">2. </w:t>
       </w:r>
       <w:r>
-        <w:t>[Wejście regulaminu w życie.]</w:t>
+        <w:rPr>
+          <w:color w:val="595959"/>
+        </w:rPr>
+        <w:t>Regulaminu nie stosuje się do Mistrzostw Świata Weteranów w Tbilisi w 2026 r.</w:t>
       </w:r>
     </w:p>
     <w:p>
@@ -27924,7 +28540,7 @@
                 <w:rFonts w:ascii="Aptos" w:hAnsi="Aptos"/>
                 <w:sz w:val="18"/>
               </w:rPr>
-              <w:t>0.1</w:t>
+              <w:t>0.2</w:t>
             </w:r>
           </w:p>
         </w:tc>
@@ -27948,7 +28564,7 @@
                 <w:rFonts w:ascii="Aptos" w:hAnsi="Aptos"/>
                 <w:sz w:val="18"/>
               </w:rPr>
-              <w:t>[data]</w:t>
+              <w:t>2026-09-19</w:t>
             </w:r>
           </w:p>
         </w:tc>
@@ -27972,7 +28588,7 @@
                 <w:rFonts w:ascii="Aptos" w:hAnsi="Aptos"/>
                 <w:sz w:val="18"/>
               </w:rPr>
-              <w:t>Pierwszy prototyp struktury i formatowania</w:t>
+              <w:t>Pełna struktura ZTP i jednorazowa migracja treści źródłowej</w:t>
             </w:r>
           </w:p>
         </w:tc>
@@ -28017,7 +28633,7 @@
         <w:pStyle w:val="Tekstroboczy"/>
       </w:pPr>
       <w:r>
-        <w:t>Dokument służy wyłącznie do oceny struktury i formatowania. Tekst w nawiasach kwadratowych nie stanowi projektu postanowień regulaminu.</w:t>
+        <w:t>Dokument jest projektem. Fragmenty oznaczone jako brudnopis ze źródła nie są treścią przyjętą.</w:t>
       </w:r>
     </w:p>
     <w:sectPr>
@@ -40262,6 +40878,19 @@
       <w:u w:val="single"/>
     </w:rPr>
   </w:style>
+  <w:style w:type="paragraph" w:customStyle="1" w:styleId="Tytułparagrafu">
+    <w:name w:val="Tytuł paragrafu"/>
+    <w:basedOn w:val="Heading3"/>
+  </w:style>
+  <w:style w:type="paragraph" w:customStyle="1" w:styleId="Etykietabrudnopisu">
+    <w:name w:val="Etykieta brudnopisu"/>
+    <w:basedOn w:val="Normal"/>
+    <w:rPr>
+      <w:b/>
+      <w:color w:val="595959"/>
+      <w:sz w:val="16"/>
+    </w:rPr>
+  </w:style>
 </w:styles>
 </file>
 

</xml_diff>

<commit_message>
fix: compact DOCX section pagination
</commit_message>
<xml_diff>
--- a/regulamin/Regulamin-powolywania-reprezentacji-Polski-weteranów-w-szermierce_2026.docx
+++ b/regulamin/Regulamin-powolywania-reprezentacji-Polski-weteranów-w-szermierce_2026.docx
@@ -1664,6 +1664,7 @@
     <w:p>
       <w:pPr>
         <w:pStyle w:val="Paragraf"/>
+        <w:keepNext/>
       </w:pPr>
       <w:r>
         <w:t>§ 1</w:t>
@@ -1680,6 +1681,7 @@
     </w:p>
     <w:p>
       <w:pPr>
+        <w:keepLines/>
         <w:ind w:left="85"/>
       </w:pPr>
       <w:r>
@@ -1689,7 +1691,7 @@
     <w:p>
       <w:pPr>
         <w:pStyle w:val="Paragraf"/>
-        <w:pageBreakBefore/>
+        <w:keepNext/>
         <w:ind w:left="85"/>
       </w:pPr>
       <w:r>
@@ -1707,6 +1709,7 @@
     </w:p>
     <w:p>
       <w:pPr>
+        <w:keepLines/>
         <w:ind w:left="85"/>
       </w:pPr>
       <w:r>
@@ -1869,7 +1872,7 @@
     <w:p>
       <w:pPr>
         <w:pStyle w:val="Paragraf"/>
-        <w:pageBreakBefore/>
+        <w:keepNext/>
         <w:ind w:left="85"/>
       </w:pPr>
       <w:r>
@@ -1887,6 +1890,7 @@
     </w:p>
     <w:p>
       <w:pPr>
+        <w:keepLines/>
         <w:ind w:left="312" w:hanging="227"/>
       </w:pPr>
       <w:r>
@@ -1964,6 +1968,7 @@
     <w:p>
       <w:pPr>
         <w:pStyle w:val="Paragraf"/>
+        <w:keepNext/>
       </w:pPr>
       <w:r>
         <w:t>§ 4</w:t>
@@ -1980,6 +1985,7 @@
     </w:p>
     <w:p>
       <w:pPr>
+        <w:keepLines/>
         <w:ind w:left="312" w:hanging="227"/>
       </w:pPr>
       <w:r>
@@ -2102,7 +2108,7 @@
     <w:p>
       <w:pPr>
         <w:pStyle w:val="Paragraf"/>
-        <w:pageBreakBefore/>
+        <w:keepNext/>
       </w:pPr>
       <w:r>
         <w:t>§ 5</w:t>
@@ -2119,6 +2125,7 @@
     </w:p>
     <w:p>
       <w:pPr>
+        <w:keepLines/>
         <w:ind w:left="312" w:hanging="227"/>
       </w:pPr>
       <w:r>
@@ -2285,7 +2292,7 @@
     <w:p>
       <w:pPr>
         <w:pStyle w:val="Paragraf"/>
-        <w:pageBreakBefore/>
+        <w:keepNext/>
       </w:pPr>
       <w:r>
         <w:t>§ 6</w:t>
@@ -2302,6 +2309,7 @@
     </w:p>
     <w:p>
       <w:pPr>
+        <w:keepLines/>
         <w:ind w:left="312" w:hanging="227"/>
       </w:pPr>
       <w:r>
@@ -2954,7 +2962,7 @@
     <w:p>
       <w:pPr>
         <w:pStyle w:val="Paragraf"/>
-        <w:pageBreakBefore/>
+        <w:keepNext/>
       </w:pPr>
       <w:r>
         <w:t>§ 7</w:t>
@@ -2980,6 +2988,7 @@
     </w:p>
     <w:p>
       <w:pPr>
+        <w:keepLines/>
         <w:ind w:left="85"/>
       </w:pPr>
       <w:r>
@@ -2992,7 +3001,7 @@
     <w:p>
       <w:pPr>
         <w:pStyle w:val="Paragraf"/>
-        <w:pageBreakBefore/>
+        <w:keepNext/>
       </w:pPr>
       <w:r>
         <w:t>§ 8</w:t>
@@ -3018,6 +3027,7 @@
     </w:p>
     <w:p>
       <w:pPr>
+        <w:keepLines/>
         <w:ind w:left="85"/>
       </w:pPr>
       <w:r>
@@ -3030,7 +3040,7 @@
     <w:p>
       <w:pPr>
         <w:pStyle w:val="Paragraf"/>
-        <w:pageBreakBefore/>
+        <w:keepNext/>
       </w:pPr>
       <w:r>
         <w:t>§ 9</w:t>
@@ -3056,6 +3066,7 @@
     </w:p>
     <w:p>
       <w:pPr>
+        <w:keepLines/>
         <w:ind w:left="85"/>
       </w:pPr>
       <w:r>
@@ -3063,11 +3074,6 @@
           <w:color w:val="595959"/>
         </w:rPr>
         <w:t>W rankingu uwzględnia się zawodników posiadających polskie obywatelstwo albo kartę pobytu. Warunkiem zaliczenia punktów z zawodów organizowanych przez EVF albo FIE jest start jako reprezentant Polski.</w:t>
-      </w:r>
-    </w:p>
-    <w:p>
-      <w:r>
-        <w:br w:type="page"/>
       </w:r>
     </w:p>
     <w:p>
@@ -3093,6 +3099,7 @@
     <w:p>
       <w:pPr>
         <w:pStyle w:val="Paragraf"/>
+        <w:keepNext/>
       </w:pPr>
       <w:r>
         <w:t>§ 10</w:t>
@@ -3109,6 +3116,7 @@
     </w:p>
     <w:p>
       <w:pPr>
+        <w:keepLines/>
         <w:ind w:left="85"/>
       </w:pPr>
       <w:r>
@@ -3118,7 +3126,7 @@
     <w:p>
       <w:pPr>
         <w:pStyle w:val="Paragraf"/>
-        <w:pageBreakBefore/>
+        <w:keepNext/>
       </w:pPr>
       <w:r>
         <w:t>§ 11</w:t>
@@ -3144,6 +3152,7 @@
     </w:p>
     <w:p>
       <w:pPr>
+        <w:keepLines/>
         <w:ind w:left="85"/>
       </w:pPr>
       <w:r>
@@ -3151,11 +3160,6 @@
           <w:color w:val="595959"/>
         </w:rPr>
         <w:t>W przypadku rezygnacji zawodnika z udziału w zawodach indywidualnych jego miejsce przechodzi na kolejnego zawodnika zgodnie z aktualnym rankingiem indywidualnym.</w:t>
-      </w:r>
-    </w:p>
-    <w:p>
-      <w:r>
-        <w:br w:type="page"/>
       </w:r>
     </w:p>
     <w:p>
@@ -3181,6 +3185,7 @@
     <w:p>
       <w:pPr>
         <w:pStyle w:val="Paragraf"/>
+        <w:keepNext/>
       </w:pPr>
       <w:r>
         <w:t>§ 12</w:t>
@@ -3197,6 +3202,7 @@
     </w:p>
     <w:p>
       <w:pPr>
+        <w:keepLines/>
         <w:ind w:left="85"/>
       </w:pPr>
       <w:r>
@@ -3206,7 +3212,7 @@
     <w:p>
       <w:pPr>
         <w:pStyle w:val="Paragraf"/>
-        <w:pageBreakBefore/>
+        <w:keepNext/>
       </w:pPr>
       <w:r>
         <w:t>§ 13</w:t>
@@ -3232,6 +3238,7 @@
     </w:p>
     <w:p>
       <w:pPr>
+        <w:keepLines/>
         <w:ind w:left="85"/>
       </w:pPr>
       <w:r>
@@ -3244,7 +3251,7 @@
     <w:p>
       <w:pPr>
         <w:pStyle w:val="Paragraf"/>
-        <w:pageBreakBefore/>
+        <w:keepNext/>
       </w:pPr>
       <w:r>
         <w:t>§ 14</w:t>
@@ -3270,6 +3277,7 @@
     </w:p>
     <w:p>
       <w:pPr>
+        <w:keepLines/>
         <w:ind w:left="312" w:hanging="227"/>
       </w:pPr>
       <w:r>
@@ -3339,7 +3347,7 @@
     <w:p>
       <w:pPr>
         <w:pStyle w:val="Paragraf"/>
-        <w:pageBreakBefore/>
+        <w:keepNext/>
       </w:pPr>
       <w:r>
         <w:t>§ 15</w:t>
@@ -3365,6 +3373,7 @@
     </w:p>
     <w:p>
       <w:pPr>
+        <w:keepLines/>
         <w:ind w:left="312" w:hanging="227"/>
       </w:pPr>
       <w:r>
@@ -3468,7 +3477,7 @@
     <w:p>
       <w:pPr>
         <w:pStyle w:val="Paragraf"/>
-        <w:pageBreakBefore/>
+        <w:keepNext/>
       </w:pPr>
       <w:r>
         <w:t>§ 16</w:t>
@@ -3485,15 +3494,11 @@
     </w:p>
     <w:p>
       <w:pPr>
+        <w:keepLines/>
         <w:ind w:left="85"/>
       </w:pPr>
       <w:r>
         <w:t>Powołanie uzupełniające zawodnika bez dodatniego dorobku punktowego jest dopuszczalne wyłącznie na warunkach określonych w § 4 ust. 5.</w:t>
-      </w:r>
-    </w:p>
-    <w:p>
-      <w:r>
-        <w:br w:type="page"/>
       </w:r>
     </w:p>
     <w:p>
@@ -3519,6 +3524,7 @@
     <w:p>
       <w:pPr>
         <w:pStyle w:val="Paragraf"/>
+        <w:keepNext/>
       </w:pPr>
       <w:r>
         <w:t>§ 17</w:t>
@@ -3544,6 +3550,7 @@
     </w:p>
     <w:p>
       <w:pPr>
+        <w:keepLines/>
         <w:ind w:left="85"/>
       </w:pPr>
       <w:r>
@@ -3551,11 +3558,6 @@
           <w:color w:val="595959"/>
         </w:rPr>
         <w:t>Terminy zamknięcia danych rankingowych, składania deklaracji, weryfikacji warunków oraz ogłoszenia nominacji wymagają odrębnej decyzji.</w:t>
-      </w:r>
-    </w:p>
-    <w:p>
-      <w:r>
-        <w:br w:type="page"/>
       </w:r>
     </w:p>
     <w:p>
@@ -3581,6 +3583,7 @@
     <w:p>
       <w:pPr>
         <w:pStyle w:val="Paragraf"/>
+        <w:keepNext/>
       </w:pPr>
       <w:r>
         <w:t>§ 18</w:t>
@@ -3597,6 +3600,7 @@
     </w:p>
     <w:p>
       <w:pPr>
+        <w:keepLines/>
         <w:ind w:left="312" w:hanging="227"/>
       </w:pPr>
       <w:r>
@@ -3629,11 +3633,6 @@
       </w:r>
     </w:p>
     <w:p>
-      <w:r>
-        <w:br w:type="page"/>
-      </w:r>
-    </w:p>
-    <w:p>
       <w:pPr>
         <w:pStyle w:val="Etykietarozdzialu"/>
         <w:pageBreakBefore/>
@@ -3656,6 +3655,7 @@
     <w:p>
       <w:pPr>
         <w:pStyle w:val="Paragraf"/>
+        <w:keepNext/>
       </w:pPr>
       <w:r>
         <w:t>§ 19</w:t>
@@ -3681,6 +3681,7 @@
     </w:p>
     <w:p>
       <w:pPr>
+        <w:keepLines/>
         <w:ind w:left="312" w:hanging="227"/>
       </w:pPr>
       <w:r>
@@ -3711,11 +3712,6 @@
           <w:color w:val="595959"/>
         </w:rPr>
         <w:t>Regulaminu nie stosuje się do Mistrzostw Świata Weteranów w Tbilisi w 2026 r.</w:t>
-      </w:r>
-    </w:p>
-    <w:p>
-      <w:r>
-        <w:br w:type="page"/>
       </w:r>
     </w:p>
     <w:p>

</xml_diff>

<commit_message>
feat: define eight-result ranking selection
</commit_message>
<xml_diff>
--- a/regulamin/Regulamin-powolywania-reprezentacji-Polski-weteranów-w-szermierce_2026.docx
+++ b/regulamin/Regulamin-powolywania-reprezentacji-Polski-weteranów-w-szermierce_2026.docx
@@ -2264,18 +2264,7 @@
         <w:t xml:space="preserve">7) </w:t>
       </w:r>
       <w:r>
-        <w:t>protokoły i wyniki, o których mowa w § 5 ust. 2 pkt 6, pozostają dostępne online przez co najmniej 36 miesięcy od dnia zakończenia zawodów;</w:t>
-      </w:r>
-    </w:p>
-    <w:p>
-      <w:pPr>
-        <w:ind w:left="595" w:hanging="255"/>
-      </w:pPr>
-      <w:r>
-        <w:t xml:space="preserve">8) </w:t>
-      </w:r>
-      <w:r>
-        <w:t>opublikowane wyniki zawierają dane niezbędne do ich zweryfikowania oraz obliczenia punktów rankingowych.</w:t>
+        <w:t>protokoły i wyniki, o których mowa w § 5 ust. 2 pkt 6, pozostają dostępne online przez co najmniej 36 miesięcy od dnia zakończenia zawodów.</w:t>
       </w:r>
     </w:p>
     <w:p>
@@ -2286,7 +2275,172 @@
         <w:t xml:space="preserve">3. </w:t>
       </w:r>
       <w:r>
-        <w:t>Spośród wyników uzyskanych w zawodach, o których mowa w § 5 ust. 1 pkt 1, w rankingu uwzględnia się trzy wyniki, za które zawodnik uzyskał najwyższą liczbę punktów rankingowych.</w:t>
+        <w:t>Łączna liczba punktów zawodnika w rankingu indywidualnym jest sumą punktów przypisanych do ośmiu pozycji wynikowych:</w:t>
+      </w:r>
+    </w:p>
+    <w:p>
+      <w:pPr>
+        <w:ind w:left="595" w:hanging="255"/>
+      </w:pPr>
+      <w:r>
+        <w:t xml:space="preserve">1) </w:t>
+      </w:r>
+      <w:r>
+        <w:t>trzech obowiązkowych pozycji krajowych;</w:t>
+      </w:r>
+    </w:p>
+    <w:p>
+      <w:pPr>
+        <w:ind w:left="595" w:hanging="255"/>
+      </w:pPr>
+      <w:r>
+        <w:t xml:space="preserve">2) </w:t>
+      </w:r>
+      <w:r>
+        <w:t>pięciu pozycji otwartych.</w:t>
+      </w:r>
+    </w:p>
+    <w:p>
+      <w:pPr>
+        <w:ind w:left="312" w:hanging="227"/>
+      </w:pPr>
+      <w:r>
+        <w:t xml:space="preserve">4. </w:t>
+      </w:r>
+      <w:r>
+        <w:t>Trzy obowiązkowe pozycje krajowe wypełnia się wynikami uzyskanymi w zawodach Pucharu Polski Weteranów w Szermierce oraz Mistrzostwach Polski Weteranów w Szermierce, według następujących zasad:</w:t>
+      </w:r>
+    </w:p>
+    <w:p>
+      <w:pPr>
+        <w:ind w:left="595" w:hanging="255"/>
+      </w:pPr>
+      <w:r>
+        <w:t xml:space="preserve">1) </w:t>
+      </w:r>
+      <w:r>
+        <w:t>spośród wszystkich wyników uzyskanych przez zawodnika w tych zawodach wybiera się trzy wyniki, za które zawodnik otrzymał najwyższą liczbę punktów rankingowych;</w:t>
+      </w:r>
+    </w:p>
+    <w:p>
+      <w:pPr>
+        <w:ind w:left="595" w:hanging="255"/>
+      </w:pPr>
+      <w:r>
+        <w:t xml:space="preserve">2) </w:t>
+      </w:r>
+      <w:r>
+        <w:t>wyniki z Pucharu Polski Weteranów w Szermierce oraz Mistrzostw Polski Weteranów w Szermierce porównuje się łącznie, wyłącznie na podstawie liczby uzyskanych punktów rankingowych;</w:t>
+      </w:r>
+    </w:p>
+    <w:p>
+      <w:pPr>
+        <w:ind w:left="595" w:hanging="255"/>
+      </w:pPr>
+      <w:r>
+        <w:t xml:space="preserve">3) </w:t>
+      </w:r>
+      <w:r>
+        <w:t>uwzględnienie wyniku z Mistrzostw Polski Weteranów w Szermierce nie jest obowiązkowe;</w:t>
+      </w:r>
+    </w:p>
+    <w:p>
+      <w:pPr>
+        <w:ind w:left="595" w:hanging="255"/>
+      </w:pPr>
+      <w:r>
+        <w:t xml:space="preserve">4) </w:t>
+      </w:r>
+      <w:r>
+        <w:t>jeżeli zawodnik uzyskał mniej niż trzy wyniki w Pucharze Polski Weteranów w Szermierce lub Mistrzostwach Polski Weteranów w Szermierce, za każdą niewypełnioną obowiązkową pozycję krajową przyjmuje się zero punktów rankingowych.</w:t>
+      </w:r>
+    </w:p>
+    <w:p>
+      <w:pPr>
+        <w:ind w:left="312" w:hanging="227"/>
+      </w:pPr>
+      <w:r>
+        <w:t xml:space="preserve">5. </w:t>
+      </w:r>
+      <w:r>
+        <w:t>Pięć pozycji otwartych wypełnia się pięcioma najwyżej punktowanymi wynikami zawodnika, które nie zostały uwzględnione jako obowiązkowe pozycje krajowe. Przy wyborze wyników do pozycji otwartych uwzględnia się:</w:t>
+      </w:r>
+    </w:p>
+    <w:p>
+      <w:pPr>
+        <w:ind w:left="595" w:hanging="255"/>
+      </w:pPr>
+      <w:r>
+        <w:t xml:space="preserve">1) </w:t>
+      </w:r>
+      <w:r>
+        <w:t>pozostałe wyniki uzyskane w Pucharze Polski Weteranów w Szermierce oraz Mistrzostwach Polski Weteranów w Szermierce;</w:t>
+      </w:r>
+    </w:p>
+    <w:p>
+      <w:pPr>
+        <w:ind w:left="595" w:hanging="255"/>
+      </w:pPr>
+      <w:r>
+        <w:t xml:space="preserve">2) </w:t>
+      </w:r>
+      <w:r>
+        <w:t>wyniki uzyskane w Pucharach Polski Seniorów w Szermierce oraz Mistrzostwach Polski Seniorów w Szermierce;</w:t>
+      </w:r>
+    </w:p>
+    <w:p>
+      <w:pPr>
+        <w:ind w:left="595" w:hanging="255"/>
+      </w:pPr>
+      <w:r>
+        <w:t xml:space="preserve">3) </w:t>
+      </w:r>
+      <w:r>
+        <w:t>wyniki uzyskane w Pucharach Europy Weteranów w Szermierce oraz Mistrzostwach Europy Weteranów w Szermierce;</w:t>
+      </w:r>
+    </w:p>
+    <w:p>
+      <w:pPr>
+        <w:ind w:left="595" w:hanging="255"/>
+      </w:pPr>
+      <w:r>
+        <w:t xml:space="preserve">4) </w:t>
+      </w:r>
+      <w:r>
+        <w:t>wyniki uzyskane w Pucharach Świata Weteranów w Szermierce, jeżeli zawody tego cyklu zostaną rozegrane, oraz Mistrzostwach Świata Weteranów w Szermierce.</w:t>
+      </w:r>
+    </w:p>
+    <w:p>
+      <w:pPr>
+        <w:ind w:left="312" w:hanging="227"/>
+      </w:pPr>
+      <w:r>
+        <w:t xml:space="preserve">6. </w:t>
+      </w:r>
+      <w:r>
+        <w:t>Jeżeli po wybraniu trzech obowiązkowych pozycji krajowych zawodnik ma mniej niż pięć pozostałych wyników podlegających uwzględnieniu w pozycjach otwartych, za każdą niewypełnioną pozycję otwartą przyjmuje się zero punktów rankingowych.</w:t>
+      </w:r>
+    </w:p>
+    <w:p>
+      <w:pPr>
+        <w:ind w:left="312" w:hanging="227"/>
+      </w:pPr>
+      <w:r>
+        <w:t xml:space="preserve">7. </w:t>
+      </w:r>
+      <w:r>
+        <w:t>Najpierw wybiera się wyniki wypełniające trzy obowiązkowe pozycje krajowe, a następnie wyniki wypełniające pięć pozycji otwartych.</w:t>
+      </w:r>
+    </w:p>
+    <w:p>
+      <w:pPr>
+        <w:ind w:left="312" w:hanging="227"/>
+      </w:pPr>
+      <w:r>
+        <w:t xml:space="preserve">8. </w:t>
+      </w:r>
+      <w:r>
+        <w:t>Żaden wynik nie może zostać policzony dwukrotnie.</w:t>
       </w:r>
     </w:p>
     <w:p>

</xml_diff>

<commit_message>
refactor: simplify ranking rule and space tables
</commit_message>
<xml_diff>
--- a/regulamin/Regulamin-powolywania-reprezentacji-Polski-weteranów-w-szermierce_2026.docx
+++ b/regulamin/Regulamin-powolywania-reprezentacji-Polski-weteranów-w-szermierce_2026.docx
@@ -2330,28 +2330,6 @@
         <w:t xml:space="preserve">2) </w:t>
       </w:r>
       <w:r>
-        <w:t>wyniki z Pucharu Polski Weteranów w Szermierce oraz Mistrzostw Polski Weteranów w Szermierce porównuje się łącznie, wyłącznie na podstawie liczby uzyskanych punktów rankingowych;</w:t>
-      </w:r>
-    </w:p>
-    <w:p>
-      <w:pPr>
-        <w:ind w:left="595" w:hanging="255"/>
-      </w:pPr>
-      <w:r>
-        <w:t xml:space="preserve">3) </w:t>
-      </w:r>
-      <w:r>
-        <w:t>uwzględnienie wyniku z Mistrzostw Polski Weteranów w Szermierce nie jest obowiązkowe;</w:t>
-      </w:r>
-    </w:p>
-    <w:p>
-      <w:pPr>
-        <w:ind w:left="595" w:hanging="255"/>
-      </w:pPr>
-      <w:r>
-        <w:t xml:space="preserve">4) </w:t>
-      </w:r>
-      <w:r>
         <w:t>jeżeli zawodnik uzyskał mniej niż trzy wyniki w Pucharze Polski Weteranów w Szermierce lub Mistrzostwach Polski Weteranów w Szermierce, za każdą niewypełnioną obowiązkową pozycję krajową przyjmuje się zero punktów rankingowych.</w:t>
       </w:r>
     </w:p>
@@ -2363,51 +2341,7 @@
         <w:t xml:space="preserve">5. </w:t>
       </w:r>
       <w:r>
-        <w:t>Pięć pozycji otwartych wypełnia się pięcioma najwyżej punktowanymi wynikami zawodnika, które nie zostały uwzględnione jako obowiązkowe pozycje krajowe. Przy wyborze wyników do pozycji otwartych uwzględnia się:</w:t>
-      </w:r>
-    </w:p>
-    <w:p>
-      <w:pPr>
-        <w:ind w:left="595" w:hanging="255"/>
-      </w:pPr>
-      <w:r>
-        <w:t xml:space="preserve">1) </w:t>
-      </w:r>
-      <w:r>
-        <w:t>pozostałe wyniki uzyskane w Pucharze Polski Weteranów w Szermierce oraz Mistrzostwach Polski Weteranów w Szermierce;</w:t>
-      </w:r>
-    </w:p>
-    <w:p>
-      <w:pPr>
-        <w:ind w:left="595" w:hanging="255"/>
-      </w:pPr>
-      <w:r>
-        <w:t xml:space="preserve">2) </w:t>
-      </w:r>
-      <w:r>
-        <w:t>wyniki uzyskane w Pucharach Polski Seniorów w Szermierce oraz Mistrzostwach Polski Seniorów w Szermierce;</w:t>
-      </w:r>
-    </w:p>
-    <w:p>
-      <w:pPr>
-        <w:ind w:left="595" w:hanging="255"/>
-      </w:pPr>
-      <w:r>
-        <w:t xml:space="preserve">3) </w:t>
-      </w:r>
-      <w:r>
-        <w:t>wyniki uzyskane w Pucharach Europy Weteranów w Szermierce oraz Mistrzostwach Europy Weteranów w Szermierce;</w:t>
-      </w:r>
-    </w:p>
-    <w:p>
-      <w:pPr>
-        <w:ind w:left="595" w:hanging="255"/>
-      </w:pPr>
-      <w:r>
-        <w:t xml:space="preserve">4) </w:t>
-      </w:r>
-      <w:r>
-        <w:t>wyniki uzyskane w Pucharach Świata Weteranów w Szermierce, jeżeli zawody tego cyklu zostaną rozegrane, oraz Mistrzostwach Świata Weteranów w Szermierce.</w:t>
+        <w:t>Na pięć pozycji otwartych składa się pięć najwyżej punktowanych spośród pozostałych wyników zawodnika uwzględnianych w rankingu.</w:t>
       </w:r>
     </w:p>
     <w:p>
@@ -2418,7 +2352,7 @@
         <w:t xml:space="preserve">6. </w:t>
       </w:r>
       <w:r>
-        <w:t>Jeżeli po wybraniu trzech obowiązkowych pozycji krajowych zawodnik ma mniej niż pięć pozostałych wyników podlegających uwzględnieniu w pozycjach otwartych, za każdą niewypełnioną pozycję otwartą przyjmuje się zero punktów rankingowych.</w:t>
+        <w:t>Najpierw wybiera się wyniki wypełniające trzy obowiązkowe pozycje krajowe, a następnie wyniki wypełniające pięć pozycji otwartych.</w:t>
       </w:r>
     </w:p>
     <w:p>
@@ -2427,17 +2361,6 @@
       </w:pPr>
       <w:r>
         <w:t xml:space="preserve">7. </w:t>
-      </w:r>
-      <w:r>
-        <w:t>Najpierw wybiera się wyniki wypełniające trzy obowiązkowe pozycje krajowe, a następnie wyniki wypełniające pięć pozycji otwartych.</w:t>
-      </w:r>
-    </w:p>
-    <w:p>
-      <w:pPr>
-        <w:ind w:left="312" w:hanging="227"/>
-      </w:pPr>
-      <w:r>
-        <w:t xml:space="preserve">8. </w:t>
       </w:r>
       <w:r>
         <w:t>Żaden wynik nie może zostać policzony dwukrotnie.</w:t>
@@ -3091,6 +3014,9 @@
         </w:tc>
       </w:tr>
     </w:tbl>
+    <w:p>
+      <w:pPr/>
+    </w:p>
     <w:p>
       <w:pPr>
         <w:ind w:left="312" w:hanging="227"/>
@@ -8114,6 +8040,9 @@
       </w:tr>
     </w:tbl>
     <w:p>
+      <w:pPr/>
+    </w:p>
+    <w:p>
       <w:pPr>
         <w:pStyle w:val="Heading2"/>
         <w:keepNext/>
@@ -12313,6 +12242,9 @@
         </w:tc>
       </w:tr>
     </w:tbl>
+    <w:p>
+      <w:pPr/>
+    </w:p>
     <w:p>
       <w:pPr>
         <w:pStyle w:val="Heading2"/>
@@ -13280,6 +13212,9 @@
       </w:tr>
     </w:tbl>
     <w:p>
+      <w:pPr/>
+    </w:p>
+    <w:p>
       <w:pPr>
         <w:pStyle w:val="Heading2"/>
         <w:keepNext/>
@@ -17479,6 +17414,9 @@
         </w:tc>
       </w:tr>
     </w:tbl>
+    <w:p>
+      <w:pPr/>
+    </w:p>
     <w:p>
       <w:pPr>
         <w:pStyle w:val="Heading2"/>
@@ -20756,6 +20694,9 @@
       </w:tr>
     </w:tbl>
     <w:p>
+      <w:pPr/>
+    </w:p>
+    <w:p>
       <w:pPr>
         <w:pStyle w:val="Heading2"/>
         <w:keepNext/>
@@ -24955,6 +24896,9 @@
         </w:tc>
       </w:tr>
     </w:tbl>
+    <w:p>
+      <w:pPr/>
+    </w:p>
     <w:p>
       <w:pPr>
         <w:pStyle w:val="Heading2"/>
@@ -25922,6 +25866,9 @@
       </w:tr>
     </w:tbl>
     <w:p>
+      <w:pPr/>
+    </w:p>
+    <w:p>
       <w:pPr>
         <w:pStyle w:val="Heading2"/>
         <w:keepNext/>
@@ -28509,6 +28456,9 @@
         </w:tc>
       </w:tr>
     </w:tbl>
+    <w:p>
+      <w:pPr/>
+    </w:p>
     <w:p>
       <w:pPr>
         <w:spacing w:before="160"/>
@@ -28768,6 +28718,9 @@
         </w:tc>
       </w:tr>
     </w:tbl>
+    <w:p>
+      <w:pPr/>
+    </w:p>
     <w:p>
       <w:bookmarkStart w:id="239877516" w:name="_Toc239877516"/>
       <w:pPr>

</xml_diff>

<commit_message>
fix: clarify regulation outline table
</commit_message>
<xml_diff>
--- a/regulamin/Regulamin-powolywania-reprezentacji-Polski-weteranów-w-szermierce_2026.docx
+++ b/regulamin/Regulamin-powolywania-reprezentacji-Polski-weteranów-w-szermierce_2026.docx
@@ -980,13 +980,14 @@
     </w:p>
     <w:p>
       <w:r>
-        <w:t>Układ odzwierciedla strukturę ZTP. Treść ciemnoszara i jawnie oznaczona jest brudnopisem wymagającym decyzji.</w:t>
+        <w:t>Treść dokumentu podzielono następująco:</w:t>
       </w:r>
     </w:p>
     <w:tbl>
       <w:tblPr>
         <w:tblW w:type="auto" w:w="0"/>
         <w:jc w:val="center"/>
+        <w:tblLayout w:type="fixed"/>
         <w:tblLook w:firstColumn="1" w:firstRow="1" w:lastColumn="0" w:lastRow="0" w:noHBand="0" w:noVBand="1" w:val="04A0"/>
         <w:tblBorders>
           <w:top w:val="single" w:sz="4" w:color="CDD4DE"/>
@@ -998,9 +999,9 @@
         </w:tblBorders>
       </w:tblPr>
       <w:tblGrid>
-        <w:gridCol w:w="3024"/>
-        <w:gridCol w:w="3024"/>
-        <w:gridCol w:w="3024"/>
+        <w:gridCol w:w="1020"/>
+        <w:gridCol w:w="2948"/>
+        <w:gridCol w:w="5102"/>
       </w:tblGrid>
       <w:tr>
         <w:trPr>
@@ -1009,7 +1010,7 @@
         </w:trPr>
         <w:tc>
           <w:tcPr>
-            <w:tcW w:type="dxa" w:w="3024"/>
+            <w:tcW w:type="dxa" w:w="1020"/>
             <w:shd w:fill="174A84"/>
             <w:tcMar>
               <w:top w:w="110" w:type="dxa"/>
@@ -1036,7 +1037,7 @@
         </w:tc>
         <w:tc>
           <w:tcPr>
-            <w:tcW w:type="dxa" w:w="3024"/>
+            <w:tcW w:type="dxa" w:w="2948"/>
             <w:shd w:fill="174A84"/>
             <w:tcMar>
               <w:top w:w="110" w:type="dxa"/>
@@ -1063,7 +1064,7 @@
         </w:tc>
         <w:tc>
           <w:tcPr>
-            <w:tcW w:type="dxa" w:w="3024"/>
+            <w:tcW w:type="dxa" w:w="5102"/>
             <w:shd w:fill="174A84"/>
             <w:tcMar>
               <w:top w:w="110" w:type="dxa"/>
@@ -1084,7 +1085,7 @@
                 <w:color w:val="FFFFFF"/>
                 <w:sz w:val="18"/>
               </w:rPr>
-              <w:t>Zakres roboczy</w:t>
+              <w:t>Zakres</w:t>
             </w:r>
           </w:p>
         </w:tc>
@@ -1095,7 +1096,7 @@
         </w:trPr>
         <w:tc>
           <w:tcPr>
-            <w:tcW w:type="dxa" w:w="3024"/>
+            <w:tcW w:type="dxa" w:w="1020"/>
             <w:tcMar>
               <w:top w:w="110" w:type="dxa"/>
               <w:left w:w="130" w:type="dxa"/>
@@ -1120,7 +1121,7 @@
         </w:tc>
         <w:tc>
           <w:tcPr>
-            <w:tcW w:type="dxa" w:w="3024"/>
+            <w:tcW w:type="dxa" w:w="2948"/>
             <w:tcMar>
               <w:top w:w="110" w:type="dxa"/>
               <w:left w:w="130" w:type="dxa"/>
@@ -1144,7 +1145,7 @@
         </w:tc>
         <w:tc>
           <w:tcPr>
-            <w:tcW w:type="dxa" w:w="3024"/>
+            <w:tcW w:type="dxa" w:w="5102"/>
             <w:tcMar>
               <w:top w:w="110" w:type="dxa"/>
               <w:left w:w="130" w:type="dxa"/>
@@ -1173,7 +1174,7 @@
         </w:trPr>
         <w:tc>
           <w:tcPr>
-            <w:tcW w:type="dxa" w:w="3024"/>
+            <w:tcW w:type="dxa" w:w="1020"/>
             <w:tcMar>
               <w:top w:w="110" w:type="dxa"/>
               <w:left w:w="130" w:type="dxa"/>
@@ -1198,7 +1199,7 @@
         </w:tc>
         <w:tc>
           <w:tcPr>
-            <w:tcW w:type="dxa" w:w="3024"/>
+            <w:tcW w:type="dxa" w:w="2948"/>
             <w:tcMar>
               <w:top w:w="110" w:type="dxa"/>
               <w:left w:w="130" w:type="dxa"/>
@@ -1222,7 +1223,7 @@
         </w:tc>
         <w:tc>
           <w:tcPr>
-            <w:tcW w:type="dxa" w:w="3024"/>
+            <w:tcW w:type="dxa" w:w="5102"/>
             <w:tcMar>
               <w:top w:w="110" w:type="dxa"/>
               <w:left w:w="130" w:type="dxa"/>
@@ -1251,7 +1252,7 @@
         </w:trPr>
         <w:tc>
           <w:tcPr>
-            <w:tcW w:type="dxa" w:w="3024"/>
+            <w:tcW w:type="dxa" w:w="1020"/>
             <w:tcMar>
               <w:top w:w="110" w:type="dxa"/>
               <w:left w:w="130" w:type="dxa"/>
@@ -1276,7 +1277,7 @@
         </w:tc>
         <w:tc>
           <w:tcPr>
-            <w:tcW w:type="dxa" w:w="3024"/>
+            <w:tcW w:type="dxa" w:w="2948"/>
             <w:tcMar>
               <w:top w:w="110" w:type="dxa"/>
               <w:left w:w="130" w:type="dxa"/>
@@ -1300,7 +1301,7 @@
         </w:tc>
         <w:tc>
           <w:tcPr>
-            <w:tcW w:type="dxa" w:w="3024"/>
+            <w:tcW w:type="dxa" w:w="5102"/>
             <w:tcMar>
               <w:top w:w="110" w:type="dxa"/>
               <w:left w:w="130" w:type="dxa"/>
@@ -1329,7 +1330,7 @@
         </w:trPr>
         <w:tc>
           <w:tcPr>
-            <w:tcW w:type="dxa" w:w="3024"/>
+            <w:tcW w:type="dxa" w:w="1020"/>
             <w:tcMar>
               <w:top w:w="110" w:type="dxa"/>
               <w:left w:w="130" w:type="dxa"/>
@@ -1354,7 +1355,7 @@
         </w:tc>
         <w:tc>
           <w:tcPr>
-            <w:tcW w:type="dxa" w:w="3024"/>
+            <w:tcW w:type="dxa" w:w="2948"/>
             <w:tcMar>
               <w:top w:w="110" w:type="dxa"/>
               <w:left w:w="130" w:type="dxa"/>
@@ -1378,7 +1379,7 @@
         </w:tc>
         <w:tc>
           <w:tcPr>
-            <w:tcW w:type="dxa" w:w="3024"/>
+            <w:tcW w:type="dxa" w:w="5102"/>
             <w:tcMar>
               <w:top w:w="110" w:type="dxa"/>
               <w:left w:w="130" w:type="dxa"/>
@@ -1407,7 +1408,7 @@
         </w:trPr>
         <w:tc>
           <w:tcPr>
-            <w:tcW w:type="dxa" w:w="3024"/>
+            <w:tcW w:type="dxa" w:w="1020"/>
             <w:tcMar>
               <w:top w:w="110" w:type="dxa"/>
               <w:left w:w="130" w:type="dxa"/>
@@ -1432,7 +1433,7 @@
         </w:tc>
         <w:tc>
           <w:tcPr>
-            <w:tcW w:type="dxa" w:w="3024"/>
+            <w:tcW w:type="dxa" w:w="2948"/>
             <w:tcMar>
               <w:top w:w="110" w:type="dxa"/>
               <w:left w:w="130" w:type="dxa"/>
@@ -1456,7 +1457,7 @@
         </w:tc>
         <w:tc>
           <w:tcPr>
-            <w:tcW w:type="dxa" w:w="3024"/>
+            <w:tcW w:type="dxa" w:w="5102"/>
             <w:tcMar>
               <w:top w:w="110" w:type="dxa"/>
               <w:left w:w="130" w:type="dxa"/>
@@ -1485,7 +1486,7 @@
         </w:trPr>
         <w:tc>
           <w:tcPr>
-            <w:tcW w:type="dxa" w:w="3024"/>
+            <w:tcW w:type="dxa" w:w="1020"/>
             <w:tcMar>
               <w:top w:w="110" w:type="dxa"/>
               <w:left w:w="130" w:type="dxa"/>
@@ -1510,7 +1511,7 @@
         </w:tc>
         <w:tc>
           <w:tcPr>
-            <w:tcW w:type="dxa" w:w="3024"/>
+            <w:tcW w:type="dxa" w:w="2948"/>
             <w:tcMar>
               <w:top w:w="110" w:type="dxa"/>
               <w:left w:w="130" w:type="dxa"/>
@@ -1534,7 +1535,7 @@
         </w:tc>
         <w:tc>
           <w:tcPr>
-            <w:tcW w:type="dxa" w:w="3024"/>
+            <w:tcW w:type="dxa" w:w="5102"/>
             <w:tcMar>
               <w:top w:w="110" w:type="dxa"/>
               <w:left w:w="130" w:type="dxa"/>
@@ -1563,7 +1564,7 @@
         </w:trPr>
         <w:tc>
           <w:tcPr>
-            <w:tcW w:type="dxa" w:w="3024"/>
+            <w:tcW w:type="dxa" w:w="1020"/>
             <w:tcMar>
               <w:top w:w="110" w:type="dxa"/>
               <w:left w:w="130" w:type="dxa"/>
@@ -1588,7 +1589,7 @@
         </w:tc>
         <w:tc>
           <w:tcPr>
-            <w:tcW w:type="dxa" w:w="3024"/>
+            <w:tcW w:type="dxa" w:w="2948"/>
             <w:tcMar>
               <w:top w:w="110" w:type="dxa"/>
               <w:left w:w="130" w:type="dxa"/>
@@ -1612,7 +1613,7 @@
         </w:tc>
         <w:tc>
           <w:tcPr>
-            <w:tcW w:type="dxa" w:w="3024"/>
+            <w:tcW w:type="dxa" w:w="5102"/>
             <w:tcMar>
               <w:top w:w="110" w:type="dxa"/>
               <w:left w:w="130" w:type="dxa"/>

</xml_diff>

<commit_message>
feat: define ranking eligibility rules
</commit_message>
<xml_diff>
--- a/regulamin/Regulamin-powolywania-reprezentacji-Polski-weteranów-w-szermierce_2026.docx
+++ b/regulamin/Regulamin-powolywania-reprezentacji-Polski-weteranów-w-szermierce_2026.docx
@@ -3059,22 +3059,10 @@
     </w:p>
     <w:p>
       <w:pPr>
-        <w:pStyle w:val="Etykietabrudnopisu"/>
-        <w:keepNext/>
-      </w:pPr>
-      <w:r>
-        <w:t>BRUDNOPIS ZE ŹRÓDŁA — DO OPRACOWANIA</w:t>
-      </w:r>
-    </w:p>
-    <w:p>
-      <w:pPr>
         <w:keepLines/>
         <w:ind w:left="85"/>
       </w:pPr>
       <w:r>
-        <w:rPr>
-          <w:color w:val="595959"/>
-        </w:rPr>
         <w:t>Ranking indywidualny oraz kalkulator punktów są publikowane na stronie internetowej.</w:t>
       </w:r>
     </w:p>
@@ -3098,22 +3086,13 @@
     </w:p>
     <w:p>
       <w:pPr>
-        <w:pStyle w:val="Etykietabrudnopisu"/>
-        <w:keepNext/>
+        <w:keepLines/>
+        <w:ind w:left="312" w:hanging="227"/>
       </w:pPr>
       <w:r>
-        <w:t>BRUDNOPIS ZE ŹRÓDŁA — DO OPRACOWANIA</w:t>
+        <w:t xml:space="preserve">1. </w:t>
       </w:r>
-    </w:p>
-    <w:p>
-      <w:pPr>
-        <w:keepLines/>
-        <w:ind w:left="85"/>
-      </w:pPr>
       <w:r>
-        <w:rPr>
-          <w:color w:val="595959"/>
-        </w:rPr>
         <w:t>W przypadku zawodów rozgrywanych w połączonych kategoriach wiekowych wyniki przypisuje się zgodnie z zajętym miejscem, bez dodatkowego rozdzielania kategorii w celu obliczenia punktów rankingowych.</w:t>
       </w:r>
     </w:p>
@@ -3137,23 +3116,36 @@
     </w:p>
     <w:p>
       <w:pPr>
-        <w:pStyle w:val="Etykietabrudnopisu"/>
-        <w:keepNext/>
+        <w:keepLines/>
+        <w:ind w:left="312" w:hanging="227"/>
       </w:pPr>
       <w:r>
-        <w:t>BRUDNOPIS ZE ŹRÓDŁA — DO OPRACOWANIA</w:t>
+        <w:t xml:space="preserve">1. </w:t>
+      </w:r>
+      <w:r>
+        <w:t>W rankingu indywidualnym uwzględnia się wyłącznie weteranów szermierki, którzy co najmniej raz wystartowali w zawodach Pucharu Polski Weteranów w Szermierce albo Mistrzostwach Polski Weteranów w Szermierce.</w:t>
       </w:r>
     </w:p>
     <w:p>
       <w:pPr>
-        <w:keepLines/>
-        <w:ind w:left="85"/>
+        <w:ind w:left="312" w:hanging="227"/>
       </w:pPr>
       <w:r>
-        <w:rPr>
-          <w:color w:val="595959"/>
-        </w:rPr>
-        <w:t>W rankingu uwzględnia się zawodników posiadających polskie obywatelstwo albo kartę pobytu. Warunkiem zaliczenia punktów z zawodów organizowanych przez EVF albo FIE jest start jako reprezentant Polski.</w:t>
+        <w:t xml:space="preserve">2. </w:t>
+      </w:r>
+      <w:r>
+        <w:t>Przy ustalaniu kolejności zawodników do powołania do reprezentacji Polski uwzględnia się wyłącznie zawodników posiadających polskie obywatelstwo albo kartę pobytu.</w:t>
+      </w:r>
+    </w:p>
+    <w:p>
+      <w:pPr>
+        <w:ind w:left="312" w:hanging="227"/>
+      </w:pPr>
+      <w:r>
+        <w:t xml:space="preserve">3. </w:t>
+      </w:r>
+      <w:r>
+        <w:t>Punkty uzyskane w zawodach organizowanych przez EVF albo FIE uwzględnia się wyłącznie, jeżeli zawodnik wystąpił w tych zawodach jako reprezentant Polski.</w:t>
       </w:r>
     </w:p>
     <w:p>

</xml_diff>

<commit_message>
feat: add nomination timeline and editable DOCX tables
</commit_message>
<xml_diff>
--- a/regulamin/Regulamin-powolywania-reprezentacji-Polski-weteranów-w-szermierce_2026.docx
+++ b/regulamin/Regulamin-powolywania-reprezentacji-Polski-weteranów-w-szermierce_2026.docx
@@ -1475,7 +1475,7 @@
                 <w:color w:val="667386"/>
                 <w:sz w:val="18"/>
               </w:rPr>
-              <w:t>zamknięcie danych, deklaracje i ogłoszenie nominacji</w:t>
+              <w:t>terminy, deklaracje, odpowiedzialność, korekty danych i dokumentacja powołań</w:t>
             </w:r>
           </w:p>
         </w:tc>
@@ -3614,24 +3614,1374 @@
     </w:p>
     <w:p>
       <w:pPr>
-        <w:pStyle w:val="Etykietabrudnopisu"/>
-        <w:keepNext/>
+        <w:keepLines/>
+        <w:ind w:left="312" w:hanging="227"/>
       </w:pPr>
       <w:r>
-        <w:t>MIEJSCE DO UZUPEŁNIENIA — WYMAGA DECYZJI</w:t>
+        <w:t xml:space="preserve">1. </w:t>
+      </w:r>
+      <w:r>
+        <w:t>Terminy procesu powoływania reprezentacji Polski liczy się w dniach kalendarzowych wstecz od pierwszego dnia zawodów, oznaczonego jako T. SPWS ogłasza na początku sezonu kalendarz procesu, w tym daty zamknięcia danych rankingowych, składania deklaracji gotowości, weryfikacji warunków i ogłoszenia nominacji.</w:t>
       </w:r>
     </w:p>
     <w:p>
       <w:pPr>
-        <w:keepLines/>
-        <w:ind w:left="85"/>
+        <w:ind w:left="312" w:hanging="227"/>
       </w:pPr>
       <w:r>
-        <w:rPr>
-          <w:color w:val="595959"/>
-        </w:rPr>
-        <w:t>Terminy zamknięcia danych rankingowych, składania deklaracji, weryfikacji warunków oraz ogłoszenia nominacji wymagają odrębnej decyzji.</w:t>
+        <w:t xml:space="preserve">2. </w:t>
       </w:r>
+      <w:r>
+        <w:t>Na 90 dni przed pierwszym dniem zawodów (T−90) SPWS otwiera proces powoływania, zamyka dane wynikowe wykorzystywane w tym cyklu, ogłasza zasady postępowania i wzywa zawodników do składania deklaracji gotowości. Wyniki uzyskane po tym dniu nie wpływają na kolejność kandydatów w tym cyklu, z zastrzeżeniem zasad ustalania ostatecznego składu drużyny na Mistrzostwa Świata.</w:t>
+      </w:r>
+    </w:p>
+    <w:p>
+      <w:pPr>
+        <w:ind w:left="312" w:hanging="227"/>
+      </w:pPr>
+      <w:r>
+        <w:t xml:space="preserve">3. </w:t>
+      </w:r>
+      <w:r>
+        <w:t>Zawodnik składa deklarację gotowości od T−90 do T−75 włącznie.</w:t>
+      </w:r>
+    </w:p>
+    <w:p>
+      <w:pPr>
+        <w:ind w:left="312" w:hanging="227"/>
+      </w:pPr>
+      <w:r>
+        <w:t xml:space="preserve">4. </w:t>
+      </w:r>
+      <w:r>
+        <w:t>Najpóźniej na 75 dni przed pierwszym dniem zawodów (T−75) SPWS udostępnia zawodnikom i ich trenerom projekty kart zawodników. Karta przedstawia wyniki przyjęte do oceny oraz podstawę proponowanej kolejności. Od T−75 do T−60 zawodnik może zgłaszać brakujące wyniki uzyskane nie później niż w T−90 oraz błędy w swoich danych.</w:t>
+      </w:r>
+    </w:p>
+    <w:p>
+      <w:pPr>
+        <w:ind w:left="312" w:hanging="227"/>
+      </w:pPr>
+      <w:r>
+        <w:t xml:space="preserve">5. </w:t>
+      </w:r>
+      <w:r>
+        <w:t>Najpóźniej na 60 dni przed pierwszym dniem zawodów (T−60) SPWS przekazuje PZSz uszeregowaną propozycję kandydatów do reprezentacji Polski wraz z kartami, pisemnymi uzasadnieniami oraz propozycją obsadzenia każdej kategorii rozgrywanej w danych zawodach. Przed przekazaniem propozycji SPWS weryfikuje warunki uwzględnienia kandydatów i wprowadza zweryfikowane korekty danych.</w:t>
+      </w:r>
+    </w:p>
+    <w:p>
+      <w:pPr>
+        <w:ind w:left="312" w:hanging="227"/>
+      </w:pPr>
+      <w:r>
+        <w:t xml:space="preserve">6. </w:t>
+      </w:r>
+      <w:r>
+        <w:t>Propozycja przekazywana w T−60 obejmuje kandydatów do reprezentacji na Mistrzostwa Świata. Ostateczny skład drużyny ustala się po zakończeniu rywalizacji indywidualnej podczas tych mistrzostw, na podstawie uzyskanych w niej wyników i zgodnie z zasadami doboru drużyny określonymi w Regulaminie.</w:t>
+      </w:r>
+    </w:p>
+    <w:p>
+      <w:pPr>
+        <w:ind w:left="312" w:hanging="227"/>
+      </w:pPr>
+      <w:r>
+        <w:t xml:space="preserve">7. </w:t>
+      </w:r>
+      <w:r>
+        <w:t>SPWS odpowiada za zebranie i weryfikację wyników, przygotowanie kart zawodników, uszeregowanie kandydatów wraz z pisemnymi uzasadnieniami, rozpatrzenie reklamacji danych oraz przekazanie propozycji PZSz w terminie T−60.</w:t>
+      </w:r>
+    </w:p>
+    <w:p>
+      <w:pPr>
+        <w:ind w:left="312" w:hanging="227"/>
+      </w:pPr>
+      <w:r>
+        <w:t xml:space="preserve">8. </w:t>
+      </w:r>
+      <w:r>
+        <w:t>PZSz dokonuje wyboru i nominacji zawodników oraz zgłoszenia imiennego. W przypadku odstępstwa od kolejności zaproponowanej przez SPWS PZSz podaje pisemnie przyczynę odstępstwa.</w:t>
+      </w:r>
+    </w:p>
+    <w:p>
+      <w:pPr>
+        <w:ind w:left="312" w:hanging="227"/>
+      </w:pPr>
+      <w:r>
+        <w:t xml:space="preserve">9. </w:t>
+      </w:r>
+      <w:r>
+        <w:t>Reklamacja danych dotyczy błędów faktycznych, w szczególności pominięcia wyniku, błędnej pisowni nazwiska albo przypisania wyniku niewłaściwemu zawodnikowi. Korekta danych nie oznacza dopuszczenia wyników uzyskanych po T−90. Zweryfikowaną korektę wprowadza się do karty przed przekazaniem propozycji PZSz w T−60.</w:t>
+      </w:r>
+    </w:p>
+    <w:p>
+      <w:pPr>
+        <w:ind w:left="312" w:hanging="227"/>
+      </w:pPr>
+      <w:r>
+        <w:t xml:space="preserve">10. </w:t>
+      </w:r>
+      <w:r>
+        <w:t>Po T−60 zawodnik może zgłosić zastrzeżenie do oceny lub uzasadnienia dotyczącego jego kandydatury. SPWS odpowiada pisemnie. Zgłoszenie zastrzeżenia nie wstrzymuje dalszego procesu powoływania.</w:t>
+      </w:r>
+    </w:p>
+    <w:p>
+      <w:pPr>
+        <w:ind w:left="312" w:hanging="227"/>
+      </w:pPr>
+      <w:r>
+        <w:t xml:space="preserve">11. </w:t>
+      </w:r>
+      <w:r>
+        <w:t>Reklamacje, zastrzeżenia oraz odpowiedzi udostępnia się zainteresowanemu zawodnikowi i archiwizuje wraz z dokumentacją cyklu.</w:t>
+      </w:r>
+    </w:p>
+    <w:p>
+      <w:pPr>
+        <w:ind w:left="312" w:hanging="227"/>
+      </w:pPr>
+      <w:r>
+        <w:t xml:space="preserve">12. </w:t>
+      </w:r>
+      <w:r>
+        <w:t>SPWS wykorzystuje oficjalne wyniki i protokoły zawodów uwzględnianych w rankingu: PPW i MPW, zawodów PZSz, EVF oraz FIE. Każdy wynik ujęty w karcie zawodnika zawiera odnośnik do publicznego protokołu stanowiącego jego źródło.</w:t>
+      </w:r>
+    </w:p>
+    <w:p>
+      <w:pPr>
+        <w:ind w:left="312" w:hanging="227"/>
+      </w:pPr>
+      <w:r>
+        <w:t xml:space="preserve">13. </w:t>
+      </w:r>
+      <w:r>
+        <w:t>SPWS archiwizuje stan danych z T−90, późniejsze korekty wraz z ich uzasadnieniem oraz ostateczną wersję propozycji przekazaną PZSz. Dokumentacja obejmuje karty zawodników, deklaracje gotowości, uzasadnienia, reklamacje, zastrzeżenia i odpowiedzi oraz pozwala odtworzyć podstawę przekazanej propozycji. Dokumentację ostatecznego wyboru drużyny na Mistrzostwa Świata uzupełnia się po zakończeniu rywalizacji indywidualnej.</w:t>
+      </w:r>
+    </w:p>
+    <w:tbl>
+      <w:tblPr>
+        <w:tblStyle w:val="TableGrid"/>
+        <w:tblW w:type="auto" w:w="0"/>
+        <w:jc w:val="center"/>
+        <w:tblLayout w:type="fixed"/>
+        <w:tblLook w:firstColumn="1" w:firstRow="1" w:lastColumn="0" w:lastRow="0" w:noHBand="0" w:noVBand="1" w:val="04A0"/>
+      </w:tblPr>
+      <w:tblGrid>
+        <w:gridCol w:w="2268"/>
+        <w:gridCol w:w="2268"/>
+        <w:gridCol w:w="2268"/>
+        <w:gridCol w:w="2268"/>
+      </w:tblGrid>
+      <w:tr>
+        <w:trPr>
+          <w:tblHeader w:val="true"/>
+          <w:cantSplit/>
+        </w:trPr>
+        <w:tc>
+          <w:tcPr>
+            <w:tcW w:type="dxa" w:w="2268"/>
+            <w:vAlign w:val="center"/>
+            <w:shd w:fill="173F73"/>
+          </w:tcPr>
+          <w:p>
+            <w:pPr>
+              <w:keepNext/>
+              <w:spacing w:after="60"/>
+              <w:jc w:val="center"/>
+            </w:pPr>
+            <w:r>
+              <w:rPr>
+                <w:b/>
+                <w:color w:val="FFFFFF"/>
+                <w:sz w:val="18"/>
+              </w:rPr>
+              <w:t>T−90</w:t>
+            </w:r>
+          </w:p>
+        </w:tc>
+        <w:tc>
+          <w:tcPr>
+            <w:tcW w:type="dxa" w:w="2268"/>
+            <w:vAlign w:val="center"/>
+            <w:shd w:fill="875600"/>
+          </w:tcPr>
+          <w:p>
+            <w:pPr>
+              <w:keepNext/>
+              <w:spacing w:after="60"/>
+              <w:jc w:val="center"/>
+            </w:pPr>
+            <w:r>
+              <w:rPr>
+                <w:b/>
+                <w:color w:val="FFFFFF"/>
+                <w:sz w:val="18"/>
+              </w:rPr>
+              <w:t>T−75</w:t>
+            </w:r>
+          </w:p>
+        </w:tc>
+        <w:tc>
+          <w:tcPr>
+            <w:tcW w:type="dxa" w:w="2268"/>
+            <w:vAlign w:val="center"/>
+            <w:shd w:fill="176342"/>
+          </w:tcPr>
+          <w:p>
+            <w:pPr>
+              <w:keepNext/>
+              <w:spacing w:after="60"/>
+              <w:jc w:val="center"/>
+            </w:pPr>
+            <w:r>
+              <w:rPr>
+                <w:b/>
+                <w:color w:val="FFFFFF"/>
+                <w:sz w:val="18"/>
+              </w:rPr>
+              <w:t>T−60</w:t>
+            </w:r>
+          </w:p>
+        </w:tc>
+        <w:tc>
+          <w:tcPr>
+            <w:tcW w:type="dxa" w:w="2268"/>
+            <w:vAlign w:val="center"/>
+            <w:shd w:fill="455468"/>
+          </w:tcPr>
+          <w:p>
+            <w:pPr>
+              <w:keepNext/>
+              <w:spacing w:after="60"/>
+              <w:jc w:val="center"/>
+            </w:pPr>
+            <w:r>
+              <w:rPr>
+                <w:b/>
+                <w:color w:val="FFFFFF"/>
+                <w:sz w:val="18"/>
+              </w:rPr>
+              <w:t>T</w:t>
+            </w:r>
+          </w:p>
+        </w:tc>
+      </w:tr>
+      <w:tr>
+        <w:trPr>
+          <w:cantSplit/>
+        </w:trPr>
+        <w:tc>
+          <w:tcPr>
+            <w:tcW w:type="dxa" w:w="2268"/>
+            <w:vAlign w:val="center"/>
+            <w:shd w:fill="EAF2FB"/>
+          </w:tcPr>
+          <w:p>
+            <w:pPr>
+              <w:keepNext/>
+              <w:spacing w:after="60"/>
+              <w:jc w:val="center"/>
+            </w:pPr>
+            <w:r>
+              <w:rPr>
+                <w:b/>
+                <w:sz w:val="18"/>
+              </w:rPr>
+              <w:t>Otwarcie procesu</w:t>
+            </w:r>
+          </w:p>
+        </w:tc>
+        <w:tc>
+          <w:tcPr>
+            <w:tcW w:type="dxa" w:w="2268"/>
+            <w:vAlign w:val="center"/>
+            <w:shd w:fill="EAF2FB"/>
+          </w:tcPr>
+          <w:p>
+            <w:pPr>
+              <w:keepNext/>
+              <w:spacing w:after="60"/>
+              <w:jc w:val="center"/>
+            </w:pPr>
+            <w:r>
+              <w:rPr>
+                <w:b/>
+                <w:sz w:val="18"/>
+              </w:rPr>
+              <w:t>Karty zawodników</w:t>
+            </w:r>
+          </w:p>
+        </w:tc>
+        <w:tc>
+          <w:tcPr>
+            <w:tcW w:type="dxa" w:w="2268"/>
+            <w:vAlign w:val="center"/>
+            <w:shd w:fill="EAF2FB"/>
+          </w:tcPr>
+          <w:p>
+            <w:pPr>
+              <w:keepNext/>
+              <w:spacing w:after="60"/>
+              <w:jc w:val="center"/>
+            </w:pPr>
+            <w:r>
+              <w:rPr>
+                <w:b/>
+                <w:sz w:val="18"/>
+              </w:rPr>
+              <w:t>Propozycja do PZSz</w:t>
+            </w:r>
+          </w:p>
+        </w:tc>
+        <w:tc>
+          <w:tcPr>
+            <w:tcW w:type="dxa" w:w="2268"/>
+            <w:vAlign w:val="center"/>
+            <w:shd w:fill="EAF2FB"/>
+          </w:tcPr>
+          <w:p>
+            <w:pPr>
+              <w:keepNext/>
+              <w:spacing w:after="60"/>
+              <w:jc w:val="center"/>
+            </w:pPr>
+            <w:r>
+              <w:rPr>
+                <w:b/>
+                <w:sz w:val="18"/>
+              </w:rPr>
+              <w:t>Początek zawodów</w:t>
+            </w:r>
+          </w:p>
+        </w:tc>
+      </w:tr>
+      <w:tr>
+        <w:trPr>
+          <w:cantSplit/>
+        </w:trPr>
+        <w:tc>
+          <w:tcPr>
+            <w:tcW w:type="dxa" w:w="2268"/>
+            <w:vAlign w:val="center"/>
+            <w:shd w:fill="EAF2FB"/>
+          </w:tcPr>
+          <w:p>
+            <w:pPr>
+              <w:keepNext w:val="0"/>
+              <w:spacing w:after="60"/>
+              <w:jc w:val="center"/>
+            </w:pPr>
+            <w:r>
+              <w:rPr>
+                <w:b w:val="0"/>
+                <w:sz w:val="18"/>
+              </w:rPr>
+              <w:t>Zamknięcie danych i otwarcie deklaracji</w:t>
+            </w:r>
+          </w:p>
+        </w:tc>
+        <w:tc>
+          <w:tcPr>
+            <w:tcW w:type="dxa" w:w="2268"/>
+            <w:vAlign w:val="center"/>
+            <w:shd w:fill="EAF2FB"/>
+          </w:tcPr>
+          <w:p>
+            <w:pPr>
+              <w:keepNext w:val="0"/>
+              <w:spacing w:after="60"/>
+              <w:jc w:val="center"/>
+            </w:pPr>
+            <w:r>
+              <w:rPr>
+                <w:b w:val="0"/>
+                <w:sz w:val="18"/>
+              </w:rPr>
+              <w:t>Koniec deklaracji; początek reklamacji</w:t>
+            </w:r>
+          </w:p>
+        </w:tc>
+        <w:tc>
+          <w:tcPr>
+            <w:tcW w:type="dxa" w:w="2268"/>
+            <w:vAlign w:val="center"/>
+            <w:shd w:fill="EAF2FB"/>
+          </w:tcPr>
+          <w:p>
+            <w:pPr>
+              <w:keepNext w:val="0"/>
+              <w:spacing w:after="60"/>
+              <w:jc w:val="center"/>
+            </w:pPr>
+            <w:r>
+              <w:rPr>
+                <w:b w:val="0"/>
+                <w:sz w:val="18"/>
+              </w:rPr>
+              <w:t>Kandydaci, poprawione karty i uzasadnienia</w:t>
+            </w:r>
+          </w:p>
+        </w:tc>
+        <w:tc>
+          <w:tcPr>
+            <w:tcW w:type="dxa" w:w="2268"/>
+            <w:vAlign w:val="center"/>
+            <w:shd w:fill="EAF2FB"/>
+          </w:tcPr>
+          <w:p>
+            <w:pPr>
+              <w:keepNext w:val="0"/>
+              <w:spacing w:after="60"/>
+              <w:jc w:val="center"/>
+            </w:pPr>
+            <w:r>
+              <w:rPr>
+                <w:b w:val="0"/>
+                <w:sz w:val="18"/>
+              </w:rPr>
+              <w:t>Na MŚ skład drużyny ustala się po rywalizacji indywidualnej</w:t>
+            </w:r>
+          </w:p>
+        </w:tc>
+      </w:tr>
+    </w:tbl>
+    <w:p>
+      <w:pPr/>
+    </w:p>
+    <w:tbl>
+      <w:tblPr>
+        <w:tblStyle w:val="TableGrid"/>
+        <w:tblW w:type="auto" w:w="0"/>
+        <w:jc w:val="center"/>
+        <w:tblLayout w:type="fixed"/>
+        <w:tblLook w:firstColumn="1" w:firstRow="1" w:lastColumn="0" w:lastRow="0" w:noHBand="0" w:noVBand="1" w:val="04A0"/>
+      </w:tblPr>
+      <w:tblGrid>
+        <w:gridCol w:w="3024"/>
+        <w:gridCol w:w="3024"/>
+        <w:gridCol w:w="3024"/>
+      </w:tblGrid>
+      <w:tr>
+        <w:trPr>
+          <w:tblHeader w:val="true"/>
+          <w:cantSplit/>
+        </w:trPr>
+        <w:tc>
+          <w:tcPr>
+            <w:tcW w:type="dxa" w:w="3024"/>
+            <w:vAlign w:val="center"/>
+            <w:shd w:fill="173F73"/>
+          </w:tcPr>
+          <w:p>
+            <w:pPr>
+              <w:keepNext/>
+              <w:spacing w:after="60"/>
+            </w:pPr>
+            <w:r>
+              <w:rPr>
+                <w:b/>
+                <w:color w:val="FFFFFF"/>
+                <w:sz w:val="18"/>
+              </w:rPr>
+              <w:t>Termin</w:t>
+            </w:r>
+          </w:p>
+        </w:tc>
+        <w:tc>
+          <w:tcPr>
+            <w:tcW w:type="dxa" w:w="3024"/>
+            <w:vAlign w:val="center"/>
+            <w:shd w:fill="173F73"/>
+          </w:tcPr>
+          <w:p>
+            <w:pPr>
+              <w:keepNext/>
+              <w:spacing w:after="60"/>
+            </w:pPr>
+            <w:r>
+              <w:rPr>
+                <w:b/>
+                <w:color w:val="FFFFFF"/>
+                <w:sz w:val="18"/>
+              </w:rPr>
+              <w:t>Zdarzenie</w:t>
+            </w:r>
+          </w:p>
+        </w:tc>
+        <w:tc>
+          <w:tcPr>
+            <w:tcW w:type="dxa" w:w="3024"/>
+            <w:vAlign w:val="center"/>
+            <w:shd w:fill="173F73"/>
+          </w:tcPr>
+          <w:p>
+            <w:pPr>
+              <w:keepNext/>
+              <w:spacing w:after="60"/>
+            </w:pPr>
+            <w:r>
+              <w:rPr>
+                <w:b/>
+                <w:color w:val="FFFFFF"/>
+                <w:sz w:val="18"/>
+              </w:rPr>
+              <w:t>Zakres</w:t>
+            </w:r>
+          </w:p>
+        </w:tc>
+      </w:tr>
+      <w:tr>
+        <w:trPr>
+          <w:cantSplit/>
+        </w:trPr>
+        <w:tc>
+          <w:tcPr>
+            <w:tcW w:type="dxa" w:w="3024"/>
+            <w:vAlign w:val="center"/>
+          </w:tcPr>
+          <w:p>
+            <w:pPr>
+              <w:keepNext/>
+              <w:spacing w:after="60"/>
+            </w:pPr>
+            <w:r>
+              <w:rPr>
+                <w:b w:val="0"/>
+                <w:sz w:val="18"/>
+              </w:rPr>
+              <w:t>T−90</w:t>
+            </w:r>
+          </w:p>
+        </w:tc>
+        <w:tc>
+          <w:tcPr>
+            <w:tcW w:type="dxa" w:w="3024"/>
+            <w:vAlign w:val="center"/>
+          </w:tcPr>
+          <w:p>
+            <w:pPr>
+              <w:keepNext/>
+              <w:spacing w:after="60"/>
+            </w:pPr>
+            <w:r>
+              <w:rPr>
+                <w:b w:val="0"/>
+                <w:sz w:val="18"/>
+              </w:rPr>
+              <w:t>Otwarcie procesu</w:t>
+            </w:r>
+          </w:p>
+        </w:tc>
+        <w:tc>
+          <w:tcPr>
+            <w:tcW w:type="dxa" w:w="3024"/>
+            <w:vAlign w:val="center"/>
+          </w:tcPr>
+          <w:p>
+            <w:pPr>
+              <w:keepNext/>
+              <w:spacing w:after="60"/>
+            </w:pPr>
+            <w:r>
+              <w:rPr>
+                <w:b w:val="0"/>
+                <w:sz w:val="18"/>
+              </w:rPr>
+              <w:t>SPWS zamyka dane i wzywa do deklaracji. Późniejsze wyniki nie zmieniają kolejności kandydatów; wyjątek dotyczy wyboru drużyny na MŚ po rywalizacji indywidualnej.</w:t>
+            </w:r>
+          </w:p>
+        </w:tc>
+      </w:tr>
+      <w:tr>
+        <w:trPr>
+          <w:cantSplit/>
+        </w:trPr>
+        <w:tc>
+          <w:tcPr>
+            <w:tcW w:type="dxa" w:w="3024"/>
+            <w:vAlign w:val="center"/>
+            <w:shd w:fill="EAF2FB"/>
+          </w:tcPr>
+          <w:p>
+            <w:pPr>
+              <w:keepNext/>
+              <w:spacing w:after="60"/>
+            </w:pPr>
+            <w:r>
+              <w:rPr>
+                <w:b w:val="0"/>
+                <w:sz w:val="18"/>
+              </w:rPr>
+              <w:t>T−90 → T−75</w:t>
+            </w:r>
+          </w:p>
+        </w:tc>
+        <w:tc>
+          <w:tcPr>
+            <w:tcW w:type="dxa" w:w="3024"/>
+            <w:vAlign w:val="center"/>
+            <w:shd w:fill="EAF2FB"/>
+          </w:tcPr>
+          <w:p>
+            <w:pPr>
+              <w:keepNext/>
+              <w:spacing w:after="60"/>
+            </w:pPr>
+            <w:r>
+              <w:rPr>
+                <w:b w:val="0"/>
+                <w:sz w:val="18"/>
+              </w:rPr>
+              <w:t>Deklaracje</w:t>
+            </w:r>
+          </w:p>
+        </w:tc>
+        <w:tc>
+          <w:tcPr>
+            <w:tcW w:type="dxa" w:w="3024"/>
+            <w:vAlign w:val="center"/>
+            <w:shd w:fill="EAF2FB"/>
+          </w:tcPr>
+          <w:p>
+            <w:pPr>
+              <w:keepNext/>
+              <w:spacing w:after="60"/>
+            </w:pPr>
+            <w:r>
+              <w:rPr>
+                <w:b w:val="0"/>
+                <w:sz w:val="18"/>
+              </w:rPr>
+              <w:t>Zawodnik deklaruje gotowość do T−75 włącznie.</w:t>
+            </w:r>
+          </w:p>
+        </w:tc>
+      </w:tr>
+      <w:tr>
+        <w:trPr>
+          <w:cantSplit/>
+        </w:trPr>
+        <w:tc>
+          <w:tcPr>
+            <w:tcW w:type="dxa" w:w="3024"/>
+            <w:vAlign w:val="center"/>
+          </w:tcPr>
+          <w:p>
+            <w:pPr>
+              <w:keepNext/>
+              <w:spacing w:after="60"/>
+            </w:pPr>
+            <w:r>
+              <w:rPr>
+                <w:b w:val="0"/>
+                <w:sz w:val="18"/>
+              </w:rPr>
+              <w:t>T−75 → T−60</w:t>
+            </w:r>
+          </w:p>
+        </w:tc>
+        <w:tc>
+          <w:tcPr>
+            <w:tcW w:type="dxa" w:w="3024"/>
+            <w:vAlign w:val="center"/>
+          </w:tcPr>
+          <w:p>
+            <w:pPr>
+              <w:keepNext/>
+              <w:spacing w:after="60"/>
+            </w:pPr>
+            <w:r>
+              <w:rPr>
+                <w:b w:val="0"/>
+                <w:sz w:val="18"/>
+              </w:rPr>
+              <w:t>Karty i reklamacje</w:t>
+            </w:r>
+          </w:p>
+        </w:tc>
+        <w:tc>
+          <w:tcPr>
+            <w:tcW w:type="dxa" w:w="3024"/>
+            <w:vAlign w:val="center"/>
+          </w:tcPr>
+          <w:p>
+            <w:pPr>
+              <w:keepNext/>
+              <w:spacing w:after="60"/>
+            </w:pPr>
+            <w:r>
+              <w:rPr>
+                <w:b w:val="0"/>
+                <w:sz w:val="18"/>
+              </w:rPr>
+              <w:t>Karty są udostępnione najpóźniej w T−75. Zawodnik zgłasza błędy i brakujące wyniki sprzed zamknięcia danych. Zweryfikowane korekty wchodzą przed przekazaniem propozycji.</w:t>
+            </w:r>
+          </w:p>
+        </w:tc>
+      </w:tr>
+      <w:tr>
+        <w:trPr>
+          <w:cantSplit/>
+        </w:trPr>
+        <w:tc>
+          <w:tcPr>
+            <w:tcW w:type="dxa" w:w="3024"/>
+            <w:vAlign w:val="center"/>
+            <w:shd w:fill="EAF2FB"/>
+          </w:tcPr>
+          <w:p>
+            <w:pPr>
+              <w:keepNext/>
+              <w:spacing w:after="60"/>
+            </w:pPr>
+            <w:r>
+              <w:rPr>
+                <w:b w:val="0"/>
+                <w:sz w:val="18"/>
+              </w:rPr>
+              <w:t>T−60</w:t>
+            </w:r>
+          </w:p>
+        </w:tc>
+        <w:tc>
+          <w:tcPr>
+            <w:tcW w:type="dxa" w:w="3024"/>
+            <w:vAlign w:val="center"/>
+            <w:shd w:fill="EAF2FB"/>
+          </w:tcPr>
+          <w:p>
+            <w:pPr>
+              <w:keepNext/>
+              <w:spacing w:after="60"/>
+            </w:pPr>
+            <w:r>
+              <w:rPr>
+                <w:b w:val="0"/>
+                <w:sz w:val="18"/>
+              </w:rPr>
+              <w:t>Propozycja do PZSz</w:t>
+            </w:r>
+          </w:p>
+        </w:tc>
+        <w:tc>
+          <w:tcPr>
+            <w:tcW w:type="dxa" w:w="3024"/>
+            <w:vAlign w:val="center"/>
+            <w:shd w:fill="EAF2FB"/>
+          </w:tcPr>
+          <w:p>
+            <w:pPr>
+              <w:keepNext/>
+              <w:spacing w:after="60"/>
+            </w:pPr>
+            <w:r>
+              <w:rPr>
+                <w:b w:val="0"/>
+                <w:sz w:val="18"/>
+              </w:rPr>
+              <w:t>SPWS przekazuje kolejność kandydatów, uzasadnienia i propozycję obsadzenia kategorii rozgrywanych w danych zawodach.</w:t>
+            </w:r>
+          </w:p>
+        </w:tc>
+      </w:tr>
+      <w:tr>
+        <w:trPr>
+          <w:cantSplit/>
+        </w:trPr>
+        <w:tc>
+          <w:tcPr>
+            <w:tcW w:type="dxa" w:w="3024"/>
+            <w:vAlign w:val="center"/>
+          </w:tcPr>
+          <w:p>
+            <w:pPr>
+              <w:keepNext w:val="0"/>
+              <w:spacing w:after="60"/>
+            </w:pPr>
+            <w:r>
+              <w:rPr>
+                <w:b w:val="0"/>
+                <w:sz w:val="18"/>
+              </w:rPr>
+              <w:t>Po T−60</w:t>
+            </w:r>
+          </w:p>
+        </w:tc>
+        <w:tc>
+          <w:tcPr>
+            <w:tcW w:type="dxa" w:w="3024"/>
+            <w:vAlign w:val="center"/>
+          </w:tcPr>
+          <w:p>
+            <w:pPr>
+              <w:keepNext w:val="0"/>
+              <w:spacing w:after="60"/>
+            </w:pPr>
+            <w:r>
+              <w:rPr>
+                <w:b w:val="0"/>
+                <w:sz w:val="18"/>
+              </w:rPr>
+              <w:t>Zastrzeżenia do oceny</w:t>
+            </w:r>
+          </w:p>
+        </w:tc>
+        <w:tc>
+          <w:tcPr>
+            <w:tcW w:type="dxa" w:w="3024"/>
+            <w:vAlign w:val="center"/>
+          </w:tcPr>
+          <w:p>
+            <w:pPr>
+              <w:keepNext w:val="0"/>
+              <w:spacing w:after="60"/>
+            </w:pPr>
+            <w:r>
+              <w:rPr>
+                <w:b w:val="0"/>
+                <w:sz w:val="18"/>
+              </w:rPr>
+              <w:t>SPWS odpowiada pisemnie; zastrzeżenie nie wstrzymuje dalszego procesu.</w:t>
+            </w:r>
+          </w:p>
+        </w:tc>
+      </w:tr>
+    </w:tbl>
+    <w:p>
+      <w:pPr/>
+    </w:p>
+    <w:tbl>
+      <w:tblPr>
+        <w:tblStyle w:val="TableGrid"/>
+        <w:tblW w:type="auto" w:w="0"/>
+        <w:jc w:val="center"/>
+        <w:tblLayout w:type="fixed"/>
+        <w:tblLook w:firstColumn="1" w:firstRow="1" w:lastColumn="0" w:lastRow="0" w:noHBand="0" w:noVBand="1" w:val="04A0"/>
+      </w:tblPr>
+      <w:tblGrid>
+        <w:gridCol w:w="4535"/>
+        <w:gridCol w:w="4535"/>
+      </w:tblGrid>
+      <w:tr>
+        <w:trPr>
+          <w:tblHeader w:val="true"/>
+          <w:cantSplit/>
+        </w:trPr>
+        <w:tc>
+          <w:tcPr>
+            <w:tcW w:type="dxa" w:w="4535"/>
+            <w:vAlign w:val="center"/>
+            <w:shd w:fill="173F73"/>
+          </w:tcPr>
+          <w:p>
+            <w:pPr>
+              <w:keepNext/>
+              <w:spacing w:after="60"/>
+            </w:pPr>
+            <w:r>
+              <w:rPr>
+                <w:b/>
+                <w:color w:val="FFFFFF"/>
+                <w:sz w:val="18"/>
+              </w:rPr>
+              <w:t>Kto</w:t>
+            </w:r>
+          </w:p>
+        </w:tc>
+        <w:tc>
+          <w:tcPr>
+            <w:tcW w:type="dxa" w:w="4535"/>
+            <w:vAlign w:val="center"/>
+            <w:shd w:fill="173F73"/>
+          </w:tcPr>
+          <w:p>
+            <w:pPr>
+              <w:keepNext/>
+              <w:spacing w:after="60"/>
+            </w:pPr>
+            <w:r>
+              <w:rPr>
+                <w:b/>
+                <w:color w:val="FFFFFF"/>
+                <w:sz w:val="18"/>
+              </w:rPr>
+              <w:t>Odpowiedzialność</w:t>
+            </w:r>
+          </w:p>
+        </w:tc>
+      </w:tr>
+      <w:tr>
+        <w:trPr>
+          <w:cantSplit/>
+        </w:trPr>
+        <w:tc>
+          <w:tcPr>
+            <w:tcW w:type="dxa" w:w="4535"/>
+            <w:vAlign w:val="center"/>
+          </w:tcPr>
+          <w:p>
+            <w:pPr>
+              <w:keepNext/>
+              <w:spacing w:after="60"/>
+            </w:pPr>
+            <w:r>
+              <w:rPr>
+                <w:b w:val="0"/>
+                <w:sz w:val="18"/>
+              </w:rPr>
+              <w:t>SPWS</w:t>
+            </w:r>
+          </w:p>
+        </w:tc>
+        <w:tc>
+          <w:tcPr>
+            <w:tcW w:type="dxa" w:w="4535"/>
+            <w:vAlign w:val="center"/>
+          </w:tcPr>
+          <w:p>
+            <w:pPr>
+              <w:keepNext/>
+              <w:spacing w:after="60"/>
+            </w:pPr>
+            <w:r>
+              <w:rPr>
+                <w:b w:val="0"/>
+                <w:sz w:val="18"/>
+              </w:rPr>
+              <w:t>Wyniki, weryfikacja warunków, karty, kolejność kandydatów, uzasadnienia, reklamacje oraz propozycja do T−60.</w:t>
+            </w:r>
+          </w:p>
+        </w:tc>
+      </w:tr>
+      <w:tr>
+        <w:trPr>
+          <w:cantSplit/>
+        </w:trPr>
+        <w:tc>
+          <w:tcPr>
+            <w:tcW w:type="dxa" w:w="4535"/>
+            <w:vAlign w:val="center"/>
+            <w:shd w:fill="EAF2FB"/>
+          </w:tcPr>
+          <w:p>
+            <w:pPr>
+              <w:keepNext/>
+              <w:spacing w:after="60"/>
+            </w:pPr>
+            <w:r>
+              <w:rPr>
+                <w:b w:val="0"/>
+                <w:sz w:val="18"/>
+              </w:rPr>
+              <w:t>PZSz</w:t>
+            </w:r>
+          </w:p>
+        </w:tc>
+        <w:tc>
+          <w:tcPr>
+            <w:tcW w:type="dxa" w:w="4535"/>
+            <w:vAlign w:val="center"/>
+            <w:shd w:fill="EAF2FB"/>
+          </w:tcPr>
+          <w:p>
+            <w:pPr>
+              <w:keepNext/>
+              <w:spacing w:after="60"/>
+            </w:pPr>
+            <w:r>
+              <w:rPr>
+                <w:b w:val="0"/>
+                <w:sz w:val="18"/>
+              </w:rPr>
+              <w:t>Wybór, nominacja i zgłoszenie imienne; pisemny powód odstępstwa od zaproponowanej kolejności.</w:t>
+            </w:r>
+          </w:p>
+        </w:tc>
+      </w:tr>
+      <w:tr>
+        <w:trPr>
+          <w:cantSplit/>
+        </w:trPr>
+        <w:tc>
+          <w:tcPr>
+            <w:tcW w:type="dxa" w:w="4535"/>
+            <w:vAlign w:val="center"/>
+          </w:tcPr>
+          <w:p>
+            <w:pPr>
+              <w:keepNext w:val="0"/>
+              <w:spacing w:after="60"/>
+            </w:pPr>
+            <w:r>
+              <w:rPr>
+                <w:b w:val="0"/>
+                <w:sz w:val="18"/>
+              </w:rPr>
+              <w:t>Zawodnik</w:t>
+            </w:r>
+          </w:p>
+        </w:tc>
+        <w:tc>
+          <w:tcPr>
+            <w:tcW w:type="dxa" w:w="4535"/>
+            <w:vAlign w:val="center"/>
+          </w:tcPr>
+          <w:p>
+            <w:pPr>
+              <w:keepNext w:val="0"/>
+              <w:spacing w:after="60"/>
+            </w:pPr>
+            <w:r>
+              <w:rPr>
+                <w:b w:val="0"/>
+                <w:sz w:val="18"/>
+              </w:rPr>
+              <w:t>Deklaracja od T−90 do T−75 włącznie oraz zgłoszenie błędów w oknie reklamacji.</w:t>
+            </w:r>
+          </w:p>
+        </w:tc>
+      </w:tr>
+    </w:tbl>
+    <w:p>
+      <w:pPr/>
+    </w:p>
+    <w:tbl>
+      <w:tblPr>
+        <w:tblStyle w:val="TableGrid"/>
+        <w:tblW w:type="auto" w:w="0"/>
+        <w:jc w:val="center"/>
+        <w:tblLayout w:type="fixed"/>
+        <w:tblLook w:firstColumn="1" w:firstRow="1" w:lastColumn="0" w:lastRow="0" w:noHBand="0" w:noVBand="1" w:val="04A0"/>
+      </w:tblPr>
+      <w:tblGrid>
+        <w:gridCol w:w="3024"/>
+        <w:gridCol w:w="3024"/>
+        <w:gridCol w:w="3024"/>
+      </w:tblGrid>
+      <w:tr>
+        <w:trPr>
+          <w:tblHeader w:val="true"/>
+          <w:cantSplit/>
+        </w:trPr>
+        <w:tc>
+          <w:tcPr>
+            <w:tcW w:type="dxa" w:w="3024"/>
+            <w:vAlign w:val="center"/>
+            <w:shd w:fill="173F73"/>
+          </w:tcPr>
+          <w:p>
+            <w:pPr>
+              <w:keepNext/>
+              <w:spacing w:after="60"/>
+            </w:pPr>
+            <w:r>
+              <w:rPr>
+                <w:b/>
+                <w:color w:val="FFFFFF"/>
+                <w:sz w:val="18"/>
+              </w:rPr>
+              <w:t>Źródło</w:t>
+            </w:r>
+          </w:p>
+        </w:tc>
+        <w:tc>
+          <w:tcPr>
+            <w:tcW w:type="dxa" w:w="3024"/>
+            <w:vAlign w:val="center"/>
+            <w:shd w:fill="173F73"/>
+          </w:tcPr>
+          <w:p>
+            <w:pPr>
+              <w:keepNext/>
+              <w:spacing w:after="60"/>
+            </w:pPr>
+            <w:r>
+              <w:rPr>
+                <w:b/>
+                <w:color w:val="FFFFFF"/>
+                <w:sz w:val="18"/>
+              </w:rPr>
+              <w:t>Dane</w:t>
+            </w:r>
+          </w:p>
+        </w:tc>
+        <w:tc>
+          <w:tcPr>
+            <w:tcW w:type="dxa" w:w="3024"/>
+            <w:vAlign w:val="center"/>
+            <w:shd w:fill="173F73"/>
+          </w:tcPr>
+          <w:p>
+            <w:pPr>
+              <w:keepNext/>
+              <w:spacing w:after="60"/>
+            </w:pPr>
+            <w:r>
+              <w:rPr>
+                <w:b/>
+                <w:color w:val="FFFFFF"/>
+                <w:sz w:val="18"/>
+              </w:rPr>
+              <w:t>Dokumentowanie</w:t>
+            </w:r>
+          </w:p>
+        </w:tc>
+      </w:tr>
+      <w:tr>
+        <w:trPr>
+          <w:cantSplit/>
+        </w:trPr>
+        <w:tc>
+          <w:tcPr>
+            <w:tcW w:type="dxa" w:w="3024"/>
+            <w:vAlign w:val="center"/>
+          </w:tcPr>
+          <w:p>
+            <w:pPr>
+              <w:keepNext/>
+              <w:spacing w:after="60"/>
+            </w:pPr>
+            <w:r>
+              <w:rPr>
+                <w:b w:val="0"/>
+                <w:sz w:val="18"/>
+              </w:rPr>
+              <w:t>SPWS</w:t>
+            </w:r>
+          </w:p>
+        </w:tc>
+        <w:tc>
+          <w:tcPr>
+            <w:tcW w:type="dxa" w:w="3024"/>
+            <w:vAlign w:val="center"/>
+          </w:tcPr>
+          <w:p>
+            <w:pPr>
+              <w:keepNext/>
+              <w:spacing w:after="60"/>
+            </w:pPr>
+            <w:r>
+              <w:rPr>
+                <w:b w:val="0"/>
+                <w:sz w:val="18"/>
+              </w:rPr>
+              <w:t>Wyniki PPW i MPW oraz ranking krajowy</w:t>
+            </w:r>
+          </w:p>
+        </w:tc>
+        <w:tc>
+          <w:tcPr>
+            <w:tcW w:type="dxa" w:w="3024"/>
+            <w:vAlign w:val="center"/>
+          </w:tcPr>
+          <w:p>
+            <w:pPr>
+              <w:keepNext/>
+              <w:spacing w:after="60"/>
+            </w:pPr>
+            <w:r>
+              <w:rPr>
+                <w:b w:val="0"/>
+                <w:sz w:val="18"/>
+              </w:rPr>
+              <w:t>Odnośnik do protokołu źródłowego</w:t>
+            </w:r>
+          </w:p>
+        </w:tc>
+      </w:tr>
+      <w:tr>
+        <w:trPr>
+          <w:cantSplit/>
+        </w:trPr>
+        <w:tc>
+          <w:tcPr>
+            <w:tcW w:type="dxa" w:w="3024"/>
+            <w:vAlign w:val="center"/>
+            <w:shd w:fill="EAF2FB"/>
+          </w:tcPr>
+          <w:p>
+            <w:pPr>
+              <w:keepNext/>
+              <w:spacing w:after="60"/>
+            </w:pPr>
+            <w:r>
+              <w:rPr>
+                <w:b w:val="0"/>
+                <w:sz w:val="18"/>
+              </w:rPr>
+              <w:t>PZSz / organizator</w:t>
+            </w:r>
+          </w:p>
+        </w:tc>
+        <w:tc>
+          <w:tcPr>
+            <w:tcW w:type="dxa" w:w="3024"/>
+            <w:vAlign w:val="center"/>
+            <w:shd w:fill="EAF2FB"/>
+          </w:tcPr>
+          <w:p>
+            <w:pPr>
+              <w:keepNext/>
+              <w:spacing w:after="60"/>
+            </w:pPr>
+            <w:r>
+              <w:rPr>
+                <w:b w:val="0"/>
+                <w:sz w:val="18"/>
+              </w:rPr>
+              <w:t>Wyniki zawodów PZSz uwzględnianych w rankingu</w:t>
+            </w:r>
+          </w:p>
+        </w:tc>
+        <w:tc>
+          <w:tcPr>
+            <w:tcW w:type="dxa" w:w="3024"/>
+            <w:vAlign w:val="center"/>
+            <w:shd w:fill="EAF2FB"/>
+          </w:tcPr>
+          <w:p>
+            <w:pPr>
+              <w:keepNext/>
+              <w:spacing w:after="60"/>
+            </w:pPr>
+            <w:r>
+              <w:rPr>
+                <w:b w:val="0"/>
+                <w:sz w:val="18"/>
+              </w:rPr>
+              <w:t>Odnośnik do protokołu źródłowego</w:t>
+            </w:r>
+          </w:p>
+        </w:tc>
+      </w:tr>
+      <w:tr>
+        <w:trPr>
+          <w:cantSplit/>
+        </w:trPr>
+        <w:tc>
+          <w:tcPr>
+            <w:tcW w:type="dxa" w:w="3024"/>
+            <w:vAlign w:val="center"/>
+          </w:tcPr>
+          <w:p>
+            <w:pPr>
+              <w:keepNext/>
+              <w:spacing w:after="60"/>
+            </w:pPr>
+            <w:r>
+              <w:rPr>
+                <w:b w:val="0"/>
+                <w:sz w:val="18"/>
+              </w:rPr>
+              <w:t>EVF / organizator</w:t>
+            </w:r>
+          </w:p>
+        </w:tc>
+        <w:tc>
+          <w:tcPr>
+            <w:tcW w:type="dxa" w:w="3024"/>
+            <w:vAlign w:val="center"/>
+          </w:tcPr>
+          <w:p>
+            <w:pPr>
+              <w:keepNext/>
+              <w:spacing w:after="60"/>
+            </w:pPr>
+            <w:r>
+              <w:rPr>
+                <w:b w:val="0"/>
+                <w:sz w:val="18"/>
+              </w:rPr>
+              <w:t>Wyniki zawodów EVF</w:t>
+            </w:r>
+          </w:p>
+        </w:tc>
+        <w:tc>
+          <w:tcPr>
+            <w:tcW w:type="dxa" w:w="3024"/>
+            <w:vAlign w:val="center"/>
+          </w:tcPr>
+          <w:p>
+            <w:pPr>
+              <w:keepNext/>
+              <w:spacing w:after="60"/>
+            </w:pPr>
+            <w:r>
+              <w:rPr>
+                <w:b w:val="0"/>
+                <w:sz w:val="18"/>
+              </w:rPr>
+              <w:t>Odnośnik do protokołu źródłowego</w:t>
+            </w:r>
+          </w:p>
+        </w:tc>
+      </w:tr>
+      <w:tr>
+        <w:trPr>
+          <w:cantSplit/>
+        </w:trPr>
+        <w:tc>
+          <w:tcPr>
+            <w:tcW w:type="dxa" w:w="3024"/>
+            <w:vAlign w:val="center"/>
+            <w:shd w:fill="EAF2FB"/>
+          </w:tcPr>
+          <w:p>
+            <w:pPr>
+              <w:keepNext w:val="0"/>
+              <w:spacing w:after="60"/>
+            </w:pPr>
+            <w:r>
+              <w:rPr>
+                <w:b w:val="0"/>
+                <w:sz w:val="18"/>
+              </w:rPr>
+              <w:t>FIE / organizator</w:t>
+            </w:r>
+          </w:p>
+        </w:tc>
+        <w:tc>
+          <w:tcPr>
+            <w:tcW w:type="dxa" w:w="3024"/>
+            <w:vAlign w:val="center"/>
+            <w:shd w:fill="EAF2FB"/>
+          </w:tcPr>
+          <w:p>
+            <w:pPr>
+              <w:keepNext w:val="0"/>
+              <w:spacing w:after="60"/>
+            </w:pPr>
+            <w:r>
+              <w:rPr>
+                <w:b w:val="0"/>
+                <w:sz w:val="18"/>
+              </w:rPr>
+              <w:t>Wyniki indywidualne i protokoły drużynowe; np. publikowane w FencingTimeLive</w:t>
+            </w:r>
+          </w:p>
+        </w:tc>
+        <w:tc>
+          <w:tcPr>
+            <w:tcW w:type="dxa" w:w="3024"/>
+            <w:vAlign w:val="center"/>
+            <w:shd w:fill="EAF2FB"/>
+          </w:tcPr>
+          <w:p>
+            <w:pPr>
+              <w:keepNext w:val="0"/>
+              <w:spacing w:after="60"/>
+            </w:pPr>
+            <w:r>
+              <w:rPr>
+                <w:b w:val="0"/>
+                <w:sz w:val="18"/>
+              </w:rPr>
+              <w:t>Odnośnik do protokołu źródłowego</w:t>
+            </w:r>
+          </w:p>
+        </w:tc>
+      </w:tr>
+    </w:tbl>
+    <w:p>
+      <w:pPr/>
     </w:p>
     <w:p>
       <w:pPr>

</xml_diff>

<commit_message>
feat: define closed DME team pool and shared selector role
</commit_message>
<xml_diff>
--- a/regulamin/Regulamin-powolywania-reprezentacji-Polski-weteranów-w-szermierce_2026.docx
+++ b/regulamin/Regulamin-powolywania-reprezentacji-Polski-weteranów-w-szermierce_2026.docx
@@ -2037,7 +2037,7 @@
         <w:t xml:space="preserve">5. </w:t>
       </w:r>
       <w:r>
-        <w:t>W przypadku gdy nie jest możliwe skompletowanie drużyny z zawodników posiadających dodatni dorobek punktowy, dopuszcza się powołanie uzupełniające zawodnika bez punktów rankingowych, jeżeli łącznie:</w:t>
+        <w:t>W zawodach innych niż Drużynowe Mistrzostwa Europy, w przypadku gdy nie jest możliwe skompletowanie drużyny z zawodników posiadających dodatni dorobek punktowy, dopuszcza się powołanie uzupełniające zawodnika bez punktów rankingowych, jeżeli łącznie:</w:t>
       </w:r>
     </w:p>
     <w:p>
@@ -3276,10 +3276,35 @@
     <w:p>
       <w:pPr>
         <w:keepLines/>
-        <w:ind w:left="85"/>
+        <w:ind w:left="312" w:hanging="227"/>
       </w:pPr>
       <w:r>
-        <w:t>Ranking indywidualny wyznacza pulę kandydatów do składu drużyny, lecz miejsce w rankingu nie stanowi samoistnej podstawy powołania do składu drużyny.</w:t>
+        <w:t xml:space="preserve">1. </w:t>
+      </w:r>
+      <w:r>
+        <w:t>Pulę kandydatów do drużyny na Drużynowe Mistrzostwa Europy tworzy ośmiu zawodników nominowanych do startu indywidualnego: czterech najwyżej sklasyfikowanych w rankingu indywidualnym zawodników młodszej kategorii wiekowej oraz czterech najwyżej sklasyfikowanych zawodników starszej kategorii wiekowej objętej daną kategorią drużynową.</w:t>
+      </w:r>
+    </w:p>
+    <w:p>
+      <w:pPr>
+        <w:ind w:left="312" w:hanging="227"/>
+      </w:pPr>
+      <w:r>
+        <w:t xml:space="preserve">2. </w:t>
+      </w:r>
+      <w:r>
+        <w:t>W przypadku rezygnacji zawodnika jego miejsce zajmuje kolejny zawodnik w rankingu indywidualnym jego kategorii wiekowej.</w:t>
+      </w:r>
+    </w:p>
+    <w:p>
+      <w:pPr>
+        <w:ind w:left="312" w:hanging="227"/>
+      </w:pPr>
+      <w:r>
+        <w:t xml:space="preserve">3. </w:t>
+      </w:r>
+      <w:r>
+        <w:t>Skład drużyny oraz zawodnika rezerwowego wybiera się wyłącznie spośród zawodników należących do tej puli.</w:t>
       </w:r>
     </w:p>
     <w:p>
@@ -3341,29 +3366,14 @@
     </w:p>
     <w:p>
       <w:pPr>
-        <w:pStyle w:val="Etykietabrudnopisu"/>
-        <w:keepNext/>
-      </w:pPr>
-      <w:r>
-        <w:t>BRUDNOPIS ZE ŹRÓDŁA — DO OPRACOWANIA</w:t>
-      </w:r>
-    </w:p>
-    <w:p>
-      <w:pPr>
         <w:keepLines/>
         <w:ind w:left="312" w:hanging="227"/>
       </w:pPr>
       <w:r>
-        <w:rPr>
-          <w:color w:val="595959"/>
-        </w:rPr>
         <w:t xml:space="preserve">1. </w:t>
       </w:r>
       <w:r>
-        <w:rPr>
-          <w:color w:val="595959"/>
-        </w:rPr>
-        <w:t>Przy ustalaniu składu reprezentacji uwzględnia się czterech najwyżej sklasyfikowanych zawodników z młodszej kategorii wiekowej i czterech najwyżej sklasyfikowanych zawodników ze starszej kategorii wiekowej. W przypadku rezygnacji zawodnika jego miejsce zajmuje kolejny zawodnik w jego kategorii wiekowej.</w:t>
+        <w:t>Najwyżej sklasyfikowany zawodnik młodszej kategorii wiekowej oraz najwyżej sklasyfikowany zawodnik starszej kategorii wiekowej należący do puli kandydatów wchodzą do składu drużyny. Obaj zawodnicy mają zapewnione miejsca w składzie drużyny.</w:t>
       </w:r>
     </w:p>
     <w:p>
@@ -3371,16 +3381,10 @@
         <w:ind w:left="312" w:hanging="227"/>
       </w:pPr>
       <w:r>
-        <w:rPr>
-          <w:color w:val="595959"/>
-        </w:rPr>
         <w:t xml:space="preserve">2. </w:t>
       </w:r>
       <w:r>
-        <w:rPr>
-          <w:color w:val="595959"/>
-        </w:rPr>
-        <w:t>Ostateczny skład drużyny ustalają wspólnie najwyżej sklasyfikowany zawodnik młodszej kategorii wiekowej oraz najwyżej sklasyfikowany zawodnik starszej kategorii wiekowej. Dwóch zawodników wybiera się spośród pozostałych osób z puli na podstawie analizy osiągnięć w startach indywidualnych i drużynowych. Piąty zawodnik albo rezerwowy może zostać wybrany spoza tej puli.</w:t>
+        <w:t>Funkcję selekcjonera drużyny pełni zespół złożony z tych dwóch zawodników.</w:t>
       </w:r>
     </w:p>
     <w:p>
@@ -3388,16 +3392,10 @@
         <w:ind w:left="312" w:hanging="227"/>
       </w:pPr>
       <w:r>
-        <w:rPr>
-          <w:color w:val="595959"/>
-        </w:rPr>
         <w:t xml:space="preserve">3. </w:t>
       </w:r>
       <w:r>
-        <w:rPr>
-          <w:color w:val="595959"/>
-        </w:rPr>
-        <w:t>W przypadku braku porozumienia decyzję podejmuje Zarząd SPWS.</w:t>
+        <w:t>Zespół wybiera trzech kolejnych zawodników do składu drużyny oraz szóstego zawodnika jako rezerwowego wyłącznie spośród pozostałych sześciu zawodników z puli kandydatów.</w:t>
       </w:r>
     </w:p>
     <w:p>
@@ -3405,16 +3403,32 @@
         <w:ind w:left="312" w:hanging="227"/>
       </w:pPr>
       <w:r>
-        <w:rPr>
-          <w:color w:val="595959"/>
-        </w:rPr>
         <w:t xml:space="preserve">4. </w:t>
       </w:r>
       <w:r>
-        <w:rPr>
-          <w:color w:val="595959"/>
-        </w:rPr>
-        <w:t>Skompletowaną drużynę przedstawia się Zarządowi PZSz do akceptacji.</w:t>
+        <w:t>Zespół ustala skład w drodze porozumienia, kierując się celem wystawienia możliwie najsilniejszej drużyny, osiągnięciami kandydatów w startach indywidualnych i drużynowych oraz wymaganiami dotyczącymi kategorii wiekowych. Miejsce w rankingu indywidualnym nie przesądza o wyborze pozostałych zawodników do drużyny.</w:t>
+      </w:r>
+    </w:p>
+    <w:p>
+      <w:pPr>
+        <w:ind w:left="312" w:hanging="227"/>
+      </w:pPr>
+      <w:r>
+        <w:t xml:space="preserve">5. </w:t>
+      </w:r>
+      <w:r>
+        <w:t>W przypadku braku porozumienia do zespołu pełniącego funkcję selekcjonera dołącza Prezes SPWS.</w:t>
+      </w:r>
+    </w:p>
+    <w:p>
+      <w:pPr>
+        <w:ind w:left="312" w:hanging="227"/>
+      </w:pPr>
+      <w:r>
+        <w:t xml:space="preserve">6. </w:t>
+      </w:r>
+      <w:r>
+        <w:t>Proponowany skład drużyny wraz ze wskazaniem zawodnika rezerwowego przedstawia się PZSz do akceptacji.</w:t>
       </w:r>
     </w:p>
     <w:p>
@@ -3571,7 +3585,7 @@
         <w:ind w:left="85"/>
       </w:pPr>
       <w:r>
-        <w:t>Powołanie uzupełniające zawodnika bez dodatniego dorobku punktowego jest dopuszczalne wyłącznie na warunkach określonych w § 4 ust. 5.</w:t>
+        <w:t>Powołanie uzupełniające zawodnika bez dodatniego dorobku punktowego jest dopuszczalne wyłącznie na warunkach określonych w § 4 ust. 5. Powołania uzupełniającego nie stosuje się do Drużynowych Mistrzostw Europy; skład drużyny i zawodnika rezerwowego wybiera się wyłącznie z puli kandydatów nominowanych do startu indywidualnego.</w:t>
       </w:r>
     </w:p>
     <w:p>

</xml_diff>

<commit_message>
feat: allow SPWS president to designate a team representative
</commit_message>
<xml_diff>
--- a/regulamin/Regulamin-powolywania-reprezentacji-Polski-weteranów-w-szermierce_2026.docx
+++ b/regulamin/Regulamin-powolywania-reprezentacji-Polski-weteranów-w-szermierce_2026.docx
@@ -3373,7 +3373,7 @@
         <w:t xml:space="preserve">1. </w:t>
       </w:r>
       <w:r>
-        <w:t>Najwyżej sklasyfikowany zawodnik młodszej kategorii wiekowej oraz najwyżej sklasyfikowany zawodnik starszej kategorii wiekowej należący do puli kandydatów wchodzą do składu drużyny. Obaj zawodnicy mają zapewnione miejsca w składzie drużyny.</w:t>
+        <w:t>Najwyżej sklasyfikowani zawodnicy młodszej i starszej kategorii wiekowej spośród zawodników należących do puli kandydatów mają zapewnione miejsca w składzie drużyny — po jednym zawodniku z każdej kategorii.</w:t>
       </w:r>
     </w:p>
     <w:p>
@@ -3417,7 +3417,7 @@
         <w:t xml:space="preserve">5. </w:t>
       </w:r>
       <w:r>
-        <w:t>W przypadku braku porozumienia do zespołu pełniącego funkcję selekcjonera dołącza Prezes SPWS.</w:t>
+        <w:t>W przypadku braku porozumienia do zespołu pełniącego funkcję selekcjonera dołącza Prezes SPWS. Jeżeli Prezes SPWS nie może uczestniczyć w pracach zespołu, wyznacza inną osobę do udziału w tych pracach w swoim imieniu.</w:t>
       </w:r>
     </w:p>
     <w:p>

</xml_diff>

<commit_message>
feat: distinguish Worlds and European team selection rules
</commit_message>
<xml_diff>
--- a/regulamin/Regulamin-powolywania-reprezentacji-Polski-weteranów-w-szermierce_2026.docx
+++ b/regulamin/Regulamin-powolywania-reprezentacji-Polski-weteranów-w-szermierce_2026.docx
@@ -2004,7 +2004,7 @@
         <w:t xml:space="preserve">2. </w:t>
       </w:r>
       <w:r>
-        <w:t>Miejsce w rankingu indywidualnym nie stanowi samoistnej podstawy powołania do składu drużyny. Skład drużyny ustala się zgodnie z zasadami określonymi w rozdziale 4.</w:t>
+        <w:t>Ranking indywidualny wyznacza pulę kandydatów do drużyny oraz zapewnia miejsce w jej składzie najwyżej sklasyfikowanemu zawodnikowi z każdej z dwóch kategorii wiekowych objętych daną kategorią drużynową. Pozostałych zawodników drużyny, a w przypadku Drużynowych Mistrzostw Europy także zawodnika rezerwowego, wybiera zespół pełniący funkcję selekcjonera, na zasadach określonych w rozdziale 4.</w:t>
       </w:r>
     </w:p>
     <w:p>
@@ -2015,7 +2015,7 @@
         <w:t xml:space="preserve">3. </w:t>
       </w:r>
       <w:r>
-        <w:t>Zawodnik samodzielnie decyduje, w których zawodach wymienionych w § 5 ust. 1 bierze udział. Udział w określonych zawodach lub cyklu zawodów nie stanowi warunku powołania do reprezentacji.</w:t>
+        <w:t>Zawodnik samodzielnie wybiera zawody, w których bierze udział. Warunkiem uwzględnienia go w rankingu indywidualnym jest co najmniej jeden start w Pucharze Polski Weteranów w Szermierce albo Mistrzostwach Polski Weteranów w Szermierce.</w:t>
       </w:r>
     </w:p>
     <w:p>
@@ -2037,7 +2037,7 @@
         <w:t xml:space="preserve">5. </w:t>
       </w:r>
       <w:r>
-        <w:t>W zawodach innych niż Drużynowe Mistrzostwa Europy, w przypadku gdy nie jest możliwe skompletowanie drużyny z zawodników posiadających dodatni dorobek punktowy, dopuszcza się powołanie uzupełniające zawodnika bez punktów rankingowych, jeżeli łącznie:</w:t>
+        <w:t>W zawodach innych niż Drużynowe Mistrzostwa Świata i Drużynowe Mistrzostwa Europy, w przypadku gdy nie jest możliwe skompletowanie drużyny z zawodników posiadających dodatni dorobek punktowy, dopuszcza się powołanie uzupełniające zawodnika bez punktów rankingowych, jeżeli łącznie:</w:t>
       </w:r>
     </w:p>
     <w:p>
@@ -2081,29 +2081,7 @@
         <w:t xml:space="preserve">4) </w:t>
       </w:r>
       <w:r>
-        <w:t>powoływana osoba spełnia wszystkie formalne warunki udziału określone przez organizatora zawodów;</w:t>
-      </w:r>
-    </w:p>
-    <w:p>
-      <w:pPr>
-        <w:ind w:left="595" w:hanging="255"/>
-      </w:pPr>
-      <w:r>
-        <w:t xml:space="preserve">5) </w:t>
-      </w:r>
-      <w:r>
-        <w:t>powołanie nie pozbawia miejsca zawodnika posiadającego dodatni dorobek punktowy i gotowego do udziału;</w:t>
-      </w:r>
-    </w:p>
-    <w:p>
-      <w:pPr>
-        <w:ind w:left="595" w:hanging="255"/>
-      </w:pPr>
-      <w:r>
-        <w:t xml:space="preserve">6) </w:t>
-      </w:r>
-      <w:r>
-        <w:t>przyczyny powołania zostaną wskazane w pisemnym uzasadnieniu nominacji.</w:t>
+        <w:t>powoływana osoba spełnia wszystkie formalne warunki udziału określone przez organizatora zawodów.</w:t>
       </w:r>
     </w:p>
     <w:p>
@@ -2221,7 +2199,7 @@
         <w:t xml:space="preserve">3) </w:t>
       </w:r>
       <w:r>
-        <w:t>prawo zgłoszenia do udziału przysługuje wszystkim zawodnikom spełniającym kryterium wieku właściwe dla weteranów szermierki, niezależnie od obywatelstwa, miejsca zamieszkania, przynależności klubowej oraz państwa, w którym uprawiają szermierkę, pod warunkiem spełnienia jednakowych dla wszystkich uczestników wymagań określonych w komunikacie organizacyjnym;</w:t>
+        <w:t>prawo zgłoszenia do udziału przysługuje wszystkim zawodnikom spełniającym kryterium wieku właściwe dla weteranów szermierki, niezależnie od obywatelstwa, miejsca zamieszkania, przynależności klubowej oraz państwa, w którym uprawiają szermierkę;</w:t>
       </w:r>
     </w:p>
     <w:p>
@@ -3216,22 +3194,10 @@
     </w:p>
     <w:p>
       <w:pPr>
-        <w:pStyle w:val="Etykietabrudnopisu"/>
-        <w:keepNext/>
-      </w:pPr>
-      <w:r>
-        <w:t>BRUDNOPIS ZE ŹRÓDŁA — DO OPRACOWANIA</w:t>
-      </w:r>
-    </w:p>
-    <w:p>
-      <w:pPr>
         <w:keepLines/>
         <w:ind w:left="85"/>
       </w:pPr>
       <w:r>
-        <w:rPr>
-          <w:color w:val="595959"/>
-        </w:rPr>
         <w:t>W przypadku rezygnacji zawodnika z udziału w zawodach indywidualnych jego miejsce przechodzi na kolejnego zawodnika zgodnie z aktualnym rankingiem indywidualnym.</w:t>
       </w:r>
     </w:p>
@@ -3282,7 +3248,7 @@
         <w:t xml:space="preserve">1. </w:t>
       </w:r>
       <w:r>
-        <w:t>Pulę kandydatów do drużyny na Drużynowe Mistrzostwa Europy tworzy ośmiu zawodników nominowanych do startu indywidualnego: czterech najwyżej sklasyfikowanych w rankingu indywidualnym zawodników młodszej kategorii wiekowej oraz czterech najwyżej sklasyfikowanych zawodników starszej kategorii wiekowej objętej daną kategorią drużynową.</w:t>
+        <w:t>Ranking indywidualny weteranów przyjęty dla danego cyklu powołań wyznacza pulę kandydatów do drużyny właściwą dla danej broni, płci i kategorii drużynowej. Na Mistrzostwa Świata pula obejmuje po czterech zawodników z każdej z dwóch kategorii wiekowych, a na Mistrzostwa Europy — po sześciu.</w:t>
       </w:r>
     </w:p>
     <w:p>
@@ -3293,7 +3259,7 @@
         <w:t xml:space="preserve">2. </w:t>
       </w:r>
       <w:r>
-        <w:t>W przypadku rezygnacji zawodnika jego miejsce zajmuje kolejny zawodnik w rankingu indywidualnym jego kategorii wiekowej.</w:t>
+        <w:t>W przypadku rezygnacji zawodnika z udziału w puli kandydatów jego miejsce zajmuje kolejny zawodnik w rankingu indywidualnym jego kategorii wiekowej.</w:t>
       </w:r>
     </w:p>
     <w:p>
@@ -3304,7 +3270,7 @@
         <w:t xml:space="preserve">3. </w:t>
       </w:r>
       <w:r>
-        <w:t>Skład drużyny oraz zawodnika rezerwowego wybiera się wyłącznie spośród zawodników należących do tej puli.</w:t>
+        <w:t>Skład drużyny, a na Drużynowe Mistrzostwa Europy także zawodnika rezerwowego, wybiera się wyłącznie spośród zawodników należących do właściwej puli.</w:t>
       </w:r>
     </w:p>
     <w:p>
@@ -3327,22 +3293,10 @@
     </w:p>
     <w:p>
       <w:pPr>
-        <w:pStyle w:val="Etykietabrudnopisu"/>
-        <w:keepNext/>
-      </w:pPr>
-      <w:r>
-        <w:t>BRUDNOPIS ZE ŹRÓDŁA — DO OPRACOWANIA</w:t>
-      </w:r>
-    </w:p>
-    <w:p>
-      <w:pPr>
         <w:keepLines/>
         <w:ind w:left="85"/>
       </w:pPr>
       <w:r>
-        <w:rPr>
-          <w:color w:val="595959"/>
-        </w:rPr>
         <w:t>W rozgrywkach drużynowych zawody są rozgrywane w kategoriach Weteran, obejmującej kategorie 1 i 2, oraz Grand Weteran, obejmującej kategorie 3 i 4. Drużynę kompletuje się z udziałem zawodników obu właściwych kategorii wiekowych; co najmniej jeden zawodnik powinien należeć do kategorii wyższej, a preferowany jest udział dwóch takich zawodników.</w:t>
       </w:r>
     </w:p>
@@ -3353,6 +3307,102 @@
       </w:pPr>
       <w:r>
         <w:t>§ 14</w:t>
+      </w:r>
+    </w:p>
+    <w:p>
+      <w:pPr>
+        <w:pStyle w:val="Tytułparagrafu"/>
+        <w:keepNext/>
+      </w:pPr>
+      <w:r>
+        <w:t>Drużynowe Mistrzostwa Świata</w:t>
+      </w:r>
+    </w:p>
+    <w:p>
+      <w:pPr>
+        <w:keepLines/>
+        <w:ind w:left="312" w:hanging="227"/>
+      </w:pPr>
+      <w:r>
+        <w:t xml:space="preserve">1. </w:t>
+      </w:r>
+      <w:r>
+        <w:t>Pulę kandydatów do drużyny tworzy ośmiu zawodników nominowanych do startu indywidualnego: po czterech zawodników z każdej z dwóch kategorii wiekowych objętych daną kategorią drużynową. Podstawą wyłonienia puli jest ranking indywidualny weteranów przyjęty dla danego cyklu powołań.</w:t>
+      </w:r>
+    </w:p>
+    <w:p>
+      <w:pPr>
+        <w:ind w:left="312" w:hanging="227"/>
+      </w:pPr>
+      <w:r>
+        <w:t xml:space="preserve">2. </w:t>
+      </w:r>
+      <w:r>
+        <w:t>Najwyżej sklasyfikowany w tym rankingu zawodnik młodszej kategorii wiekowej oraz najwyżej sklasyfikowany zawodnik starszej kategorii wiekowej spośród zawodników należących do puli mają zapewnione miejsca w drużynie. Wyniki turnieju indywidualnego Mistrzostw Świata nie zmieniają tego uprawnienia.</w:t>
+      </w:r>
+    </w:p>
+    <w:p>
+      <w:pPr>
+        <w:ind w:left="312" w:hanging="227"/>
+      </w:pPr>
+      <w:r>
+        <w:t xml:space="preserve">3. </w:t>
+      </w:r>
+      <w:r>
+        <w:t>Funkcję selekcjonera drużyny pełni zespół złożony z tych dwóch zawodników.</w:t>
+      </w:r>
+    </w:p>
+    <w:p>
+      <w:pPr>
+        <w:ind w:left="312" w:hanging="227"/>
+      </w:pPr>
+      <w:r>
+        <w:t xml:space="preserve">4. </w:t>
+      </w:r>
+      <w:r>
+        <w:t>Pełny skład pięcioosobowej drużyny ustala się na miejscu podczas Mistrzostw Świata, po zakończeniu turnieju indywidualnego, w dniu poprzedzającym turniej drużynowy. Zespół pełniący funkcję selekcjonera wybiera trzech zawodników spośród pozostałych sześciu zawodników z puli, obecnych na mistrzostwach. Nie wyznacza się zawodnika rezerwowego. Trzej niewybrani zawodnicy nie uczestniczą w turnieju drużynowym.</w:t>
+      </w:r>
+    </w:p>
+    <w:p>
+      <w:pPr>
+        <w:ind w:left="312" w:hanging="227"/>
+      </w:pPr>
+      <w:r>
+        <w:t xml:space="preserve">5. </w:t>
+      </w:r>
+      <w:r>
+        <w:t>Zespół ustala skład w drodze porozumienia, kierując się celem wystawienia możliwie najsilniejszej drużyny. Przy wyborze uwzględnia wyniki turnieju indywidualnego Mistrzostw Świata, osiągnięcia kandydatów w startach indywidualnych i drużynowych oraz wymagania dotyczące kategorii wiekowych.</w:t>
+      </w:r>
+    </w:p>
+    <w:p>
+      <w:pPr>
+        <w:ind w:left="312" w:hanging="227"/>
+      </w:pPr>
+      <w:r>
+        <w:t xml:space="preserve">6. </w:t>
+      </w:r>
+      <w:r>
+        <w:t>W przypadku braku porozumienia do zespołu pełniącego funkcję selekcjonera dołącza Prezes SPWS. Jeżeli Prezes SPWS nie może uczestniczyć w pracach zespołu, wyznacza inną osobę do udziału w tych pracach w swoim imieniu.</w:t>
+      </w:r>
+    </w:p>
+    <w:p>
+      <w:pPr>
+        <w:ind w:left="312" w:hanging="227"/>
+      </w:pPr>
+      <w:r>
+        <w:t xml:space="preserve">7. </w:t>
+      </w:r>
+      <w:r>
+        <w:t>Proponowany skład pięcioosobowej drużyny przedstawia się PZSz do akceptacji.</w:t>
+      </w:r>
+    </w:p>
+    <w:p>
+      <w:pPr>
+        <w:pStyle w:val="Paragraf"/>
+        <w:keepNext/>
+      </w:pPr>
+      <w:r>
+        <w:t>§ 15</w:t>
       </w:r>
     </w:p>
     <w:p>
@@ -3373,7 +3423,7 @@
         <w:t xml:space="preserve">1. </w:t>
       </w:r>
       <w:r>
-        <w:t>Najwyżej sklasyfikowani zawodnicy młodszej i starszej kategorii wiekowej spośród zawodników należących do puli kandydatów mają zapewnione miejsca w składzie drużyny — po jednym zawodniku z każdej kategorii.</w:t>
+        <w:t>Pulę kandydatów do drużyny tworzy dwunastu zawodników: sześciu najwyżej sklasyfikowanych zawodników młodszej kategorii wiekowej oraz sześciu najwyżej sklasyfikowanych zawodników starszej kategorii wiekowej w rankingu indywidualnym weteranów właściwym dla danej broni i płci, przyjętym dla danego cyklu powołań.</w:t>
       </w:r>
     </w:p>
     <w:p>
@@ -3384,7 +3434,7 @@
         <w:t xml:space="preserve">2. </w:t>
       </w:r>
       <w:r>
-        <w:t>Funkcję selekcjonera drużyny pełni zespół złożony z tych dwóch zawodników.</w:t>
+        <w:t>Najwyżej sklasyfikowani zawodnicy młodszej i starszej kategorii wiekowej spośród zawodników należących do puli kandydatów mają zapewnione miejsca w składzie drużyny — po jednym zawodniku z każdej kategorii. Funkcję selekcjonera drużyny pełni zespół złożony z tych dwóch zawodników.</w:t>
       </w:r>
     </w:p>
     <w:p>
@@ -3395,7 +3445,7 @@
         <w:t xml:space="preserve">3. </w:t>
       </w:r>
       <w:r>
-        <w:t>Zespół wybiera trzech kolejnych zawodników do składu drużyny oraz szóstego zawodnika jako rezerwowego wyłącznie spośród pozostałych sześciu zawodników z puli kandydatów.</w:t>
+        <w:t>Zespół wybiera trzech kolejnych zawodników do składu drużyny oraz jednego zawodnika rezerwowego wyłącznie spośród pozostałych dziesięciu zawodników z puli kandydatów.</w:t>
       </w:r>
     </w:p>
     <w:p>
@@ -3428,52 +3478,7 @@
         <w:t xml:space="preserve">6. </w:t>
       </w:r>
       <w:r>
-        <w:t>Proponowany skład drużyny wraz ze wskazaniem zawodnika rezerwowego przedstawia się PZSz do akceptacji.</w:t>
-      </w:r>
-    </w:p>
-    <w:p>
-      <w:pPr>
-        <w:pStyle w:val="Paragraf"/>
-        <w:keepNext/>
-      </w:pPr>
-      <w:r>
-        <w:t>§ 15</w:t>
-      </w:r>
-    </w:p>
-    <w:p>
-      <w:pPr>
-        <w:pStyle w:val="Tytułparagrafu"/>
-        <w:keepNext/>
-      </w:pPr>
-      <w:r>
-        <w:t>Drużynowe Mistrzostwa Świata</w:t>
-      </w:r>
-    </w:p>
-    <w:p>
-      <w:pPr>
-        <w:pStyle w:val="Etykietabrudnopisu"/>
-        <w:keepNext/>
-      </w:pPr>
-      <w:r>
-        <w:t>BRUDNOPIS ZE ŹRÓDŁA — DO OPRACOWANIA</w:t>
-      </w:r>
-    </w:p>
-    <w:p>
-      <w:pPr>
-        <w:keepLines/>
-        <w:ind w:left="312" w:hanging="227"/>
-      </w:pPr>
-      <w:r>
-        <w:rPr>
-          <w:color w:val="595959"/>
-        </w:rPr>
-        <w:t xml:space="preserve">1. </w:t>
-      </w:r>
-      <w:r>
-        <w:rPr>
-          <w:color w:val="595959"/>
-        </w:rPr>
-        <w:t>Skład reprezentacji ustala się po zakończeniu rywalizacji indywidualnej podczas Mistrzostw Świata.</w:t>
+        <w:t>Proponowany skład pięcioosobowej drużyny wraz ze wskazaniem zawodnika rezerwowego przedstawia się PZSz do akceptacji.</w:t>
       </w:r>
     </w:p>
     <w:p>
@@ -3481,84 +3486,10 @@
         <w:ind w:left="312" w:hanging="227"/>
       </w:pPr>
       <w:r>
-        <w:rPr>
-          <w:color w:val="595959"/>
-        </w:rPr>
-        <w:t xml:space="preserve">2. </w:t>
+        <w:t xml:space="preserve">7. </w:t>
       </w:r>
       <w:r>
-        <w:rPr>
-          <w:color w:val="595959"/>
-        </w:rPr>
-        <w:t>Podstawą wyłonienia składu drużyny są wyniki uzyskane przez zawodników w turnieju indywidualnym Mistrzostw Świata.</w:t>
-      </w:r>
-    </w:p>
-    <w:p>
-      <w:pPr>
-        <w:ind w:left="312" w:hanging="227"/>
-      </w:pPr>
-      <w:r>
-        <w:rPr>
-          <w:color w:val="595959"/>
-        </w:rPr>
-        <w:t xml:space="preserve">3. </w:t>
-      </w:r>
-      <w:r>
-        <w:rPr>
-          <w:color w:val="595959"/>
-        </w:rPr>
-        <w:t>Do składu drużyny kwalifikuje się spośród uczestników Indywidualnych Mistrzostw Świata:</w:t>
-      </w:r>
-    </w:p>
-    <w:p>
-      <w:pPr>
-        <w:ind w:left="595" w:hanging="255"/>
-      </w:pPr>
-      <w:r>
-        <w:rPr>
-          <w:color w:val="595959"/>
-        </w:rPr>
-        <w:t xml:space="preserve">1) </w:t>
-      </w:r>
-      <w:r>
-        <w:rPr>
-          <w:color w:val="595959"/>
-        </w:rPr>
-        <w:t>dwóch najwyżej sklasyfikowanych zawodników z młodszej kategorii wiekowej;</w:t>
-      </w:r>
-    </w:p>
-    <w:p>
-      <w:pPr>
-        <w:ind w:left="595" w:hanging="255"/>
-      </w:pPr>
-      <w:r>
-        <w:rPr>
-          <w:color w:val="595959"/>
-        </w:rPr>
-        <w:t xml:space="preserve">2) </w:t>
-      </w:r>
-      <w:r>
-        <w:rPr>
-          <w:color w:val="595959"/>
-        </w:rPr>
-        <w:t>dwóch najwyżej sklasyfikowanych zawodników ze starszej kategorii wiekowej.</w:t>
-      </w:r>
-    </w:p>
-    <w:p>
-      <w:pPr>
-        <w:ind w:left="312" w:hanging="227"/>
-      </w:pPr>
-      <w:r>
-        <w:rPr>
-          <w:color w:val="595959"/>
-        </w:rPr>
-        <w:t xml:space="preserve">4. </w:t>
-      </w:r>
-      <w:r>
-        <w:rPr>
-          <w:color w:val="595959"/>
-        </w:rPr>
-        <w:t>Piątego zawodnika drużyny wskazują wspólnie czterej zawodnicy zakwalifikowani zgodnie z § 15 ust. 3 spośród pozostałych uczestników Indywidualnych Mistrzostw Świata.</w:t>
+        <w:t>W przypadku rezygnacji zawodnika z udziału w turnieju drużynowym jego miejsce zajmuje nominowany zawodnik rezerwowy, pod warunkiem zachowania wymagań dotyczących kategorii wiekowych drużyny.</w:t>
       </w:r>
     </w:p>
     <w:p>
@@ -3585,7 +3516,7 @@
         <w:ind w:left="85"/>
       </w:pPr>
       <w:r>
-        <w:t>Powołanie uzupełniające zawodnika bez dodatniego dorobku punktowego jest dopuszczalne wyłącznie na warunkach określonych w § 4 ust. 5. Powołania uzupełniającego nie stosuje się do Drużynowych Mistrzostw Europy; skład drużyny i zawodnika rezerwowego wybiera się wyłącznie z puli kandydatów nominowanych do startu indywidualnego.</w:t>
+        <w:t>Powołanie uzupełniające zawodnika bez dodatniego dorobku punktowego jest dopuszczalne wyłącznie na warunkach określonych w § 4 ust. 5. Powołania uzupełniającego nie stosuje się do Drużynowych Mistrzostw Świata ani Drużynowych Mistrzostw Europy; skład wybiera się wyłącznie z właściwej puli kandydatów.</w:t>
       </w:r>
     </w:p>
     <w:p>
@@ -3690,7 +3621,7 @@
         <w:t xml:space="preserve">6. </w:t>
       </w:r>
       <w:r>
-        <w:t>Propozycja przekazywana w T−60 obejmuje kandydatów do reprezentacji na Mistrzostwa Świata. Ostateczny skład drużyny ustala się po zakończeniu rywalizacji indywidualnej podczas tych mistrzostw, na podstawie uzyskanych w niej wyników i zgodnie z zasadami doboru drużyny określonymi w Regulaminie.</w:t>
+        <w:t>Propozycja przekazywana PZSz w terminie T−60 wskazuje ośmioosobową pulę kandydatów do drużyny na Mistrzostwa Świata oraz dwóch zawodników mających zapewnione miejsca w jej składzie. Pozostałych trzech zawodników wybiera się na miejscu podczas mistrzostw, po zakończeniu turnieju indywidualnego, w dniu poprzedzającym turniej drużynowy. Nie wyznacza się zawodnika rezerwowego.</w:t>
       </w:r>
     </w:p>
     <w:p>
@@ -3701,7 +3632,7 @@
         <w:t xml:space="preserve">7. </w:t>
       </w:r>
       <w:r>
-        <w:t>SPWS odpowiada za zebranie i weryfikację wyników, przygotowanie kart zawodników, uszeregowanie kandydatów wraz z pisemnymi uzasadnieniami, rozpatrzenie reklamacji danych oraz przekazanie propozycji PZSz w terminie T−60.</w:t>
+        <w:t>Propozycja przekazywana PZSz w terminie T−60 na Drużynowe Mistrzostwa Europy obejmuje skład pięcioosobowej drużyny wraz ze wskazaniem zawodnika rezerwowego.</w:t>
       </w:r>
     </w:p>
     <w:p>
@@ -3712,7 +3643,7 @@
         <w:t xml:space="preserve">8. </w:t>
       </w:r>
       <w:r>
-        <w:t>PZSz dokonuje wyboru i nominacji zawodników oraz zgłoszenia imiennego. W przypadku odstępstwa od kolejności zaproponowanej przez SPWS PZSz podaje pisemnie przyczynę odstępstwa.</w:t>
+        <w:t>SPWS odpowiada za zebranie i weryfikację wyników, przygotowanie kart zawodników, uszeregowanie kandydatów wraz z pisemnymi uzasadnieniami, rozpatrzenie reklamacji danych oraz przekazanie propozycji PZSz w terminie T−60.</w:t>
       </w:r>
     </w:p>
     <w:p>
@@ -3723,7 +3654,7 @@
         <w:t xml:space="preserve">9. </w:t>
       </w:r>
       <w:r>
-        <w:t>Reklamacja danych dotyczy błędów faktycznych, w szczególności pominięcia wyniku, błędnej pisowni nazwiska albo przypisania wyniku niewłaściwemu zawodnikowi. Korekta danych nie oznacza dopuszczenia wyników uzyskanych po T−90. Zweryfikowaną korektę wprowadza się do karty przed przekazaniem propozycji PZSz w T−60.</w:t>
+        <w:t>PZSz dokonuje wyboru i nominacji zawodników oraz zgłoszenia imiennego. W przypadku odstępstwa od kolejności zaproponowanej przez SPWS PZSz podaje pisemnie przyczynę odstępstwa.</w:t>
       </w:r>
     </w:p>
     <w:p>
@@ -3734,7 +3665,7 @@
         <w:t xml:space="preserve">10. </w:t>
       </w:r>
       <w:r>
-        <w:t>Po T−60 zawodnik może zgłosić zastrzeżenie do oceny lub uzasadnienia dotyczącego jego kandydatury. SPWS odpowiada pisemnie. Zgłoszenie zastrzeżenia nie wstrzymuje dalszego procesu powoływania.</w:t>
+        <w:t>Reklamacja danych dotyczy błędów faktycznych, w szczególności pominięcia wyniku, błędnej pisowni nazwiska albo przypisania wyniku niewłaściwemu zawodnikowi. Korekta danych nie oznacza dopuszczenia wyników uzyskanych po T−90. Zweryfikowaną korektę wprowadza się do karty przed przekazaniem propozycji PZSz w T−60.</w:t>
       </w:r>
     </w:p>
     <w:p>
@@ -3745,7 +3676,7 @@
         <w:t xml:space="preserve">11. </w:t>
       </w:r>
       <w:r>
-        <w:t>Reklamacje, zastrzeżenia oraz odpowiedzi udostępnia się zainteresowanemu zawodnikowi i archiwizuje wraz z dokumentacją cyklu.</w:t>
+        <w:t>Po T−60 zawodnik może zgłosić zastrzeżenie do oceny lub uzasadnienia dotyczącego jego kandydatury. SPWS odpowiada pisemnie. Zgłoszenie zastrzeżenia nie wstrzymuje dalszego procesu powoływania.</w:t>
       </w:r>
     </w:p>
     <w:p>
@@ -3756,6 +3687,17 @@
         <w:t xml:space="preserve">12. </w:t>
       </w:r>
       <w:r>
+        <w:t>Reklamacje, zastrzeżenia oraz odpowiedzi udostępnia się zainteresowanemu zawodnikowi i archiwizuje wraz z dokumentacją cyklu.</w:t>
+      </w:r>
+    </w:p>
+    <w:p>
+      <w:pPr>
+        <w:ind w:left="312" w:hanging="227"/>
+      </w:pPr>
+      <w:r>
+        <w:t xml:space="preserve">13. </w:t>
+      </w:r>
+      <w:r>
         <w:t>SPWS wykorzystuje oficjalne wyniki i protokoły zawodów uwzględnianych w rankingu: PPW i MPW, zawodów PZSz, EVF oraz FIE. Każdy wynik ujęty w karcie zawodnika zawiera odnośnik do publicznego protokołu stanowiącego jego źródło.</w:t>
       </w:r>
     </w:p>
@@ -3764,7 +3706,7 @@
         <w:ind w:left="312" w:hanging="227"/>
       </w:pPr>
       <w:r>
-        <w:t xml:space="preserve">13. </w:t>
+        <w:t xml:space="preserve">14. </w:t>
       </w:r>
       <w:r>
         <w:t>SPWS archiwizuje stan danych z T−90, późniejsze korekty wraz z ich uzasadnieniem oraz ostateczną wersję propozycji przekazaną PZSz. Dokumentacja obejmuje karty zawodników, deklaracje gotowości, uzasadnienia, reklamacje, zastrzeżenia i odpowiedzi oraz pozwala odtworzyć podstawę przekazanej propozycji. Dokumentację ostatecznego wyboru drużyny na Mistrzostwa Świata uzupełnia się po zakończeniu rywalizacji indywidualnej.</w:t>
@@ -4030,7 +3972,7 @@
                 <w:b w:val="0"/>
                 <w:sz w:val="18"/>
               </w:rPr>
-              <w:t>Kandydaci, poprawione karty i uzasadnienia</w:t>
+              <w:t>MŚ: pula 8 i dwóch liderów. ME: drużyna 5 i rezerwowy. Karty i uzasadnienia.</w:t>
             </w:r>
           </w:p>
         </w:tc>
@@ -4051,7 +3993,7 @@
                 <w:b w:val="0"/>
                 <w:sz w:val="18"/>
               </w:rPr>
-              <w:t>Na MŚ skład drużyny ustala się po rywalizacji indywidualnej</w:t>
+              <w:t>MŚ: po turnieju indywidualnym, dzień przed drużynowym — pełna piątka, bez rezerwowego.</w:t>
             </w:r>
           </w:p>
         </w:tc>
@@ -4391,7 +4333,7 @@
                 <w:b w:val="0"/>
                 <w:sz w:val="18"/>
               </w:rPr>
-              <w:t>SPWS przekazuje kolejność kandydatów, uzasadnienia i propozycję obsadzenia kategorii rozgrywanych w danych zawodach.</w:t>
+              <w:t>MŚ: pula ośmiu kandydatów i dwóch liderów z zapewnionymi miejscami. ME: proponowana piątka i rezerwowy. Karty oraz uzasadnienia do PZSz.</w:t>
             </w:r>
           </w:p>
         </w:tc>
@@ -4407,6 +4349,69 @@
           </w:tcPr>
           <w:p>
             <w:pPr>
+              <w:keepNext/>
+              <w:spacing w:after="60"/>
+            </w:pPr>
+            <w:r>
+              <w:rPr>
+                <w:b w:val="0"/>
+                <w:sz w:val="18"/>
+              </w:rPr>
+              <w:t>Dzień przed turniejem drużynowym MŚ, po turnieju indywidualnym</w:t>
+            </w:r>
+          </w:p>
+        </w:tc>
+        <w:tc>
+          <w:tcPr>
+            <w:tcW w:type="dxa" w:w="3024"/>
+            <w:vAlign w:val="center"/>
+          </w:tcPr>
+          <w:p>
+            <w:pPr>
+              <w:keepNext/>
+              <w:spacing w:after="60"/>
+            </w:pPr>
+            <w:r>
+              <w:rPr>
+                <w:b w:val="0"/>
+                <w:sz w:val="18"/>
+              </w:rPr>
+              <w:t>Pełny skład MŚ</w:t>
+            </w:r>
+          </w:p>
+        </w:tc>
+        <w:tc>
+          <w:tcPr>
+            <w:tcW w:type="dxa" w:w="3024"/>
+            <w:vAlign w:val="center"/>
+          </w:tcPr>
+          <w:p>
+            <w:pPr>
+              <w:keepNext/>
+              <w:spacing w:after="60"/>
+            </w:pPr>
+            <w:r>
+              <w:rPr>
+                <w:b w:val="0"/>
+                <w:sz w:val="18"/>
+              </w:rPr>
+              <w:t>Wybór trzech zawodników z pozostałej szóstki obecnej na mistrzostwach. Drużyna pięcioosobowa, bez rezerwowego; trzej niewybrani nie uczestniczą w turnieju drużynowym.</w:t>
+            </w:r>
+          </w:p>
+        </w:tc>
+      </w:tr>
+      <w:tr>
+        <w:trPr>
+          <w:cantSplit/>
+        </w:trPr>
+        <w:tc>
+          <w:tcPr>
+            <w:tcW w:type="dxa" w:w="3024"/>
+            <w:vAlign w:val="center"/>
+            <w:shd w:fill="EAF2FB"/>
+          </w:tcPr>
+          <w:p>
+            <w:pPr>
               <w:keepNext w:val="0"/>
               <w:spacing w:after="60"/>
             </w:pPr>
@@ -4423,6 +4428,7 @@
           <w:tcPr>
             <w:tcW w:type="dxa" w:w="3024"/>
             <w:vAlign w:val="center"/>
+            <w:shd w:fill="EAF2FB"/>
           </w:tcPr>
           <w:p>
             <w:pPr>
@@ -4442,6 +4448,7 @@
           <w:tcPr>
             <w:tcW w:type="dxa" w:w="3024"/>
             <w:vAlign w:val="center"/>
+            <w:shd w:fill="EAF2FB"/>
           </w:tcPr>
           <w:p>
             <w:pPr>
@@ -5032,7 +5039,7 @@
         <w:keepNext/>
       </w:pPr>
       <w:r>
-        <w:t>Ocena posezonowa</w:t>
+        <w:t>Posezonowa ocena działania regulaminu</w:t>
       </w:r>
     </w:p>
     <w:p>
@@ -5044,7 +5051,7 @@
         <w:t xml:space="preserve">1. </w:t>
       </w:r>
       <w:r>
-        <w:t>Po zakończeniu każdego sezonu przeprowadza się ocenę działania Regulaminu.</w:t>
+        <w:t>Po zakończeniu każdego sezonu obowiązkowo przeprowadza się ocenę działania Regulaminu.</w:t>
       </w:r>
     </w:p>
     <w:p>
@@ -5055,7 +5062,7 @@
         <w:t xml:space="preserve">2. </w:t>
       </w:r>
       <w:r>
-        <w:t>Ocena obejmuje w szczególności terminowość procesu, spory interpretacyjne, zastosowane wyjątki, braki danych oraz zgodność nominacji z celem Regulaminu.</w:t>
+        <w:t>Ocenę przeprowadza Komisja Regulaminowa SPWS, zapraszając do udziału przedstawiciela PZSz oraz przedstawicieli podmiotów wskazanych przez PZSz.</w:t>
       </w:r>
     </w:p>
     <w:p>
@@ -5066,7 +5073,29 @@
         <w:t xml:space="preserve">3. </w:t>
       </w:r>
       <w:r>
-        <w:t>Na podstawie oceny wskazuje się usprawnienia wymagające rozważenia przed kolejnym sezonem oraz zapisuje wnioski przy właściwych kartach decyzji.</w:t>
+        <w:t>Ocena obejmuje w szczególności terminowość procesu, spory interpretacyjne, zastosowane wyjątki, braki danych oraz zgodność nominacji z celem Regulaminu.</w:t>
+      </w:r>
+    </w:p>
+    <w:p>
+      <w:pPr>
+        <w:ind w:left="312" w:hanging="227"/>
+      </w:pPr>
+      <w:r>
+        <w:t xml:space="preserve">4. </w:t>
+      </w:r>
+      <w:r>
+        <w:t>Na podstawie oceny Komisja wskazuje usprawnienia wymagające rozważenia przed kolejnym sezonem oraz zapisuje wnioski przy właściwych kartach decyzji.</w:t>
+      </w:r>
+    </w:p>
+    <w:p>
+      <w:pPr>
+        <w:ind w:left="312" w:hanging="227"/>
+      </w:pPr>
+      <w:r>
+        <w:t xml:space="preserve">5. </w:t>
+      </w:r>
+      <w:r>
+        <w:t>SPWS publikuje podsumowanie oceny oraz propozycje zmian Regulaminu przed rozpoczęciem kolejnego sezonu.</w:t>
       </w:r>
     </w:p>
     <w:p>
@@ -5109,29 +5138,14 @@
     </w:p>
     <w:p>
       <w:pPr>
-        <w:pStyle w:val="Etykietabrudnopisu"/>
-        <w:keepNext/>
-      </w:pPr>
-      <w:r>
-        <w:t>BRUDNOPIS ZE ŹRÓDŁA — DO OPRACOWANIA</w:t>
-      </w:r>
-    </w:p>
-    <w:p>
-      <w:pPr>
         <w:keepLines/>
         <w:ind w:left="312" w:hanging="227"/>
       </w:pPr>
       <w:r>
-        <w:rPr>
-          <w:color w:val="595959"/>
-        </w:rPr>
         <w:t xml:space="preserve">1. </w:t>
       </w:r>
       <w:r>
-        <w:rPr>
-          <w:color w:val="595959"/>
-        </w:rPr>
-        <w:t>Regulamin wchodzi w życie z dniem uchwalenia.</w:t>
+        <w:t>Regulamin wchodzi w życie w terminie określonym w uchwale zatwierdzającej go przez właściwy organ PZSz.</w:t>
       </w:r>
     </w:p>
     <w:p>
@@ -5139,16 +5153,21 @@
         <w:ind w:left="312" w:hanging="227"/>
       </w:pPr>
       <w:r>
-        <w:rPr>
-          <w:color w:val="595959"/>
-        </w:rPr>
         <w:t xml:space="preserve">2. </w:t>
       </w:r>
       <w:r>
-        <w:rPr>
-          <w:color w:val="595959"/>
-        </w:rPr>
         <w:t>Regulaminu nie stosuje się do Mistrzostw Świata Weteranów w Tbilisi w 2026 r.</w:t>
+      </w:r>
+    </w:p>
+    <w:p>
+      <w:pPr>
+        <w:ind w:left="312" w:hanging="227"/>
+      </w:pPr>
+      <w:r>
+        <w:t xml:space="preserve">3. </w:t>
+      </w:r>
+      <w:r>
+        <w:t>SPWS publikuje zatwierdzony Regulamin wraz z załącznikami na swojej stronie internetowej.</w:t>
       </w:r>
     </w:p>
     <w:p>
@@ -30093,7 +30112,7 @@
         <w:pStyle w:val="Tekstroboczy"/>
       </w:pPr>
       <w:r>
-        <w:t>Dokument jest projektem. Fragmenty oznaczone jako brudnopis ze źródła nie są treścią przyjętą.</w:t>
+        <w:t>Dokument jest projektem. Przyjęcie treści podczas prac redakcyjnych nie zastępuje formalnego zatwierdzenia przez właściwy organ PZSz.</w:t>
       </w:r>
     </w:p>
     <w:sectPr>

</xml_diff>

<commit_message>
docs: define EVF age categories and simplify contents
</commit_message>
<xml_diff>
--- a/regulamin/Regulamin-powolywania-reprezentacji-Polski-weteranów-w-szermierce_2026.docx
+++ b/regulamin/Regulamin-powolywania-reprezentacji-Polski-weteranów-w-szermierce_2026.docx
@@ -887,80 +887,10 @@
     </w:p>
     <w:p>
       <w:pPr>
-        <w:pStyle w:val="TOC2"/>
-        <w:tabs>
-          <w:tab w:val="right" w:leader="dot" w:pos="9062"/>
-        </w:tabs>
-        <w:rPr>
-          <w:noProof/>
-        </w:rPr>
-      </w:pPr>
-      <w:hyperlink w:anchor="_Toc239877516" w:history="1">
-        <w:r>
-          <w:rPr>
-            <w:rStyle w:val="Hyperlink"/>
-            <w:noProof/>
-          </w:rPr>
-          <w:t>Informacja o prototypie</w:t>
-        </w:r>
-        <w:r>
-          <w:rPr>
-            <w:noProof/>
-            <w:webHidden/>
-          </w:rPr>
-          <w:tab/>
-        </w:r>
-        <w:r>
-          <w:rPr>
-            <w:noProof/>
-            <w:webHidden/>
-          </w:rPr>
-          <w:fldChar w:fldCharType="begin"/>
-        </w:r>
-        <w:r>
-          <w:rPr>
-            <w:noProof/>
-            <w:webHidden/>
-          </w:rPr>
-          <w:instrText xml:space="preserve"> PAGEREF _Toc239877516 \h </w:instrText>
-        </w:r>
-        <w:r>
-          <w:rPr>
-            <w:noProof/>
-            <w:webHidden/>
-          </w:rPr>
-          <w:fldChar w:fldCharType="separate"/>
-        </w:r>
-        <w:r>
-          <w:rPr>
-            <w:noProof/>
-            <w:webHidden/>
-          </w:rPr>
-          <w:t>11</w:t>
-        </w:r>
-        <w:r>
-          <w:rPr>
-            <w:noProof/>
-            <w:webHidden/>
-          </w:rPr>
-          <w:fldChar w:fldCharType="end"/>
-        </w:r>
-      </w:hyperlink>
-    </w:p>
-    <w:p>
-      <w:pPr>
         <w:spacing w:after="320"/>
       </w:pPr>
       <w:r>
         <w:fldChar w:fldCharType="end"/>
-      </w:r>
-    </w:p>
-    <w:p>
-      <w:pPr>
-        <w:pStyle w:val="Tekstroboczy"/>
-      </w:pPr>
-      <w:r>
-        <w:t>W Wordzie wybierz spis treści i polecenie „Aktualizuj tabelę”, jeżeli nie odświeży się automatycznie.</w:t>
       </w:r>
     </w:p>
     <w:p>
@@ -1867,7 +1797,68 @@
         <w:t>powołaniu uzupełniającym</w:t>
       </w:r>
       <w:r>
-        <w:t xml:space="preserve"> – należy przez to rozumieć wyjątkowe powołanie do startu drużynowego zawodnika nieposiadającego dodatniego dorobku punktowego, dokonywane wyłącznie w celu uzupełnienia braków uniemożliwiających wystawienie kompletnej i zgodnej z przepisami drużyny.</w:t>
+        <w:t xml:space="preserve"> – należy przez to rozumieć wyjątkowe powołanie do startu drużynowego zawodnika nieposiadającego dodatniego dorobku punktowego, dokonywane wyłącznie w celu uzupełnienia braków uniemożliwiających wystawienie kompletnej i zgodnej z przepisami drużyny;</w:t>
+      </w:r>
+    </w:p>
+    <w:p>
+      <w:pPr>
+        <w:ind w:left="595" w:hanging="255"/>
+      </w:pPr>
+      <w:r>
+        <w:t xml:space="preserve">10) </w:t>
+      </w:r>
+      <w:r>
+        <w:rPr>
+          <w:b/>
+        </w:rPr>
+        <w:t>kategoriach wiekowych V1–V4</w:t>
+      </w:r>
+      <w:r>
+        <w:t xml:space="preserve"> – należy przez to rozumieć następujące kategorie wiekowe EVF, ustalane według wieku zawodnika na dzień 31 grudnia roku, w którym odbywają się mistrzostwa:</w:t>
+      </w:r>
+    </w:p>
+    <w:p>
+      <w:pPr>
+        <w:ind w:left="879" w:hanging="255"/>
+      </w:pPr>
+      <w:r>
+        <w:t xml:space="preserve">a) </w:t>
+      </w:r>
+      <w:r>
+        <w:t>V1 – od 40 do 49 lat,</w:t>
+      </w:r>
+    </w:p>
+    <w:p>
+      <w:pPr>
+        <w:ind w:left="879" w:hanging="255"/>
+      </w:pPr>
+      <w:r>
+        <w:t xml:space="preserve">b) </w:t>
+      </w:r>
+      <w:r>
+        <w:t>V2 – od 50 do 59 lat,</w:t>
+      </w:r>
+    </w:p>
+    <w:p>
+      <w:pPr>
+        <w:ind w:left="879" w:hanging="255"/>
+      </w:pPr>
+      <w:r>
+        <w:t xml:space="preserve">c) </w:t>
+      </w:r>
+      <w:r>
+        <w:t>V3 – od 60 do 69 lat,</w:t>
+      </w:r>
+    </w:p>
+    <w:p>
+      <w:pPr>
+        <w:ind w:left="879" w:hanging="255"/>
+      </w:pPr>
+      <w:r>
+        <w:t xml:space="preserve">d) </w:t>
+      </w:r>
+      <w:r>
+        <w:t>V4 – 70 lat i więcej.</w:t>
       </w:r>
     </w:p>
     <w:p>
@@ -3270,7 +3261,7 @@
         <w:t xml:space="preserve">3. </w:t>
       </w:r>
       <w:r>
-        <w:t>Skład drużyny, a na Drużynowe Mistrzostwa Europy także zawodnika rezerwowego, wybiera się wyłącznie spośród zawodników należących do właściwej puli.</w:t>
+        <w:t>Na Drużynowe Mistrzostwa Europy powołuje się także zawodnika rezerwowego, wybieranego wyłącznie spośród zawodników należących do puli kandydatów do drużyny.</w:t>
       </w:r>
     </w:p>
     <w:p>
@@ -3297,7 +3288,7 @@
         <w:ind w:left="85"/>
       </w:pPr>
       <w:r>
-        <w:t>W rozgrywkach drużynowych zawody są rozgrywane w kategoriach Weteran, obejmującej kategorie 1 i 2, oraz Grand Weteran, obejmującej kategorie 3 i 4. Drużynę kompletuje się z udziałem zawodników obu właściwych kategorii wiekowych; co najmniej jeden zawodnik powinien należeć do kategorii wyższej, a preferowany jest udział dwóch takich zawodników.</w:t>
+        <w:t>Zawody drużynowe rozgrywane są w kategoriach Weteran, obejmującej kategorie V1 i V2, oraz Grand Weteran, obejmującej kategorie V3 i V4. Drużynę kompletuje się z udziałem zawodników obu właściwych kategorii wiekowych; co najmniej jeden zawodnik powinien należeć do kategorii wyższej, a preferowany jest udział dwóch takich zawodników.</w:t>
       </w:r>
     </w:p>
     <w:p>
@@ -30098,14 +30089,13 @@
       <w:pPr/>
     </w:p>
     <w:p>
-      <w:bookmarkStart w:id="239877516" w:name="_Toc239877516"/>
-      <w:pPr>
-        <w:pStyle w:val="Heading2"/>
-      </w:pPr>
+      <w:pPr/>
       <w:r>
+        <w:rPr>
+          <w:b/>
+        </w:rPr>
         <w:t>Informacja o prototypie</w:t>
       </w:r>
-      <w:bookmarkEnd w:id="239877516"/>
     </w:p>
     <w:p>
       <w:pPr>

</xml_diff>

<commit_message>
docs: assign regulation adoption to SPWS board
</commit_message>
<xml_diff>
--- a/regulamin/Regulamin-powolywania-reprezentacji-Polski-weteranów-w-szermierce_2026.docx
+++ b/regulamin/Regulamin-powolywania-reprezentacji-Polski-weteranów-w-szermierce_2026.docx
@@ -5136,7 +5136,7 @@
         <w:t xml:space="preserve">1. </w:t>
       </w:r>
       <w:r>
-        <w:t>Regulamin wchodzi w życie w terminie określonym w uchwale zatwierdzającej go przez właściwy organ PZSz.</w:t>
+        <w:t>Regulamin przyjmuje Zarząd SPWS w drodze uchwały. Regulamin wchodzi w życie w terminie określonym w tej uchwale.</w:t>
       </w:r>
     </w:p>
     <w:p>
@@ -30087,23 +30087,6 @@
     </w:tbl>
     <w:p>
       <w:pPr/>
-    </w:p>
-    <w:p>
-      <w:pPr/>
-      <w:r>
-        <w:rPr>
-          <w:b/>
-        </w:rPr>
-        <w:t>Informacja o prototypie</w:t>
-      </w:r>
-    </w:p>
-    <w:p>
-      <w:pPr>
-        <w:pStyle w:val="Tekstroboczy"/>
-      </w:pPr>
-      <w:r>
-        <w:t>Dokument jest projektem. Przyjęcie treści podczas prac redakcyjnych nie zastępuje formalnego zatwierdzenia przez właściwy organ PZSz.</w:t>
-      </w:r>
     </w:p>
     <w:sectPr>
       <w:headerReference w:type="default" r:id="rId9"/>

</xml_diff>

<commit_message>
docs: add draft resource links and remove cover rule
</commit_message>
<xml_diff>
--- a/regulamin/Regulamin-powolywania-reprezentacji-Polski-weteranów-w-szermierce_2026.docx
+++ b/regulamin/Regulamin-powolywania-reprezentacji-Polski-weteranów-w-szermierce_2026.docx
@@ -21,14 +21,6 @@
       <w:pPr>
         <w:spacing w:after="640"/>
       </w:pPr>
-      <w:r>
-        <w:rPr>
-          <w:rFonts w:ascii="Aptos" w:hAnsi="Aptos"/>
-          <w:color w:val="174A84"/>
-          <w:sz w:val="34"/>
-        </w:rPr>
-        <w:t>━━━━</w:t>
-      </w:r>
     </w:p>
     <w:p>
       <w:pPr>
@@ -3035,6 +3027,89 @@
       <w:r>
         <w:t>Ranking indywidualny oraz kalkulator punktów są publikowane na stronie internetowej.</w:t>
       </w:r>
+    </w:p>
+    <w:p>
+      <w:pPr>
+        <w:keepNext/>
+        <w:spacing w:before="200"/>
+      </w:pPr>
+      <w:r>
+        <w:rPr>
+          <w:b/>
+        </w:rPr>
+        <w:t>Materiały pomocnicze — wersja nieoficjalna</w:t>
+      </w:r>
+    </w:p>
+    <w:p>
+      <w:pPr>
+        <w:keepNext/>
+      </w:pPr>
+      <w:r>
+        <w:t>Regulamin nie został jeszcze uchwalony. Poniższe odnośniki prowadzą do nieoficjalnych wersji roboczych materiałów pomocniczych. Po uchwaleniu Regulaminu zostaną zastąpione odnośnikami do odpowiednich stron w oficjalnym serwisie SPWS: weteraniszermierki.pl.</w:t>
+      </w:r>
+    </w:p>
+    <w:p>
+      <w:pPr>
+        <w:keepNext/>
+        <w:keepLines/>
+      </w:pPr>
+      <w:r>
+        <w:rPr>
+          <w:b/>
+        </w:rPr>
+        <w:t xml:space="preserve">Ranking: </w:t>
+      </w:r>
+      <w:hyperlink r:id="rId13">
+        <w:r>
+          <w:rPr>
+            <w:rStyle w:val="Hyperlink"/>
+            <w:sz w:val="18"/>
+          </w:rPr>
+          <w:t>https://fencer4life.github.io/spws-automated-ranklist/</w:t>
+        </w:r>
+      </w:hyperlink>
+    </w:p>
+    <w:p>
+      <w:pPr>
+        <w:keepNext/>
+        <w:keepLines/>
+      </w:pPr>
+      <w:r>
+        <w:rPr>
+          <w:b/>
+        </w:rPr>
+        <w:t xml:space="preserve">Tabela punktacji: </w:t>
+      </w:r>
+      <w:hyperlink r:id="rId14">
+        <w:r>
+          <w:rPr>
+            <w:rStyle w:val="Hyperlink"/>
+            <w:sz w:val="18"/>
+          </w:rPr>
+          <w:t>https://fencer4life.github.io/spws-automated-ranklist/tabela-punktacji.html</w:t>
+        </w:r>
+      </w:hyperlink>
+    </w:p>
+    <w:p>
+      <w:pPr>
+        <w:keepNext w:val="0"/>
+        <w:keepLines/>
+      </w:pPr>
+      <w:r>
+        <w:rPr>
+          <w:b/>
+        </w:rPr>
+        <w:t xml:space="preserve">Kalkulator punktów: </w:t>
+      </w:r>
+      <w:hyperlink r:id="rId15">
+        <w:r>
+          <w:rPr>
+            <w:rStyle w:val="Hyperlink"/>
+            <w:sz w:val="18"/>
+          </w:rPr>
+          <w:t>https://fencer4life.github.io/spws-automated-ranklist/kalkulator-punktow.html</w:t>
+        </w:r>
+      </w:hyperlink>
     </w:p>
     <w:p>
       <w:pPr>

</xml_diff>

<commit_message>
docs: link full scoring table from annex 1
</commit_message>
<xml_diff>
--- a/regulamin/Regulamin-powolywania-reprezentacji-Polski-weteranów-w-szermierce_2026.docx
+++ b/regulamin/Regulamin-powolywania-reprezentacji-Polski-weteranów-w-szermierce_2026.docx
@@ -29903,11 +29903,32 @@
     </w:p>
     <w:p>
       <w:pPr>
+        <w:keepNext/>
         <w:spacing w:before="160"/>
       </w:pPr>
       <w:r>
         <w:t>Pełna tabela dla stawek liczących od 4 do 300 zawodników oraz kalkulator punktów są publikowane przez SPWS na stronie internetowej.</w:t>
       </w:r>
+    </w:p>
+    <w:p>
+      <w:pPr>
+        <w:keepLines/>
+      </w:pPr>
+      <w:r>
+        <w:rPr>
+          <w:b/>
+        </w:rPr>
+        <w:t xml:space="preserve">Pełna tabela punktacji — wersja nieoficjalna: </w:t>
+      </w:r>
+      <w:hyperlink r:id="rId14">
+        <w:r>
+          <w:rPr>
+            <w:rStyle w:val="Hyperlink"/>
+            <w:sz w:val="18"/>
+          </w:rPr>
+          <w:t>https://fencer4life.github.io/spws-automated-ranklist/tabela-punktacji.html</w:t>
+        </w:r>
+      </w:hyperlink>
     </w:p>
     <w:p>
       <w:r>

</xml_diff>

<commit_message>
docs: apply decision in PR #66
</commit_message>
<xml_diff>
--- a/regulamin/Regulamin-powolywania-reprezentacji-Polski-weteranów-w-szermierce_2026.docx
+++ b/regulamin/Regulamin-powolywania-reprezentacji-Polski-weteranów-w-szermierce_2026.docx
@@ -3449,17 +3449,6 @@
       </w:r>
       <w:r>
         <w:t>W przypadku braku porozumienia do zespołu pełniącego funkcję selekcjonera dołącza Prezes SPWS. Jeżeli Prezes SPWS nie może uczestniczyć w pracach zespołu, wyznacza inną osobę do udziału w tych pracach w swoim imieniu.</w:t>
-      </w:r>
-    </w:p>
-    <w:p>
-      <w:pPr>
-        <w:ind w:left="312" w:hanging="227"/>
-      </w:pPr>
-      <w:r>
-        <w:t xml:space="preserve">7. </w:t>
-      </w:r>
-      <w:r>
-        <w:t>Proponowany skład pięcioosobowej drużyny przedstawia się PZSz do akceptacji.</w:t>
       </w:r>
     </w:p>
     <w:p>

</xml_diff>

<commit_message>
feat: render contextual references with stable hidden targets
</commit_message>
<xml_diff>
--- a/regulamin/Regulamin-powolywania-reprezentacji-Polski-weteranów-w-szermierce_2026.docx
+++ b/regulamin/Regulamin-powolywania-reprezentacji-Polski-weteranów-w-szermierce_2026.docx
@@ -2009,7 +2009,7 @@
         <w:t xml:space="preserve">4. </w:t>
       </w:r>
       <w:r>
-        <w:t>Z zastrzeżeniem § 4 ust. 5, do reprezentacji Polski na limitowane zawody międzynarodowe może zostać powołany wyłącznie zawodnik, który wystartował w co najmniej jednych zawodach uwzględnianych w rankingu indywidualnym i uzyskał w nim dorobek większy niż zero punktów.</w:t>
+        <w:t>Z zastrzeżeniem ust. 5 poniżej, do reprezentacji Polski na limitowane zawody międzynarodowe może zostać powołany wyłącznie zawodnik, który wystartował w co najmniej jednych zawodach uwzględnianych w rankingu indywidualnym i uzyskał w nim dorobek większy niż zero punktów.</w:t>
       </w:r>
     </w:p>
     <w:p>
@@ -2053,7 +2053,7 @@
         <w:t xml:space="preserve">3) </w:t>
       </w:r>
       <w:r>
-        <w:t>żaden z zawodników, o których mowa w § 4 ust. 5 pkt 2, nie potwierdził gotowości do udziału;</w:t>
+        <w:t>żaden z zawodników, o których mowa w pkt 2 powyżej, nie potwierdził gotowości do udziału;</w:t>
       </w:r>
     </w:p>
     <w:p>
@@ -2105,7 +2105,7 @@
         <w:t xml:space="preserve">1) </w:t>
       </w:r>
       <w:r>
-        <w:t>Pucharze Polski Weteranów w Szermierce oraz Mistrzostwach Polski Weteranów w Szermierce, organizowanych przez SPWS albo przez inny podmiot na zasadach określonych w § 5 ust. 2;</w:t>
+        <w:t>Pucharze Polski Weteranów w Szermierce oraz Mistrzostwach Polski Weteranów w Szermierce, organizowanych przez SPWS albo przez inny podmiot na zasadach określonych w ust. 2 poniżej;</w:t>
       </w:r>
     </w:p>
     <w:p>
@@ -2226,7 +2226,7 @@
         <w:t xml:space="preserve">7) </w:t>
       </w:r>
       <w:r>
-        <w:t>protokoły i wyniki, o których mowa w § 5 ust. 2 pkt 6, pozostają dostępne online przez co najmniej 36 miesięcy od dnia zakończenia zawodów.</w:t>
+        <w:t>protokoły i wyniki, o których mowa w pkt 6 powyżej, pozostają dostępne online przez co najmniej 36 miesięcy od dnia zakończenia zawodów.</w:t>
       </w:r>
     </w:p>
     <w:p>

</xml_diff>